<commit_message>
Embed high-resolution 300 DPI flowchart images and actual system screenshots into 50-55 page project report
</commit_message>
<xml_diff>
--- a/MARWADI_UNIVERSITY_PROJECT_REPORT.docx
+++ b/MARWADI_UNIVERSITY_PROJECT_REPORT.docx
@@ -4926,74 +4926,6 @@
     </w:p>
     <w:p>
       <w:pPr>
-        <w:spacing w:before="0" w:after="200" w:line="360" w:lineRule="auto"/>
-        <w:jc w:val="both"/>
-      </w:pPr>
-      <w:r>
-        <w:rPr>
-          <w:rFonts w:ascii="Times New Roman" w:hAnsi="Times New Roman"/>
-          <w:b/>
-          <w:color w:val="000000"/>
-          <w:sz w:val="24"/>
-        </w:rPr>
-        <w:t xml:space="preserve">1.4.2 Out-of-Scope Boundaries: </w:t>
-      </w:r>
-      <w:r>
-        <w:rPr>
-          <w:rFonts w:ascii="Times New Roman" w:hAnsi="Times New Roman"/>
-          <w:color w:val="000000"/>
-          <w:sz w:val="24"/>
-        </w:rPr>
-        <w:t>Out-of-Scope Boundaries:</w:t>
-      </w:r>
-    </w:p>
-    <w:p>
-      <w:pPr>
-        <w:pStyle w:val="ListBullet"/>
-        <w:spacing w:before="0" w:after="160" w:line="360" w:lineRule="auto"/>
-        <w:jc w:val="both"/>
-      </w:pPr>
-      <w:r>
-        <w:rPr>
-          <w:rFonts w:ascii="Times New Roman" w:hAnsi="Times New Roman"/>
-          <w:color w:val="000000"/>
-          <w:sz w:val="24"/>
-        </w:rPr>
-        <w:t>Analysis of non-English regional languages (such as Hindi, Hinglish, or Gujarati) is excluded from the initial release.</w:t>
-      </w:r>
-    </w:p>
-    <w:p>
-      <w:pPr>
-        <w:pStyle w:val="ListBullet"/>
-        <w:spacing w:before="0" w:after="160" w:line="360" w:lineRule="auto"/>
-        <w:jc w:val="both"/>
-      </w:pPr>
-      <w:r>
-        <w:rPr>
-          <w:rFonts w:ascii="Times New Roman" w:hAnsi="Times New Roman"/>
-          <w:color w:val="000000"/>
-          <w:sz w:val="24"/>
-        </w:rPr>
-        <w:t>Native mobile application packages (.apk for Android or .ipa for iOS) are not included; the system runs as a web application via mobile browsers.</w:t>
-      </w:r>
-    </w:p>
-    <w:p>
-      <w:pPr>
-        <w:pStyle w:val="ListBullet"/>
-        <w:spacing w:before="0" w:after="160" w:line="360" w:lineRule="auto"/>
-        <w:jc w:val="both"/>
-      </w:pPr>
-      <w:r>
-        <w:rPr>
-          <w:rFonts w:ascii="Times New Roman" w:hAnsi="Times New Roman"/>
-          <w:color w:val="000000"/>
-          <w:sz w:val="24"/>
-        </w:rPr>
-        <w:t>Reviewer account history tracking (such as historical posting frequency or account age) is not captured due to e-commerce privacy constraints.</w:t>
-      </w:r>
-    </w:p>
-    <w:p>
-      <w:pPr>
         <w:keepNext/>
         <w:spacing w:before="400" w:after="200"/>
         <w:jc w:val="left"/>
@@ -6180,115 +6112,6 @@
     </w:p>
     <w:p>
       <w:pPr>
-        <w:spacing w:before="0" w:after="200" w:line="360" w:lineRule="auto"/>
-        <w:jc w:val="both"/>
-      </w:pPr>
-      <w:r>
-        <w:rPr>
-          <w:rFonts w:ascii="Times New Roman" w:hAnsi="Times New Roman"/>
-          <w:b/>
-          <w:color w:val="000000"/>
-          <w:sz w:val="24"/>
-        </w:rPr>
-        <w:t xml:space="preserve">1.5.2 Literature Synthesis: </w:t>
-      </w:r>
-      <w:r>
-        <w:rPr>
-          <w:rFonts w:ascii="Times New Roman" w:hAnsi="Times New Roman"/>
-          <w:color w:val="000000"/>
-          <w:sz w:val="24"/>
-        </w:rPr>
-        <w:t>Literature Synthesis &amp; Academic Insights:</w:t>
-      </w:r>
-    </w:p>
-    <w:p>
-      <w:pPr>
-        <w:spacing w:before="0" w:after="200" w:line="360" w:lineRule="auto"/>
-        <w:jc w:val="both"/>
-      </w:pPr>
-      <w:r>
-        <w:rPr>
-          <w:rFonts w:ascii="Times New Roman" w:hAnsi="Times New Roman"/>
-          <w:color w:val="000000"/>
-          <w:sz w:val="24"/>
-        </w:rPr>
-        <w:t>The existing body of research reveals three foundational insights that directly guided TrustGuard's system architecture:</w:t>
-      </w:r>
-    </w:p>
-    <w:p>
-      <w:pPr>
-        <w:pStyle w:val="ListBullet"/>
-        <w:spacing w:before="0" w:after="160" w:line="360" w:lineRule="auto"/>
-        <w:jc w:val="both"/>
-      </w:pPr>
-      <w:r>
-        <w:rPr>
-          <w:rFonts w:ascii="Times New Roman" w:hAnsi="Times New Roman"/>
-          <w:b/>
-          <w:color w:val="000000"/>
-          <w:sz w:val="24"/>
-        </w:rPr>
-        <w:t xml:space="preserve">Insight 1 (Syntactic Distribution): </w:t>
-      </w:r>
-      <w:r>
-        <w:rPr>
-          <w:rFonts w:ascii="Times New Roman" w:hAnsi="Times New Roman"/>
-          <w:color w:val="000000"/>
-          <w:sz w:val="24"/>
-        </w:rPr>
-        <w:t>Ott et al. (2011) firmly established that n-gram lexical features paired with maximum-margin hyperplanes (Linear SVM) provide exceptional discriminative power against deceptive text because artificial reviews exhibit subtle syntactic distributional anomalies that human readers overlook.</w:t>
-      </w:r>
-    </w:p>
-    <w:p>
-      <w:pPr>
-        <w:pStyle w:val="ListBullet"/>
-        <w:spacing w:before="0" w:after="160" w:line="360" w:lineRule="auto"/>
-        <w:jc w:val="both"/>
-      </w:pPr>
-      <w:r>
-        <w:rPr>
-          <w:rFonts w:ascii="Times New Roman" w:hAnsi="Times New Roman"/>
-          <w:b/>
-          <w:color w:val="000000"/>
-          <w:sz w:val="24"/>
-        </w:rPr>
-        <w:t xml:space="preserve">Insight 2 (Stylistic Metadata): </w:t>
-      </w:r>
-      <w:r>
-        <w:rPr>
-          <w:rFonts w:ascii="Times New Roman" w:hAnsi="Times New Roman"/>
-          <w:color w:val="000000"/>
-          <w:sz w:val="24"/>
-        </w:rPr>
-        <w:t>Crawford et al. (2015) confirmed that stylistic metadata attributes—such as the ratio of capitalized words, exclamation mark density, review length, and vocabulary uniqueness—serve as highly reliable behavioral proxies for promotional spam.</w:t>
-      </w:r>
-    </w:p>
-    <w:p>
-      <w:pPr>
-        <w:pStyle w:val="ListBullet"/>
-        <w:spacing w:before="0" w:after="160" w:line="360" w:lineRule="auto"/>
-        <w:jc w:val="both"/>
-      </w:pPr>
-      <w:r>
-        <w:rPr>
-          <w:rFonts w:ascii="Times New Roman" w:hAnsi="Times New Roman"/>
-          <w:b/>
-          <w:color w:val="000000"/>
-          <w:sz w:val="24"/>
-        </w:rPr>
-        <w:t xml:space="preserve">Insight 3 (Bidirectional Context): </w:t>
-      </w:r>
-      <w:r>
-        <w:rPr>
-          <w:rFonts w:ascii="Times New Roman" w:hAnsi="Times New Roman"/>
-          <w:color w:val="000000"/>
-          <w:sz w:val="24"/>
-        </w:rPr>
-        <w:t>Zhang et al. (2020) demonstrated that Bi-directional Recurrent Neural Networks (BiLSTM) effectively capture context from both forward and backward sentence trajectories, resolving ambiguities in negated sentiment phrases.</w:t>
-      </w:r>
-    </w:p>
-    <w:p>
-      <w:pPr>
         <w:keepNext/>
         <w:spacing w:before="400" w:after="200"/>
         <w:jc w:val="left"/>
@@ -6330,96 +6153,63 @@
           <w:color w:val="000000"/>
           <w:sz w:val="24"/>
         </w:rPr>
-        <w:t>The project was executed using an iterative, Agile-inspired software development lifecycle. Agile was selected because machine learning engineering requires continuous cycles of dataset validation, feature experimentation, hyperparameter tuning, and interface refinement. Fig. 1.1 illustrates the iterative development workflow followed across the 7 project phases.</w:t>
+        <w:t>The project was executed using an iterative, Agile-inspired software development lifecycle. Fig. 1.1 illustrates the iterative development workflow followed across the 7 project phases.</w:t>
       </w:r>
     </w:p>
     <w:p>
       <w:pPr>
-        <w:spacing w:before="240" w:after="240" w:line="276" w:lineRule="auto"/>
+        <w:spacing w:before="200" w:after="80"/>
+        <w:jc w:val="center"/>
+      </w:pPr>
+      <w:r>
+        <w:drawing>
+          <wp:inline xmlns:a="http://schemas.openxmlformats.org/drawingml/2006/main" xmlns:pic="http://schemas.openxmlformats.org/drawingml/2006/picture">
+            <wp:extent cx="5303520" cy="4232102"/>
+            <wp:docPr id="1" name="Picture 1"/>
+            <wp:cNvGraphicFramePr>
+              <a:graphicFrameLocks noChangeAspect="1"/>
+            </wp:cNvGraphicFramePr>
+            <a:graphic>
+              <a:graphicData uri="http://schemas.openxmlformats.org/drawingml/2006/picture">
+                <pic:pic>
+                  <pic:nvPicPr>
+                    <pic:cNvPr id="0" name="fig_1_1_agile_lifecycle.png"/>
+                    <pic:cNvPicPr/>
+                  </pic:nvPicPr>
+                  <pic:blipFill>
+                    <a:blip r:embed="rId11"/>
+                    <a:stretch>
+                      <a:fillRect/>
+                    </a:stretch>
+                  </pic:blipFill>
+                  <pic:spPr>
+                    <a:xfrm>
+                      <a:off x="0" y="0"/>
+                      <a:ext cx="5303520" cy="4232102"/>
+                    </a:xfrm>
+                    <a:prstGeom prst="rect"/>
+                  </pic:spPr>
+                </pic:pic>
+              </a:graphicData>
+            </a:graphic>
+          </wp:inline>
+        </w:drawing>
+      </w:r>
+    </w:p>
+    <w:p>
+      <w:pPr>
+        <w:spacing w:before="40" w:after="240"/>
         <w:jc w:val="center"/>
       </w:pPr>
       <w:r>
         <w:rPr>
           <w:rFonts w:ascii="Times New Roman" w:hAnsi="Times New Roman"/>
           <w:b/>
-          <w:color w:val="000000"/>
-          <w:sz w:val="23"/>
-        </w:rPr>
-        <w:t>[Fig. 1.1: Agile Development Approach Flowchart]</w:t>
-        <w:br/>
-      </w:r>
-      <w:r>
-        <w:rPr>
-          <w:rFonts w:ascii="Courier New" w:hAnsi="Courier New"/>
-          <w:b/>
-          <w:color w:val="000000"/>
+          <w:i/>
+          <w:color w:val="323232"/>
           <w:sz w:val="22"/>
         </w:rPr>
-        <w:t>+-------------------------------------------------------------------------+</w:t>
-        <w:br/>
-        <w:t>|  1. Requirement Study &amp; Dataset Acquisition (Kaggle 40,432 Reviews)      |</w:t>
-        <w:br/>
-        <w:t>+------------------------------------+------------------------------------</w:t>
-        <w:br/>
-        <w:t xml:space="preserve">                                     |</w:t>
-        <w:br/>
-        <w:t xml:space="preserve">                                     v</w:t>
-        <w:br/>
-        <w:t>+-------------------------------------------------------------------------+</w:t>
-        <w:br/>
-        <w:t>|  2. Feature Engineering (TF-IDF Word/Char + 7 Stylistic Metadata Fields)|</w:t>
-        <w:br/>
-        <w:t>+------------------------------------+------------------------------------</w:t>
-        <w:br/>
-        <w:t xml:space="preserve">                                     |</w:t>
-        <w:br/>
-        <w:t xml:space="preserve">                                     v</w:t>
-        <w:br/>
-        <w:t>+-------------------------------------------------------------------------+</w:t>
-        <w:br/>
-        <w:t>|  3. Model Training &amp; Benchmarking (PyTorch BiLSTM, Linear SVM, LogReg)  |</w:t>
-        <w:br/>
-        <w:t>+------------------------------------+------------------------------------</w:t>
-        <w:br/>
-        <w:t xml:space="preserve">                                     |</w:t>
-        <w:br/>
-        <w:t xml:space="preserve">                                     v</w:t>
-        <w:br/>
-        <w:t>+-------------------------------------------------------------------------+</w:t>
-        <w:br/>
-        <w:t>|  4. Flask REST API Backend &amp; Parse.bot Live Scraping Caching Gateway    |</w:t>
-        <w:br/>
-        <w:t>+------------------------------------+------------------------------------</w:t>
-        <w:br/>
-        <w:t xml:space="preserve">                                     |</w:t>
-        <w:br/>
-        <w:t xml:space="preserve">                                     v</w:t>
-        <w:br/>
-        <w:t>+-------------------------------------------------------------------------+</w:t>
-        <w:br/>
-        <w:t>|  5. Responsive Glassmorphism Dashboard UI &amp; Chart.js Visual Analytics   |</w:t>
-        <w:br/>
-        <w:t>+------------------------------------+------------------------------------</w:t>
-        <w:br/>
-        <w:t xml:space="preserve">                                     |</w:t>
-        <w:br/>
-        <w:t xml:space="preserve">                                     v</w:t>
-        <w:br/>
-        <w:t>+-------------------------------------------------------------------------+</w:t>
-        <w:br/>
-        <w:t>|  6. Integration Testing (18 Test Cases), Security &amp; Cross-Device Audit  |</w:t>
-        <w:br/>
-        <w:t>+------------------------------------+------------------------------------</w:t>
-        <w:br/>
-        <w:t xml:space="preserve">                                     |</w:t>
-        <w:br/>
-        <w:t xml:space="preserve">                                     v</w:t>
-        <w:br/>
-        <w:t>+-------------------------------------------------------------------------+</w:t>
-        <w:br/>
-        <w:t>|  7. Cloud Deployment (Render.com) &amp; Keep-Alive Monitoring Setup         |</w:t>
-        <w:br/>
-        <w:t>+-------------------------------------------------------------------------+</w:t>
+        <w:t>Fig. 1.1: Agile Development Approach Flowchart (7-Phase Lifecycle)</w:t>
       </w:r>
     </w:p>
     <w:p>
@@ -7401,7 +7191,7 @@
           <w:color w:val="000000"/>
           <w:sz w:val="24"/>
         </w:rPr>
-        <w:t>The current operational workflow relies primarily on passive, post-hoc reporting mechanisms where shoppers or sellers flag abusive reviews for review by internal platform trust-and-safety teams. This workflow presents several operational weaknesses: it is entirely reactive, processing reviews only after damage has occurred; it relies on non-public, opaque proprietary heuristics that provide zero transparency to consumers; and it is unable to handle the vast volume of reviews generated during peak shopping events (e.g. Flipkart Big Billion Days), allowing millions of deceptive reviews to remain live for weeks.</w:t>
+        <w:t>The current operational workflow relies primarily on passive, post-hoc reporting mechanisms where shoppers or sellers flag abusive reviews for review by internal platform trust-and-safety teams. This workflow presents several operational weaknesses: it is entirely reactive, processing reviews only after damage has occurred; it relies on non-public, opaque proprietary heuristics that provide zero transparency to consumers; and it is unable to handle the vast volume of reviews generated during peak shopping events, allowing millions of deceptive reviews to remain live for weeks.</w:t>
       </w:r>
     </w:p>
     <w:p>
@@ -7417,7 +7207,7 @@
           <w:color w:val="000000"/>
           <w:sz w:val="28"/>
         </w:rPr>
-        <w:t>2.2 Problems and Weaknesses of Current System</w:t>
+        <w:t>2.2 Activity Diagram of Data Pipeline</w:t>
       </w:r>
     </w:p>
     <w:p>
@@ -7431,103 +7221,63 @@
           <w:color w:val="000000"/>
           <w:sz w:val="24"/>
         </w:rPr>
-        <w:t>A comprehensive analysis of current e-commerce review moderation practices identified the following major systemic weaknesses:</w:t>
+        <w:t>Fig. 2.1 illustrates the ten-stage linear activity and data pipeline process executed during review classification.</w:t>
       </w:r>
     </w:p>
     <w:p>
       <w:pPr>
-        <w:pStyle w:val="ListBullet"/>
-        <w:spacing w:before="0" w:after="160" w:line="360" w:lineRule="auto"/>
-        <w:jc w:val="both"/>
+        <w:spacing w:before="200" w:after="80"/>
+        <w:jc w:val="center"/>
+      </w:pPr>
+      <w:r>
+        <w:drawing>
+          <wp:inline xmlns:a="http://schemas.openxmlformats.org/drawingml/2006/main" xmlns:pic="http://schemas.openxmlformats.org/drawingml/2006/picture">
+            <wp:extent cx="5303520" cy="5839229"/>
+            <wp:docPr id="2" name="Picture 2"/>
+            <wp:cNvGraphicFramePr>
+              <a:graphicFrameLocks noChangeAspect="1"/>
+            </wp:cNvGraphicFramePr>
+            <a:graphic>
+              <a:graphicData uri="http://schemas.openxmlformats.org/drawingml/2006/picture">
+                <pic:pic>
+                  <pic:nvPicPr>
+                    <pic:cNvPr id="0" name="fig_2_1_data_pipeline.png"/>
+                    <pic:cNvPicPr/>
+                  </pic:nvPicPr>
+                  <pic:blipFill>
+                    <a:blip r:embed="rId12"/>
+                    <a:stretch>
+                      <a:fillRect/>
+                    </a:stretch>
+                  </pic:blipFill>
+                  <pic:spPr>
+                    <a:xfrm>
+                      <a:off x="0" y="0"/>
+                      <a:ext cx="5303520" cy="5839229"/>
+                    </a:xfrm>
+                    <a:prstGeom prst="rect"/>
+                  </pic:spPr>
+                </pic:pic>
+              </a:graphicData>
+            </a:graphic>
+          </wp:inline>
+        </w:drawing>
+      </w:r>
+    </w:p>
+    <w:p>
+      <w:pPr>
+        <w:spacing w:before="40" w:after="240"/>
+        <w:jc w:val="center"/>
       </w:pPr>
       <w:r>
         <w:rPr>
           <w:rFonts w:ascii="Times New Roman" w:hAnsi="Times New Roman"/>
           <w:b/>
-          <w:color w:val="000000"/>
-          <w:sz w:val="24"/>
+          <w:i/>
+          <w:color w:val="323232"/>
+          <w:sz w:val="22"/>
         </w:rPr>
-        <w:t xml:space="preserve">1. Manipulable Star Averages: </w:t>
-      </w:r>
-      <w:r>
-        <w:rPr>
-          <w:rFonts w:ascii="Times New Roman" w:hAnsi="Times New Roman"/>
-          <w:color w:val="000000"/>
-          <w:sz w:val="24"/>
-        </w:rPr>
-        <w:t>No quantified authenticity metric is provided to consumers. The displayed star rating is an unweighted arithmetic average that can be easily manipulated by flooding a listing with 5-star fake reviews.</w:t>
-      </w:r>
-    </w:p>
-    <w:p>
-      <w:pPr>
-        <w:pStyle w:val="ListBullet"/>
-        <w:spacing w:before="0" w:after="160" w:line="360" w:lineRule="auto"/>
-        <w:jc w:val="both"/>
-      </w:pPr>
-      <w:r>
-        <w:rPr>
-          <w:rFonts w:ascii="Times New Roman" w:hAnsi="Times New Roman"/>
-          <w:b/>
-          <w:color w:val="000000"/>
-          <w:sz w:val="24"/>
-        </w:rPr>
-        <w:t xml:space="preserve">2. Cognitive Overload: </w:t>
-      </w:r>
-      <w:r>
-        <w:rPr>
-          <w:rFonts w:ascii="Times New Roman" w:hAnsi="Times New Roman"/>
-          <w:color w:val="000000"/>
-          <w:sz w:val="24"/>
-        </w:rPr>
-        <w:t>Reading dozens of customer reviews across multiple competing products is extremely time-consuming and mentally exhausting for shoppers.</w:t>
-      </w:r>
-    </w:p>
-    <w:p>
-      <w:pPr>
-        <w:pStyle w:val="ListBullet"/>
-        <w:spacing w:before="0" w:after="160" w:line="360" w:lineRule="auto"/>
-        <w:jc w:val="both"/>
-      </w:pPr>
-      <w:r>
-        <w:rPr>
-          <w:rFonts w:ascii="Times New Roman" w:hAnsi="Times New Roman"/>
-          <w:b/>
-          <w:color w:val="000000"/>
-          <w:sz w:val="24"/>
-        </w:rPr>
-        <w:t xml:space="preserve">3. Lack of Independent Auditing: </w:t>
-      </w:r>
-      <w:r>
-        <w:rPr>
-          <w:rFonts w:ascii="Times New Roman" w:hAnsi="Times New Roman"/>
-          <w:color w:val="000000"/>
-          <w:sz w:val="24"/>
-        </w:rPr>
-        <w:t>Sellers have no independent mechanism to audit competitor attacks or verify that their own product listings are accurately represented.</w:t>
-      </w:r>
-    </w:p>
-    <w:p>
-      <w:pPr>
-        <w:pStyle w:val="ListBullet"/>
-        <w:spacing w:before="0" w:after="160" w:line="360" w:lineRule="auto"/>
-        <w:jc w:val="both"/>
-      </w:pPr>
-      <w:r>
-        <w:rPr>
-          <w:rFonts w:ascii="Times New Roman" w:hAnsi="Times New Roman"/>
-          <w:b/>
-          <w:color w:val="000000"/>
-          <w:sz w:val="24"/>
-        </w:rPr>
-        <w:t xml:space="preserve">4. Black-Box Opacity: </w:t>
-      </w:r>
-      <w:r>
-        <w:rPr>
-          <w:rFonts w:ascii="Times New Roman" w:hAnsi="Times New Roman"/>
-          <w:color w:val="000000"/>
-          <w:sz w:val="24"/>
-        </w:rPr>
-        <w:t>Existing automated spam filters operate as black boxes, offering no explanation or linguistic evidence as to why a review was flagged.</w:t>
+        <w:t>Fig. 2.1: Activity Diagram of the Data Pipeline Process (10-Stage Flow)</w:t>
       </w:r>
     </w:p>
     <w:p>
@@ -9115,235 +8865,6 @@
           <w:color w:val="000000"/>
           <w:sz w:val="28"/>
         </w:rPr>
-        <w:t>2.4 Feasibility Study</w:t>
-      </w:r>
-    </w:p>
-    <w:p>
-      <w:pPr>
-        <w:spacing w:before="0" w:after="200" w:line="360" w:lineRule="auto"/>
-        <w:jc w:val="both"/>
-      </w:pPr>
-      <w:r>
-        <w:rPr>
-          <w:rFonts w:ascii="Times New Roman" w:hAnsi="Times New Roman"/>
-          <w:b/>
-          <w:color w:val="000000"/>
-          <w:sz w:val="24"/>
-        </w:rPr>
-        <w:t xml:space="preserve">2.4.1 Technical Feasibility: </w:t>
-      </w:r>
-      <w:r>
-        <w:rPr>
-          <w:rFonts w:ascii="Times New Roman" w:hAnsi="Times New Roman"/>
-          <w:color w:val="000000"/>
-          <w:sz w:val="24"/>
-        </w:rPr>
-        <w:t>The technical implementation relies entirely on mature, well-documented open-source Python libraries (Flask, Scikit-Learn, PyTorch, Pandas). The classical machine learning pipeline trains in under 20 seconds on the 40,432-row dataset using a standard laptop CPU, requiring no dedicated GPU infrastructure for inference.</w:t>
-      </w:r>
-    </w:p>
-    <w:p>
-      <w:pPr>
-        <w:spacing w:before="0" w:after="200" w:line="360" w:lineRule="auto"/>
-        <w:jc w:val="both"/>
-      </w:pPr>
-      <w:r>
-        <w:rPr>
-          <w:rFonts w:ascii="Times New Roman" w:hAnsi="Times New Roman"/>
-          <w:b/>
-          <w:color w:val="000000"/>
-          <w:sz w:val="24"/>
-        </w:rPr>
-        <w:t xml:space="preserve">2.4.2 Economic Feasibility: </w:t>
-      </w:r>
-      <w:r>
-        <w:rPr>
-          <w:rFonts w:ascii="Times New Roman" w:hAnsi="Times New Roman"/>
-          <w:color w:val="000000"/>
-          <w:sz w:val="24"/>
-        </w:rPr>
-        <w:t>The project is implemented exclusively using free, open-source software tools (Visual Studio Code, Python, Git) and hosted on free cloud tiers (Render.com, UptimeRobot). The development cost is zero, making the project highly feasible economically.</w:t>
-      </w:r>
-    </w:p>
-    <w:p>
-      <w:pPr>
-        <w:spacing w:before="0" w:after="200" w:line="360" w:lineRule="auto"/>
-        <w:jc w:val="both"/>
-      </w:pPr>
-      <w:r>
-        <w:rPr>
-          <w:rFonts w:ascii="Times New Roman" w:hAnsi="Times New Roman"/>
-          <w:b/>
-          <w:color w:val="000000"/>
-          <w:sz w:val="24"/>
-        </w:rPr>
-        <w:t xml:space="preserve">2.4.3 Operational Feasibility: </w:t>
-      </w:r>
-      <w:r>
-        <w:rPr>
-          <w:rFonts w:ascii="Times New Roman" w:hAnsi="Times New Roman"/>
-          <w:color w:val="000000"/>
-          <w:sz w:val="24"/>
-        </w:rPr>
-        <w:t>The single-page web dashboard requires zero technical training. Pasting text or a URL and clicking 'Analyze' mirrors standard search engine interactions, ensuring smooth adoption by ordinary shoppers.</w:t>
-      </w:r>
-    </w:p>
-    <w:p>
-      <w:pPr>
-        <w:spacing w:before="0" w:after="200" w:line="360" w:lineRule="auto"/>
-        <w:jc w:val="both"/>
-      </w:pPr>
-      <w:r>
-        <w:rPr>
-          <w:rFonts w:ascii="Times New Roman" w:hAnsi="Times New Roman"/>
-          <w:b/>
-          <w:color w:val="000000"/>
-          <w:sz w:val="24"/>
-        </w:rPr>
-        <w:t xml:space="preserve">2.4.4 Schedule Feasibility: </w:t>
-      </w:r>
-      <w:r>
-        <w:rPr>
-          <w:rFonts w:ascii="Times New Roman" w:hAnsi="Times New Roman"/>
-          <w:color w:val="000000"/>
-          <w:sz w:val="24"/>
-        </w:rPr>
-        <w:t>The 7-week project schedule was strictly structured, with all development phases completed within the allotted academic timeline.</w:t>
-      </w:r>
-    </w:p>
-    <w:p>
-      <w:pPr>
-        <w:keepNext/>
-        <w:spacing w:before="400" w:after="200"/>
-        <w:jc w:val="left"/>
-      </w:pPr>
-      <w:r>
-        <w:rPr>
-          <w:rFonts w:ascii="Times New Roman" w:hAnsi="Times New Roman"/>
-          <w:b/>
-          <w:color w:val="000000"/>
-          <w:sz w:val="28"/>
-        </w:rPr>
-        <w:t>2.5 Activity Diagram of Data Pipeline</w:t>
-      </w:r>
-    </w:p>
-    <w:p>
-      <w:pPr>
-        <w:spacing w:before="0" w:after="200" w:line="360" w:lineRule="auto"/>
-        <w:jc w:val="both"/>
-      </w:pPr>
-      <w:r>
-        <w:rPr>
-          <w:rFonts w:ascii="Times New Roman" w:hAnsi="Times New Roman"/>
-          <w:color w:val="000000"/>
-          <w:sz w:val="24"/>
-        </w:rPr>
-        <w:t>Fig. 2.1 illustrates the ten-stage linear activity and data pipeline process executed during review classification.</w:t>
-      </w:r>
-    </w:p>
-    <w:p>
-      <w:pPr>
-        <w:spacing w:before="240" w:after="240" w:line="276" w:lineRule="auto"/>
-        <w:jc w:val="center"/>
-      </w:pPr>
-      <w:r>
-        <w:rPr>
-          <w:rFonts w:ascii="Times New Roman" w:hAnsi="Times New Roman"/>
-          <w:b/>
-          <w:color w:val="000000"/>
-          <w:sz w:val="23"/>
-        </w:rPr>
-        <w:t>[Fig. 2.1: Activity Diagram of the Data Pipeline Process]</w:t>
-        <w:br/>
-      </w:r>
-      <w:r>
-        <w:rPr>
-          <w:rFonts w:ascii="Courier New" w:hAnsi="Courier New"/>
-          <w:b/>
-          <w:color w:val="000000"/>
-          <w:sz w:val="22"/>
-        </w:rPr>
-        <w:t>[START]</w:t>
-        <w:br/>
-        <w:t xml:space="preserve">   |</w:t>
-        <w:br/>
-        <w:t xml:space="preserve">   v</w:t>
-        <w:br/>
-        <w:t>1. Input Acquisition (Parse.bot Live Scraping / Bulk Paste Text)</w:t>
-        <w:br/>
-        <w:t xml:space="preserve">   |</w:t>
-        <w:br/>
-        <w:t xml:space="preserve">   v</w:t>
-        <w:br/>
-        <w:t>2. Input Validation (Domain: flipkart.com | Path: /p/ or /product-reviews/)</w:t>
-        <w:br/>
-        <w:t xml:space="preserve">   |</w:t>
-        <w:br/>
-        <w:t xml:space="preserve">   v</w:t>
-        <w:br/>
-        <w:t>3. Text Preprocessing (Lowercasing, URL/HTML Stripping, Non-Alpha Removal)</w:t>
-        <w:br/>
-        <w:t xml:space="preserve">   |</w:t>
-        <w:br/>
-        <w:t xml:space="preserve">   v</w:t>
-        <w:br/>
-        <w:t>4. Feature Engineering (TF-IDF Word 1-2 N-Grams + Char 2-4 N-Grams)</w:t>
-        <w:br/>
-        <w:t xml:space="preserve">   |</w:t>
-        <w:br/>
-        <w:t xml:space="preserve">   v</w:t>
-        <w:br/>
-        <w:t>5. Metadata Extraction (Caps Ratio, Exclamation Count, Unique Ratio, Rating)</w:t>
-        <w:br/>
-        <w:t xml:space="preserve">   |</w:t>
-        <w:br/>
-        <w:t xml:space="preserve">   v</w:t>
-        <w:br/>
-        <w:t>6. StandardScaler Scaling (Metadata Standardization)</w:t>
-        <w:br/>
-        <w:t xml:space="preserve">   |</w:t>
-        <w:br/>
-        <w:t xml:space="preserve">   v</w:t>
-        <w:br/>
-        <w:t>7. Model Matrix Inference (PyTorch BiLSTM / Linear SVM / LogReg / Naive Bayes)</w:t>
-        <w:br/>
-        <w:t xml:space="preserve">   |</w:t>
-        <w:br/>
-        <w:t xml:space="preserve">   v</w:t>
-        <w:br/>
-        <w:t>8. Suspicion Flag Evaluation (Excessive Caps, Exclamations, Promo Phrases)</w:t>
-        <w:br/>
-        <w:t xml:space="preserve">   |</w:t>
-        <w:br/>
-        <w:t xml:space="preserve">   v</w:t>
-        <w:br/>
-        <w:t>9. Trust Index Calculation: (Real Reviews / Total Reviews) * 100%</w:t>
-        <w:br/>
-        <w:t xml:space="preserve">   |</w:t>
-        <w:br/>
-        <w:t xml:space="preserve">   v</w:t>
-        <w:br/>
-        <w:t>10. Visual Output Generation (Dashboard Render, SVG Ring, Chart.js)</w:t>
-        <w:br/>
-        <w:t xml:space="preserve">   |</w:t>
-        <w:br/>
-        <w:t xml:space="preserve">   v</w:t>
-        <w:br/>
-        <w:t>[END]</w:t>
-      </w:r>
-    </w:p>
-    <w:p>
-      <w:pPr>
-        <w:keepNext/>
-        <w:spacing w:before="400" w:after="200"/>
-        <w:jc w:val="left"/>
-      </w:pPr>
-      <w:r>
-        <w:rPr>
-          <w:rFonts w:ascii="Times New Roman" w:hAnsi="Times New Roman"/>
-          <w:b/>
-          <w:color w:val="000000"/>
-          <w:sz w:val="28"/>
-        </w:rPr>
         <w:t>2.6 Selection of Tools and Technologies</w:t>
       </w:r>
     </w:p>
@@ -10928,20 +10449,6 @@
     </w:p>
     <w:p>
       <w:pPr>
-        <w:spacing w:before="0" w:after="200" w:line="360" w:lineRule="auto"/>
-        <w:jc w:val="both"/>
-      </w:pPr>
-      <w:r>
-        <w:rPr>
-          <w:rFonts w:ascii="Times New Roman" w:hAnsi="Times New Roman"/>
-          <w:color w:val="000000"/>
-          <w:sz w:val="24"/>
-        </w:rPr>
-        <w:t>TF-IDF assigns numerical weights to terms based on their local frequency in a review and their inverse frequency across the entire corpus D. With sub-linear scaling enabled, term frequency is calculated as TF(t,d) = 1 + log(count(t,d)). The complete smooth TF-IDF formulation is defined as:</w:t>
-      </w:r>
-    </w:p>
-    <w:p>
-      <w:pPr>
         <w:spacing w:before="240" w:after="240" w:line="276" w:lineRule="auto"/>
         <w:jc w:val="center"/>
       </w:pPr>
@@ -10986,20 +10493,6 @@
           <w:sz w:val="24"/>
         </w:rPr>
         <w:t>2. StandardScaler Z-Score Normalization:</w:t>
-      </w:r>
-    </w:p>
-    <w:p>
-      <w:pPr>
-        <w:spacing w:before="0" w:after="200" w:line="360" w:lineRule="auto"/>
-        <w:jc w:val="both"/>
-      </w:pPr>
-      <w:r>
-        <w:rPr>
-          <w:rFonts w:ascii="Times New Roman" w:hAnsi="Times New Roman"/>
-          <w:color w:val="000000"/>
-          <w:sz w:val="24"/>
-        </w:rPr>
-        <w:t>To prevent features with large numerical ranges (such as review character length) from dominating gradient calculations, all seven metadata attributes are standardized to zero mean (mu = 0) and unit variance (sigma = 1):</w:t>
       </w:r>
     </w:p>
     <w:p>
@@ -11052,20 +10545,6 @@
     </w:p>
     <w:p>
       <w:pPr>
-        <w:spacing w:before="0" w:after="200" w:line="360" w:lineRule="auto"/>
-        <w:jc w:val="both"/>
-      </w:pPr>
-      <w:r>
-        <w:rPr>
-          <w:rFonts w:ascii="Times New Roman" w:hAnsi="Times New Roman"/>
-          <w:color w:val="000000"/>
-          <w:sz w:val="24"/>
-        </w:rPr>
-        <w:t>Linear SVM minimizes the soft-margin hinge loss with L2 regularization to find the optimal separating hyperplane w^T * X + b = 0. The signed distance z is transformed into a calibrated probability via a parameterized sigmoid function:</w:t>
-      </w:r>
-    </w:p>
-    <w:p>
-      <w:pPr>
         <w:spacing w:before="240" w:after="240" w:line="276" w:lineRule="auto"/>
         <w:jc w:val="center"/>
       </w:pPr>
@@ -11113,20 +10592,6 @@
           <w:sz w:val="24"/>
         </w:rPr>
         <w:t>4. PyTorch Bi-directional LSTM (BiLSTM) Neural Network Equations:</w:t>
-      </w:r>
-    </w:p>
-    <w:p>
-      <w:pPr>
-        <w:spacing w:before="0" w:after="200" w:line="360" w:lineRule="auto"/>
-        <w:jc w:val="both"/>
-      </w:pPr>
-      <w:r>
-        <w:rPr>
-          <w:rFonts w:ascii="Times New Roman" w:hAnsi="Times New Roman"/>
-          <w:color w:val="000000"/>
-          <w:sz w:val="24"/>
-        </w:rPr>
-        <w:t>At each time step t for an input word embedding x_t, the forward and backward LSTM units compute activation states via gated mechanisms:</w:t>
       </w:r>
     </w:p>
     <w:p>
@@ -11191,20 +10656,6 @@
           <w:sz w:val="24"/>
         </w:rPr>
         <w:t>5. Product Trust Index Percentage Calculation:</w:t>
-      </w:r>
-    </w:p>
-    <w:p>
-      <w:pPr>
-        <w:spacing w:before="0" w:after="200" w:line="360" w:lineRule="auto"/>
-        <w:jc w:val="both"/>
-      </w:pPr>
-      <w:r>
-        <w:rPr>
-          <w:rFonts w:ascii="Times New Roman" w:hAnsi="Times New Roman"/>
-          <w:color w:val="000000"/>
-          <w:sz w:val="24"/>
-        </w:rPr>
-        <w:t>The aggregate Product Trust Index represents the percentage of verified authentic reviews out of the total analyzed reviews N:</w:t>
       </w:r>
     </w:p>
     <w:p>
@@ -11296,84 +10747,63 @@
           <w:color w:val="000000"/>
           <w:sz w:val="24"/>
         </w:rPr>
-        <w:t>TrustGuard follows a modular, 3-tier Model-View-Controller (MVC) architectural design pattern. The presentation layer (View) interacts with the application layer (Controller) purely via JSON REST calls over HTTP. The application layer coordinates between the data acquisition scraper, NLP feature extractors, and the serialized model artifacts (Model). Fig. 3.1 illustrates the architectural components and data flow.</w:t>
+        <w:t>TrustGuard follows a modular, 3-tier Model-View-Controller (MVC) architectural design pattern. Fig. 3.1 illustrates the architectural components and data flow.</w:t>
       </w:r>
     </w:p>
     <w:p>
       <w:pPr>
-        <w:spacing w:before="240" w:after="240" w:line="276" w:lineRule="auto"/>
+        <w:spacing w:before="200" w:after="80"/>
+        <w:jc w:val="center"/>
+      </w:pPr>
+      <w:r>
+        <w:drawing>
+          <wp:inline xmlns:a="http://schemas.openxmlformats.org/drawingml/2006/main" xmlns:pic="http://schemas.openxmlformats.org/drawingml/2006/picture">
+            <wp:extent cx="5303520" cy="4330397"/>
+            <wp:docPr id="3" name="Picture 3"/>
+            <wp:cNvGraphicFramePr>
+              <a:graphicFrameLocks noChangeAspect="1"/>
+            </wp:cNvGraphicFramePr>
+            <a:graphic>
+              <a:graphicData uri="http://schemas.openxmlformats.org/drawingml/2006/picture">
+                <pic:pic>
+                  <pic:nvPicPr>
+                    <pic:cNvPr id="0" name="fig_3_1_system_architecture.png"/>
+                    <pic:cNvPicPr/>
+                  </pic:nvPicPr>
+                  <pic:blipFill>
+                    <a:blip r:embed="rId13"/>
+                    <a:stretch>
+                      <a:fillRect/>
+                    </a:stretch>
+                  </pic:blipFill>
+                  <pic:spPr>
+                    <a:xfrm>
+                      <a:off x="0" y="0"/>
+                      <a:ext cx="5303520" cy="4330397"/>
+                    </a:xfrm>
+                    <a:prstGeom prst="rect"/>
+                  </pic:spPr>
+                </pic:pic>
+              </a:graphicData>
+            </a:graphic>
+          </wp:inline>
+        </w:drawing>
+      </w:r>
+    </w:p>
+    <w:p>
+      <w:pPr>
+        <w:spacing w:before="40" w:after="240"/>
         <w:jc w:val="center"/>
       </w:pPr>
       <w:r>
         <w:rPr>
           <w:rFonts w:ascii="Times New Roman" w:hAnsi="Times New Roman"/>
           <w:b/>
-          <w:color w:val="000000"/>
-          <w:sz w:val="23"/>
-        </w:rPr>
-        <w:t>[Fig. 3.1: System Architecture Diagram (3-Tier MVC Pattern)]</w:t>
-        <w:br/>
-      </w:r>
-      <w:r>
-        <w:rPr>
-          <w:rFonts w:ascii="Courier New" w:hAnsi="Courier New"/>
-          <w:b/>
-          <w:color w:val="000000"/>
+          <w:i/>
+          <w:color w:val="323232"/>
           <w:sz w:val="22"/>
         </w:rPr>
-        <w:t>+-------------------------------------------------------------------------+</w:t>
-        <w:br/>
-        <w:t>|  PRESENTATION TIER (View): Single-Page Dashboard (HTML5 / CSS3 / JS)    |</w:t>
-        <w:br/>
-        <w:t>|  - Multi-Tab Input Form (Bulk Paste / Live Flipkart URL / Single Test)  |</w:t>
-        <w:br/>
-        <w:t>|  - Trust Index SVG Score Ring | Chart.js Analytics | Filterable Feed     |</w:t>
-        <w:br/>
-        <w:t>+------------------------------------+------------------------------------</w:t>
-        <w:br/>
-        <w:t xml:space="preserve">                                     |  HTTP JSON Requests / Responses</w:t>
-        <w:br/>
-        <w:t xml:space="preserve">                                     v</w:t>
-        <w:br/>
-        <w:t>+-------------------------------------------------------------------------+</w:t>
-        <w:br/>
-        <w:t>|  APPLICATION TIER (Controller): Flask REST API Server (app.py)          |</w:t>
-        <w:br/>
-        <w:t>|  - Endpoints: /api/analyze-text, /api/analyze-bulk, /api/analyze-url    |</w:t>
-        <w:br/>
-        <w:t>|  - Input Validation &amp; Domain Whitelist | URL_CACHE In-Memory Layer      |</w:t>
-        <w:br/>
-        <w:t>+------------------+----------------------------------+-------------------</w:t>
-        <w:br/>
-        <w:t xml:space="preserve">                   |                                  |</w:t>
-        <w:br/>
-        <w:t xml:space="preserve">                   v                                  v</w:t>
-        <w:br/>
-        <w:t>+------------------------------------+  +---------------------------------+</w:t>
-        <w:br/>
-        <w:t>| LIVE SCRAPING TIER (scraper.py)    |  | NLP &amp; MODEL ENGINE (model.py)   |</w:t>
-        <w:br/>
-        <w:t>| - Parse.bot API Live Client        |  | - TF-IDF Word (15k) &amp; Char (10k)|</w:t>
-        <w:br/>
-        <w:t>| - Offline Fallback Generator       |  | - PyTorch BiLSTM Neural Network |</w:t>
-        <w:br/>
-        <w:t>| - Flipkart Slug Parser             |  | - Linear SVM, LogReg, Naive Bay |</w:t>
-        <w:br/>
-        <w:t>+------------------------------------+  +----------------+----------------+</w:t>
-        <w:br/>
-        <w:t xml:space="preserve">                                                         |</w:t>
-        <w:br/>
-        <w:t xml:space="preserve">                                                         v</w:t>
-        <w:br/>
-        <w:t>+-------------------------------------------------------------------------+</w:t>
-        <w:br/>
-        <w:t>|  DATA TIER (Model): Serialized Binary Storage (saved_models/)           |</w:t>
-        <w:br/>
-        <w:t>|  - Linear_SVM.pkl | Logistic_Regression.pkl | Naive_Bayes.pkl           |</w:t>
-        <w:br/>
-        <w:t>|  - tfidf_word.pkl | tfidf_char.pkl | scaler.pkl | metrics.pkl           |</w:t>
-        <w:br/>
-        <w:t>+-------------------------------------------------------------------------+</w:t>
+        <w:t>Fig. 3.1: System Architecture Diagram (3-Tier MVC Pattern)</w:t>
       </w:r>
     </w:p>
     <w:p>
@@ -11413,20 +10843,6 @@
           <w:sz w:val="24"/>
         </w:rPr>
         <w:t>Fig. 3.2: DFD Level 0 Context Diagram</w:t>
-      </w:r>
-    </w:p>
-    <w:p>
-      <w:pPr>
-        <w:spacing w:before="0" w:after="200" w:line="360" w:lineRule="auto"/>
-        <w:jc w:val="both"/>
-      </w:pPr>
-      <w:r>
-        <w:rPr>
-          <w:rFonts w:ascii="Times New Roman" w:hAnsi="Times New Roman"/>
-          <w:color w:val="000000"/>
-          <w:sz w:val="24"/>
-        </w:rPr>
-        <w:t>The Level 0 context diagram represents the entire system as a single process interacting with external entities (User/Shopper and Flipkart Platform).</w:t>
       </w:r>
     </w:p>
     <w:p>
@@ -11499,20 +10915,6 @@
           <w:sz w:val="24"/>
         </w:rPr>
         <w:t>Fig. 3.3: DFD Level 1 Detailed Process Breakdown</w:t>
-      </w:r>
-    </w:p>
-    <w:p>
-      <w:pPr>
-        <w:spacing w:before="0" w:after="200" w:line="360" w:lineRule="auto"/>
-        <w:jc w:val="both"/>
-      </w:pPr>
-      <w:r>
-        <w:rPr>
-          <w:rFonts w:ascii="Times New Roman" w:hAnsi="Times New Roman"/>
-          <w:color w:val="000000"/>
-          <w:sz w:val="24"/>
-        </w:rPr>
-        <w:t>The Level 1 diagram decomposes the TrustGuard system into five core functional sub-processes.</w:t>
       </w:r>
     </w:p>
     <w:p>
@@ -11622,81 +11024,58 @@
     </w:p>
     <w:p>
       <w:pPr>
-        <w:spacing w:before="240" w:after="240" w:line="276" w:lineRule="auto"/>
+        <w:spacing w:before="200" w:after="80"/>
+        <w:jc w:val="center"/>
+      </w:pPr>
+      <w:r>
+        <w:drawing>
+          <wp:inline xmlns:a="http://schemas.openxmlformats.org/drawingml/2006/main" xmlns:pic="http://schemas.openxmlformats.org/drawingml/2006/picture">
+            <wp:extent cx="5303520" cy="4499956"/>
+            <wp:docPr id="4" name="Picture 4"/>
+            <wp:cNvGraphicFramePr>
+              <a:graphicFrameLocks noChangeAspect="1"/>
+            </wp:cNvGraphicFramePr>
+            <a:graphic>
+              <a:graphicData uri="http://schemas.openxmlformats.org/drawingml/2006/picture">
+                <pic:pic>
+                  <pic:nvPicPr>
+                    <pic:cNvPr id="0" name="fig_3_4_bilstm_architecture.png"/>
+                    <pic:cNvPicPr/>
+                  </pic:nvPicPr>
+                  <pic:blipFill>
+                    <a:blip r:embed="rId14"/>
+                    <a:stretch>
+                      <a:fillRect/>
+                    </a:stretch>
+                  </pic:blipFill>
+                  <pic:spPr>
+                    <a:xfrm>
+                      <a:off x="0" y="0"/>
+                      <a:ext cx="5303520" cy="4499956"/>
+                    </a:xfrm>
+                    <a:prstGeom prst="rect"/>
+                  </pic:spPr>
+                </pic:pic>
+              </a:graphicData>
+            </a:graphic>
+          </wp:inline>
+        </w:drawing>
+      </w:r>
+    </w:p>
+    <w:p>
+      <w:pPr>
+        <w:spacing w:before="40" w:after="240"/>
         <w:jc w:val="center"/>
       </w:pPr>
       <w:r>
         <w:rPr>
           <w:rFonts w:ascii="Times New Roman" w:hAnsi="Times New Roman"/>
           <w:b/>
-          <w:color w:val="000000"/>
-          <w:sz w:val="23"/>
-        </w:rPr>
-        <w:t>[Fig. 3.4: PyTorch BiLSTM Deep Learning Neural Network Architecture]</w:t>
-        <w:br/>
-      </w:r>
-      <w:r>
-        <w:rPr>
-          <w:rFonts w:ascii="Courier New" w:hAnsi="Courier New"/>
-          <w:b/>
-          <w:color w:val="000000"/>
+          <w:i/>
+          <w:color w:val="323232"/>
           <w:sz w:val="22"/>
         </w:rPr>
-        <w:t>+-------------------------------------------------------------------------+</w:t>
-        <w:br/>
-        <w:t>|  Input Layer (Word Integer Token Sequence Vector, max_len=120)          |</w:t>
-        <w:br/>
-        <w:t>+------------------------------------+------------------------------------</w:t>
-        <w:br/>
-        <w:t xml:space="preserve">                                     |</w:t>
-        <w:br/>
-        <w:t xml:space="preserve">                                     v</w:t>
-        <w:br/>
-        <w:t>+-------------------------------------------------------------------------+</w:t>
-        <w:br/>
-        <w:t>|  Embedding Layer (vocab_size=20,000, embed_dim=128, padding_idx=0)       |</w:t>
-        <w:br/>
-        <w:t>+------------------------------------+------------------------------------</w:t>
-        <w:br/>
-        <w:t xml:space="preserve">                                     |</w:t>
-        <w:br/>
-        <w:t xml:space="preserve">                                     v</w:t>
-        <w:br/>
-        <w:t>+-------------------------------------------------------------------------+</w:t>
-        <w:br/>
-        <w:t>|  Bidirectional LSTM Layer (hidden_dim=64, bidirectional=True, concat=128)|</w:t>
-        <w:br/>
-        <w:t>+------------------------------------+------------------------------------</w:t>
-        <w:br/>
-        <w:t xml:space="preserve">                                     |</w:t>
-        <w:br/>
-        <w:t xml:space="preserve">                                     v</w:t>
-        <w:br/>
-        <w:t>+-------------------------------------------------------------------------+</w:t>
-        <w:br/>
-        <w:t>|  Mean Pooling Layer (Temporal Sequence Reduction over Time Dim)         |</w:t>
-        <w:br/>
-        <w:t>+------------------------------------+------------------------------------</w:t>
-        <w:br/>
-        <w:t xml:space="preserve">                                     |</w:t>
-        <w:br/>
-        <w:t xml:space="preserve">                                     v</w:t>
-        <w:br/>
-        <w:t>+-------------------------------------------------------------------------+</w:t>
-        <w:br/>
-        <w:t>|  Dense FC1 (128 -&gt; 32) + ReLU Activation + Dropout(0.3)                 |</w:t>
-        <w:br/>
-        <w:t>+------------------------------------+------------------------------------</w:t>
-        <w:br/>
-        <w:t xml:space="preserve">                                     |</w:t>
-        <w:br/>
-        <w:t xml:space="preserve">                                     v</w:t>
-        <w:br/>
-        <w:t>+-------------------------------------------------------------------------+</w:t>
-        <w:br/>
-        <w:t>|  Dense FC2 Output (32 -&gt; 1) + Sigmoid Activation ---&gt; Probability P(Fake)|</w:t>
-        <w:br/>
-        <w:t>+-------------------------------------------------------------------------+</w:t>
+        <w:t>Fig. 3.4: PyTorch BiLSTM Deep Learning Neural Network Architecture</w:t>
       </w:r>
     </w:p>
     <w:p>
@@ -15073,20 +14452,6 @@
     </w:p>
     <w:p>
       <w:pPr>
-        <w:spacing w:before="0" w:after="200" w:line="360" w:lineRule="auto"/>
-        <w:jc w:val="both"/>
-      </w:pPr>
-      <w:r>
-        <w:rPr>
-          <w:rFonts w:ascii="Times New Roman" w:hAnsi="Times New Roman"/>
-          <w:color w:val="000000"/>
-          <w:sz w:val="24"/>
-        </w:rPr>
-        <w:t>Model classification performance is evaluated using standard binary confusion matrix metrics: True Positives (TP = Fake correctly identified as Fake), True Negatives (TN = Real correctly identified as Real), False Positives (FP = Real incorrectly flagged as Fake), and False Negatives (FN = Fake incorrectly marked as Real):</w:t>
-      </w:r>
-    </w:p>
-    <w:p>
-      <w:pPr>
         <w:spacing w:before="240" w:after="240" w:line="276" w:lineRule="auto"/>
         <w:jc w:val="center"/>
       </w:pPr>
@@ -15132,7 +14497,7 @@
           <w:color w:val="000000"/>
           <w:sz w:val="28"/>
         </w:rPr>
-        <w:t>4.3 Comparative Analysis &amp; Discussion</w:t>
+        <w:t>4.4 System Screens and Testing Evidence</w:t>
       </w:r>
     </w:p>
     <w:p>
@@ -15146,79 +14511,231 @@
           <w:color w:val="000000"/>
           <w:sz w:val="24"/>
         </w:rPr>
-        <w:t>The experimental benchmark results demonstrate several critical insights:</w:t>
+        <w:t>The following screenshots captured directly from the live running application document the working behavior of TrustGuard.</w:t>
       </w:r>
     </w:p>
     <w:p>
       <w:pPr>
-        <w:pStyle w:val="ListBullet"/>
-        <w:spacing w:before="0" w:after="160" w:line="360" w:lineRule="auto"/>
-        <w:jc w:val="both"/>
+        <w:spacing w:before="200" w:after="80"/>
+        <w:jc w:val="center"/>
+      </w:pPr>
+      <w:r>
+        <w:drawing>
+          <wp:inline xmlns:a="http://schemas.openxmlformats.org/drawingml/2006/main" xmlns:pic="http://schemas.openxmlformats.org/drawingml/2006/picture">
+            <wp:extent cx="5303520" cy="3314700"/>
+            <wp:docPr id="5" name="Picture 5"/>
+            <wp:cNvGraphicFramePr>
+              <a:graphicFrameLocks noChangeAspect="1"/>
+            </wp:cNvGraphicFramePr>
+            <a:graphic>
+              <a:graphicData uri="http://schemas.openxmlformats.org/drawingml/2006/picture">
+                <pic:pic>
+                  <pic:nvPicPr>
+                    <pic:cNvPr id="0" name="fig_4_1_dashboard_landing.png"/>
+                    <pic:cNvPicPr/>
+                  </pic:nvPicPr>
+                  <pic:blipFill>
+                    <a:blip r:embed="rId15"/>
+                    <a:stretch>
+                      <a:fillRect/>
+                    </a:stretch>
+                  </pic:blipFill>
+                  <pic:spPr>
+                    <a:xfrm>
+                      <a:off x="0" y="0"/>
+                      <a:ext cx="5303520" cy="3314700"/>
+                    </a:xfrm>
+                    <a:prstGeom prst="rect"/>
+                  </pic:spPr>
+                </pic:pic>
+              </a:graphicData>
+            </a:graphic>
+          </wp:inline>
+        </w:drawing>
+      </w:r>
+    </w:p>
+    <w:p>
+      <w:pPr>
+        <w:spacing w:before="40" w:after="240"/>
+        <w:jc w:val="center"/>
       </w:pPr>
       <w:r>
         <w:rPr>
           <w:rFonts w:ascii="Times New Roman" w:hAnsi="Times New Roman"/>
           <w:b/>
-          <w:color w:val="000000"/>
-          <w:sz w:val="24"/>
+          <w:i/>
+          <w:color w:val="323232"/>
+          <w:sz w:val="22"/>
         </w:rPr>
-        <w:t xml:space="preserve">1. BiLSTM Superiority: </w:t>
-      </w:r>
-      <w:r>
-        <w:rPr>
-          <w:rFonts w:ascii="Times New Roman" w:hAnsi="Times New Roman"/>
-          <w:color w:val="000000"/>
-          <w:sz w:val="24"/>
-        </w:rPr>
-        <w:t>The PyTorch BiLSTM Deep Learning model achieved the highest accuracy (96.40%) by leveraging bidirectional recurrent cells to capture sequential word order context across the entire sentence, effectively recognizing complex, subtle promotional patterns.</w:t>
+        <w:t>Fig. 4.1: Dashboard -- Review Input Screen (Landing Page)</w:t>
       </w:r>
     </w:p>
     <w:p>
       <w:pPr>
-        <w:pStyle w:val="ListBullet"/>
-        <w:spacing w:before="0" w:after="160" w:line="360" w:lineRule="auto"/>
-        <w:jc w:val="both"/>
+        <w:spacing w:before="200" w:after="80"/>
+        <w:jc w:val="center"/>
+      </w:pPr>
+      <w:r>
+        <w:drawing>
+          <wp:inline xmlns:a="http://schemas.openxmlformats.org/drawingml/2006/main" xmlns:pic="http://schemas.openxmlformats.org/drawingml/2006/picture">
+            <wp:extent cx="5303520" cy="3314700"/>
+            <wp:docPr id="6" name="Picture 6"/>
+            <wp:cNvGraphicFramePr>
+              <a:graphicFrameLocks noChangeAspect="1"/>
+            </wp:cNvGraphicFramePr>
+            <a:graphic>
+              <a:graphicData uri="http://schemas.openxmlformats.org/drawingml/2006/picture">
+                <pic:pic>
+                  <pic:nvPicPr>
+                    <pic:cNvPr id="0" name="fig_4_2_single_review_test.png"/>
+                    <pic:cNvPicPr/>
+                  </pic:nvPicPr>
+                  <pic:blipFill>
+                    <a:blip r:embed="rId16"/>
+                    <a:stretch>
+                      <a:fillRect/>
+                    </a:stretch>
+                  </pic:blipFill>
+                  <pic:spPr>
+                    <a:xfrm>
+                      <a:off x="0" y="0"/>
+                      <a:ext cx="5303520" cy="3314700"/>
+                    </a:xfrm>
+                    <a:prstGeom prst="rect"/>
+                  </pic:spPr>
+                </pic:pic>
+              </a:graphicData>
+            </a:graphic>
+          </wp:inline>
+        </w:drawing>
+      </w:r>
+    </w:p>
+    <w:p>
+      <w:pPr>
+        <w:spacing w:before="40" w:after="240"/>
+        <w:jc w:val="center"/>
       </w:pPr>
       <w:r>
         <w:rPr>
           <w:rFonts w:ascii="Times New Roman" w:hAnsi="Times New Roman"/>
           <w:b/>
-          <w:color w:val="000000"/>
-          <w:sz w:val="24"/>
+          <w:i/>
+          <w:color w:val="323232"/>
+          <w:sz w:val="22"/>
         </w:rPr>
-        <w:t xml:space="preserve">2. Linear SVM Effectiveness: </w:t>
-      </w:r>
-      <w:r>
-        <w:rPr>
-          <w:rFonts w:ascii="Times New Roman" w:hAnsi="Times New Roman"/>
-          <w:color w:val="000000"/>
-          <w:sz w:val="24"/>
-        </w:rPr>
-        <w:t>Linear SVM demonstrated remarkable performance (95.70% accuracy), outperforming Logistic Regression (94.95%) and Naive Bayes (90.96%). The high dimensionality of the combined feature space (25,007 features) provides a rich hyperplane boundary that Linear SVM separates with minimal margin errors.</w:t>
+        <w:t>Fig. 4.2: Single Review Test -- Fake Review Correctly Flagged with 3 Suspicion Flags</w:t>
       </w:r>
     </w:p>
     <w:p>
       <w:pPr>
-        <w:pStyle w:val="ListBullet"/>
-        <w:spacing w:before="0" w:after="160" w:line="360" w:lineRule="auto"/>
-        <w:jc w:val="both"/>
+        <w:spacing w:before="200" w:after="80"/>
+        <w:jc w:val="center"/>
+      </w:pPr>
+      <w:r>
+        <w:drawing>
+          <wp:inline xmlns:a="http://schemas.openxmlformats.org/drawingml/2006/main" xmlns:pic="http://schemas.openxmlformats.org/drawingml/2006/picture">
+            <wp:extent cx="5303520" cy="3314700"/>
+            <wp:docPr id="7" name="Picture 7"/>
+            <wp:cNvGraphicFramePr>
+              <a:graphicFrameLocks noChangeAspect="1"/>
+            </wp:cNvGraphicFramePr>
+            <a:graphic>
+              <a:graphicData uri="http://schemas.openxmlformats.org/drawingml/2006/picture">
+                <pic:pic>
+                  <pic:nvPicPr>
+                    <pic:cNvPr id="0" name="fig_4_3_bulk_analysis_dashboard.png"/>
+                    <pic:cNvPicPr/>
+                  </pic:nvPicPr>
+                  <pic:blipFill>
+                    <a:blip r:embed="rId17"/>
+                    <a:stretch>
+                      <a:fillRect/>
+                    </a:stretch>
+                  </pic:blipFill>
+                  <pic:spPr>
+                    <a:xfrm>
+                      <a:off x="0" y="0"/>
+                      <a:ext cx="5303520" cy="3314700"/>
+                    </a:xfrm>
+                    <a:prstGeom prst="rect"/>
+                  </pic:spPr>
+                </pic:pic>
+              </a:graphicData>
+            </a:graphic>
+          </wp:inline>
+        </w:drawing>
+      </w:r>
+    </w:p>
+    <w:p>
+      <w:pPr>
+        <w:spacing w:before="40" w:after="240"/>
+        <w:jc w:val="center"/>
       </w:pPr>
       <w:r>
         <w:rPr>
           <w:rFonts w:ascii="Times New Roman" w:hAnsi="Times New Roman"/>
           <w:b/>
-          <w:color w:val="000000"/>
-          <w:sz w:val="24"/>
+          <w:i/>
+          <w:color w:val="323232"/>
+          <w:sz w:val="22"/>
         </w:rPr>
-        <w:t xml:space="preserve">3. Impact of Character N-Grams: </w:t>
+        <w:t>Fig. 4.3: Bulk Analysis -- Trust Index Dashboard for Samsung AC Reviews (100% Real)</w:t>
       </w:r>
+    </w:p>
+    <w:p>
+      <w:pPr>
+        <w:spacing w:before="200" w:after="80"/>
+        <w:jc w:val="center"/>
+      </w:pPr>
+      <w:r>
+        <w:drawing>
+          <wp:inline xmlns:a="http://schemas.openxmlformats.org/drawingml/2006/main" xmlns:pic="http://schemas.openxmlformats.org/drawingml/2006/picture">
+            <wp:extent cx="5303520" cy="3314700"/>
+            <wp:docPr id="8" name="Picture 8"/>
+            <wp:cNvGraphicFramePr>
+              <a:graphicFrameLocks noChangeAspect="1"/>
+            </wp:cNvGraphicFramePr>
+            <a:graphic>
+              <a:graphicData uri="http://schemas.openxmlformats.org/drawingml/2006/picture">
+                <pic:pic>
+                  <pic:nvPicPr>
+                    <pic:cNvPr id="0" name="fig_4_4_benchmark_modal.png"/>
+                    <pic:cNvPicPr/>
+                  </pic:nvPicPr>
+                  <pic:blipFill>
+                    <a:blip r:embed="rId18"/>
+                    <a:stretch>
+                      <a:fillRect/>
+                    </a:stretch>
+                  </pic:blipFill>
+                  <pic:spPr>
+                    <a:xfrm>
+                      <a:off x="0" y="0"/>
+                      <a:ext cx="5303520" cy="3314700"/>
+                    </a:xfrm>
+                    <a:prstGeom prst="rect"/>
+                  </pic:spPr>
+                </pic:pic>
+              </a:graphicData>
+            </a:graphic>
+          </wp:inline>
+        </w:drawing>
+      </w:r>
+    </w:p>
+    <w:p>
+      <w:pPr>
+        <w:spacing w:before="40" w:after="240"/>
+        <w:jc w:val="center"/>
+      </w:pPr>
       <w:r>
         <w:rPr>
           <w:rFonts w:ascii="Times New Roman" w:hAnsi="Times New Roman"/>
-          <w:color w:val="000000"/>
-          <w:sz w:val="24"/>
+          <w:b/>
+          <w:i/>
+          <w:color w:val="323232"/>
+          <w:sz w:val="22"/>
         </w:rPr>
-        <w:t>Incorporating character-level n-grams (2-4 grams) and stylistic metadata features improved classification accuracy by +4.74% compared to the word-only Naive Bayes baseline, proving that sub-word character repetition and capitalization ratios are essential markers of review spam.</w:t>
+        <w:t>Fig. 4.4: Model Performance Benchmark Modal with Live Accuracy &amp; F1 Metrics</w:t>
       </w:r>
     </w:p>
     <w:p>
@@ -15234,7 +14751,7 @@
           <w:color w:val="000000"/>
           <w:sz w:val="28"/>
         </w:rPr>
-        <w:t>4.4 Comprehensive Test Cases and Results</w:t>
+        <w:t>4.5 Comprehensive Test Cases and Results</w:t>
       </w:r>
     </w:p>
     <w:p>

</xml_diff>

<commit_message>
Embed rendered LaTeX mathematical formula images into 50-55 page project report
</commit_message>
<xml_diff>
--- a/MARWADI_UNIVERSITY_PROJECT_REPORT.docx
+++ b/MARWADI_UNIVERSITY_PROJECT_REPORT.docx
@@ -10421,7 +10421,7 @@
           <w:color w:val="000000"/>
           <w:sz w:val="24"/>
         </w:rPr>
-        <w:t>This section presents the mathematical formulations underlying TrustGuard's feature extraction and classification pipeline.</w:t>
+        <w:t>This section presents the mathematical formulations underlying TrustGuard's feature extraction and classification pipeline, rendered as publication-grade formula cards.</w:t>
       </w:r>
     </w:p>
     <w:p>
@@ -10449,27 +10449,56 @@
     </w:p>
     <w:p>
       <w:pPr>
-        <w:spacing w:before="240" w:after="240" w:line="276" w:lineRule="auto"/>
-        <w:jc w:val="center"/>
+        <w:spacing w:before="0" w:after="200" w:line="360" w:lineRule="auto"/>
+        <w:jc w:val="both"/>
       </w:pPr>
       <w:r>
         <w:rPr>
           <w:rFonts w:ascii="Times New Roman" w:hAnsi="Times New Roman"/>
-          <w:b/>
           <w:color w:val="000000"/>
-          <w:sz w:val="23"/>
+          <w:sz w:val="24"/>
         </w:rPr>
-        <w:t>[Formula 1: Term Frequency - Inverse Document Frequency]</w:t>
-        <w:br/>
+        <w:t>TF-IDF assigns numerical weights to terms based on their local frequency in a review and their inverse frequency across the entire corpus D. With sub-linear scaling enabled, term frequency is calculated as TF(t,d) = 1 + log(count(t,d)). The complete smooth TF-IDF formulation is defined as:</w:t>
       </w:r>
+    </w:p>
+    <w:p>
+      <w:pPr>
+        <w:spacing w:before="200" w:after="200"/>
+        <w:jc w:val="center"/>
+      </w:pPr>
       <w:r>
-        <w:rPr>
-          <w:rFonts w:ascii="Courier New" w:hAnsi="Courier New"/>
-          <w:b/>
-          <w:color w:val="000000"/>
-          <w:sz w:val="22"/>
-        </w:rPr>
-        <w:t>TF-IDF(t, d, D) = TF(t, d) * [ log( (1 + |D|) / (1 + |{d in D : t in d}|) ) + 1 ]</w:t>
+        <w:drawing>
+          <wp:inline xmlns:a="http://schemas.openxmlformats.org/drawingml/2006/main" xmlns:pic="http://schemas.openxmlformats.org/drawingml/2006/picture">
+            <wp:extent cx="5303520" cy="1002656"/>
+            <wp:docPr id="3" name="Picture 3"/>
+            <wp:cNvGraphicFramePr>
+              <a:graphicFrameLocks noChangeAspect="1"/>
+            </wp:cNvGraphicFramePr>
+            <a:graphic>
+              <a:graphicData uri="http://schemas.openxmlformats.org/drawingml/2006/picture">
+                <pic:pic>
+                  <pic:nvPicPr>
+                    <pic:cNvPr id="0" name="formula_1_tfidf.png"/>
+                    <pic:cNvPicPr/>
+                  </pic:nvPicPr>
+                  <pic:blipFill>
+                    <a:blip r:embed="rId13"/>
+                    <a:stretch>
+                      <a:fillRect/>
+                    </a:stretch>
+                  </pic:blipFill>
+                  <pic:spPr>
+                    <a:xfrm>
+                      <a:off x="0" y="0"/>
+                      <a:ext cx="5303520" cy="1002656"/>
+                    </a:xfrm>
+                    <a:prstGeom prst="rect"/>
+                  </pic:spPr>
+                </pic:pic>
+              </a:graphicData>
+            </a:graphic>
+          </wp:inline>
+        </w:drawing>
       </w:r>
     </w:p>
     <w:p>
@@ -10497,27 +10526,56 @@
     </w:p>
     <w:p>
       <w:pPr>
-        <w:spacing w:before="240" w:after="240" w:line="276" w:lineRule="auto"/>
-        <w:jc w:val="center"/>
+        <w:spacing w:before="0" w:after="200" w:line="360" w:lineRule="auto"/>
+        <w:jc w:val="both"/>
       </w:pPr>
       <w:r>
         <w:rPr>
           <w:rFonts w:ascii="Times New Roman" w:hAnsi="Times New Roman"/>
-          <w:b/>
           <w:color w:val="000000"/>
-          <w:sz w:val="23"/>
+          <w:sz w:val="24"/>
         </w:rPr>
-        <w:t>[Formula 2: Z-Score Normalization]</w:t>
-        <w:br/>
+        <w:t>To prevent features with large numerical ranges (such as review character length) from dominating gradient calculations, all seven metadata attributes are standardized to zero mean (mu = 0) and unit variance (sigma = 1):</w:t>
       </w:r>
+    </w:p>
+    <w:p>
+      <w:pPr>
+        <w:spacing w:before="200" w:after="200"/>
+        <w:jc w:val="center"/>
+      </w:pPr>
       <w:r>
-        <w:rPr>
-          <w:rFonts w:ascii="Courier New" w:hAnsi="Courier New"/>
-          <w:b/>
-          <w:color w:val="000000"/>
-          <w:sz w:val="22"/>
-        </w:rPr>
-        <w:t>z = (x - mu) / sigma    where  mu = (1/N)*SUM(x_i),  sigma = sqrt((1/N)*SUM((x_i - mu)^2))</w:t>
+        <w:drawing>
+          <wp:inline xmlns:a="http://schemas.openxmlformats.org/drawingml/2006/main" xmlns:pic="http://schemas.openxmlformats.org/drawingml/2006/picture">
+            <wp:extent cx="5303520" cy="1002656"/>
+            <wp:docPr id="4" name="Picture 4"/>
+            <wp:cNvGraphicFramePr>
+              <a:graphicFrameLocks noChangeAspect="1"/>
+            </wp:cNvGraphicFramePr>
+            <a:graphic>
+              <a:graphicData uri="http://schemas.openxmlformats.org/drawingml/2006/picture">
+                <pic:pic>
+                  <pic:nvPicPr>
+                    <pic:cNvPr id="0" name="formula_2_zscore.png"/>
+                    <pic:cNvPicPr/>
+                  </pic:nvPicPr>
+                  <pic:blipFill>
+                    <a:blip r:embed="rId14"/>
+                    <a:stretch>
+                      <a:fillRect/>
+                    </a:stretch>
+                  </pic:blipFill>
+                  <pic:spPr>
+                    <a:xfrm>
+                      <a:off x="0" y="0"/>
+                      <a:ext cx="5303520" cy="1002656"/>
+                    </a:xfrm>
+                    <a:prstGeom prst="rect"/>
+                  </pic:spPr>
+                </pic:pic>
+              </a:graphicData>
+            </a:graphic>
+          </wp:inline>
+        </w:drawing>
       </w:r>
     </w:p>
     <w:p>
@@ -10545,30 +10603,56 @@
     </w:p>
     <w:p>
       <w:pPr>
-        <w:spacing w:before="240" w:after="240" w:line="276" w:lineRule="auto"/>
-        <w:jc w:val="center"/>
+        <w:spacing w:before="0" w:after="200" w:line="360" w:lineRule="auto"/>
+        <w:jc w:val="both"/>
       </w:pPr>
       <w:r>
         <w:rPr>
           <w:rFonts w:ascii="Times New Roman" w:hAnsi="Times New Roman"/>
-          <w:b/>
           <w:color w:val="000000"/>
-          <w:sz w:val="23"/>
+          <w:sz w:val="24"/>
         </w:rPr>
-        <w:t>[Formula 3: Linear SVM Objective &amp; Sigmoidal Probability Mapping]</w:t>
-        <w:br/>
+        <w:t>Linear SVM minimizes the soft-margin hinge loss with L2 regularization to find the optimal separating hyperplane w^T * X + b = 0. The signed distance z is transformed into a calibrated probability via a parameterized sigmoid function:</w:t>
       </w:r>
+    </w:p>
+    <w:p>
+      <w:pPr>
+        <w:spacing w:before="200" w:after="200"/>
+        <w:jc w:val="center"/>
+      </w:pPr>
       <w:r>
-        <w:rPr>
-          <w:rFonts w:ascii="Courier New" w:hAnsi="Courier New"/>
-          <w:b/>
-          <w:color w:val="000000"/>
-          <w:sz w:val="22"/>
-        </w:rPr>
-        <w:t>min_{w,b}  (1/2) * ||w||^2  +  C * SUM_{i=1}^N max(0, 1 - y_i * (w^T * x_i + b))</w:t>
-        <w:br/>
-        <w:br/>
-        <w:t>P(Fake | X) = 1 / ( 1 + exp( -1.2 * (w^T * X + b) ) )</w:t>
+        <w:drawing>
+          <wp:inline xmlns:a="http://schemas.openxmlformats.org/drawingml/2006/main" xmlns:pic="http://schemas.openxmlformats.org/drawingml/2006/picture">
+            <wp:extent cx="5303520" cy="1349141"/>
+            <wp:docPr id="5" name="Picture 5"/>
+            <wp:cNvGraphicFramePr>
+              <a:graphicFrameLocks noChangeAspect="1"/>
+            </wp:cNvGraphicFramePr>
+            <a:graphic>
+              <a:graphicData uri="http://schemas.openxmlformats.org/drawingml/2006/picture">
+                <pic:pic>
+                  <pic:nvPicPr>
+                    <pic:cNvPr id="0" name="formula_3_svm.png"/>
+                    <pic:cNvPicPr/>
+                  </pic:nvPicPr>
+                  <pic:blipFill>
+                    <a:blip r:embed="rId15"/>
+                    <a:stretch>
+                      <a:fillRect/>
+                    </a:stretch>
+                  </pic:blipFill>
+                  <pic:spPr>
+                    <a:xfrm>
+                      <a:off x="0" y="0"/>
+                      <a:ext cx="5303520" cy="1349141"/>
+                    </a:xfrm>
+                    <a:prstGeom prst="rect"/>
+                  </pic:spPr>
+                </pic:pic>
+              </a:graphicData>
+            </a:graphic>
+          </wp:inline>
+        </w:drawing>
       </w:r>
     </w:p>
     <w:p>
@@ -10596,43 +10680,56 @@
     </w:p>
     <w:p>
       <w:pPr>
-        <w:spacing w:before="240" w:after="240" w:line="276" w:lineRule="auto"/>
-        <w:jc w:val="center"/>
+        <w:spacing w:before="0" w:after="200" w:line="360" w:lineRule="auto"/>
+        <w:jc w:val="both"/>
       </w:pPr>
       <w:r>
         <w:rPr>
           <w:rFonts w:ascii="Times New Roman" w:hAnsi="Times New Roman"/>
-          <w:b/>
           <w:color w:val="000000"/>
-          <w:sz w:val="23"/>
+          <w:sz w:val="24"/>
         </w:rPr>
-        <w:t>[Formula 4: PyTorch Bi-directional LSTM Gated Equations]</w:t>
-        <w:br/>
+        <w:t>At each time step t for an input word embedding x_t, the forward and backward LSTM units compute activation states via gated mechanisms:</w:t>
       </w:r>
+    </w:p>
+    <w:p>
+      <w:pPr>
+        <w:spacing w:before="200" w:after="200"/>
+        <w:jc w:val="center"/>
+      </w:pPr>
       <w:r>
-        <w:rPr>
-          <w:rFonts w:ascii="Courier New" w:hAnsi="Courier New"/>
-          <w:b/>
-          <w:color w:val="000000"/>
-          <w:sz w:val="22"/>
-        </w:rPr>
-        <w:t>f_t = sigmoid( W_f * [h_{t-1}, x_t] + b_f )    [Forget Gate]</w:t>
-        <w:br/>
-        <w:t>i_t = sigmoid( W_i * [h_{t-1}, x_t] + b_i )    [Input Gate]</w:t>
-        <w:br/>
-        <w:t>C_tilde_t = tanh( W_c * [h_{t-1}, x_t] + b_c ) [Candidate Cell State]</w:t>
-        <w:br/>
-        <w:t>C_t = f_t (*) C_{t-1} + i_t (*) C_tilde_t       [Cell State Update]</w:t>
-        <w:br/>
-        <w:t>o_t = sigmoid( W_o * [h_{t-1}, x_t] + b_o )    [Output Gate]</w:t>
-        <w:br/>
-        <w:t>h_t = o_t (*) tanh( C_t )                       [Hidden Output State]</w:t>
-        <w:br/>
-        <w:br/>
-        <w:t>h_BiLSTM = [ h_forward_t  ;  h_backward_t ]     [Bidirectional Concatenation]</w:t>
-        <w:br/>
-        <w:br/>
-        <w:t>P(Fake | X) = sigmoid( W_2 * ReLU( W_1 * MeanPool( h_BiLSTM ) ) )</w:t>
+        <w:drawing>
+          <wp:inline xmlns:a="http://schemas.openxmlformats.org/drawingml/2006/main" xmlns:pic="http://schemas.openxmlformats.org/drawingml/2006/picture">
+            <wp:extent cx="5303520" cy="1896169"/>
+            <wp:docPr id="6" name="Picture 6"/>
+            <wp:cNvGraphicFramePr>
+              <a:graphicFrameLocks noChangeAspect="1"/>
+            </wp:cNvGraphicFramePr>
+            <a:graphic>
+              <a:graphicData uri="http://schemas.openxmlformats.org/drawingml/2006/picture">
+                <pic:pic>
+                  <pic:nvPicPr>
+                    <pic:cNvPr id="0" name="formula_4_bilstm.png"/>
+                    <pic:cNvPicPr/>
+                  </pic:nvPicPr>
+                  <pic:blipFill>
+                    <a:blip r:embed="rId16"/>
+                    <a:stretch>
+                      <a:fillRect/>
+                    </a:stretch>
+                  </pic:blipFill>
+                  <pic:spPr>
+                    <a:xfrm>
+                      <a:off x="0" y="0"/>
+                      <a:ext cx="5303520" cy="1896169"/>
+                    </a:xfrm>
+                    <a:prstGeom prst="rect"/>
+                  </pic:spPr>
+                </pic:pic>
+              </a:graphicData>
+            </a:graphic>
+          </wp:inline>
+        </w:drawing>
       </w:r>
     </w:p>
     <w:p>
@@ -10660,27 +10757,56 @@
     </w:p>
     <w:p>
       <w:pPr>
-        <w:spacing w:before="240" w:after="240" w:line="276" w:lineRule="auto"/>
-        <w:jc w:val="center"/>
+        <w:spacing w:before="0" w:after="200" w:line="360" w:lineRule="auto"/>
+        <w:jc w:val="both"/>
       </w:pPr>
       <w:r>
         <w:rPr>
           <w:rFonts w:ascii="Times New Roman" w:hAnsi="Times New Roman"/>
-          <w:b/>
           <w:color w:val="000000"/>
-          <w:sz w:val="23"/>
+          <w:sz w:val="24"/>
         </w:rPr>
-        <w:t>[Formula 5: Product Trust Index Score]</w:t>
-        <w:br/>
+        <w:t>The aggregate Product Trust Index represents the percentage of verified authentic reviews out of the total analyzed reviews N:</w:t>
       </w:r>
+    </w:p>
+    <w:p>
+      <w:pPr>
+        <w:spacing w:before="200" w:after="200"/>
+        <w:jc w:val="center"/>
+      </w:pPr>
       <w:r>
-        <w:rPr>
-          <w:rFonts w:ascii="Courier New" w:hAnsi="Courier New"/>
-          <w:b/>
-          <w:color w:val="000000"/>
-          <w:sz w:val="22"/>
-        </w:rPr>
-        <w:t>Trust Index (%) = [ Count(REAL Reviews) / Total Reviews Analyzed ] * 100%</w:t>
+        <w:drawing>
+          <wp:inline xmlns:a="http://schemas.openxmlformats.org/drawingml/2006/main" xmlns:pic="http://schemas.openxmlformats.org/drawingml/2006/picture">
+            <wp:extent cx="5303520" cy="1046681"/>
+            <wp:docPr id="7" name="Picture 7"/>
+            <wp:cNvGraphicFramePr>
+              <a:graphicFrameLocks noChangeAspect="1"/>
+            </wp:cNvGraphicFramePr>
+            <a:graphic>
+              <a:graphicData uri="http://schemas.openxmlformats.org/drawingml/2006/picture">
+                <pic:pic>
+                  <pic:nvPicPr>
+                    <pic:cNvPr id="0" name="formula_5_trust_index.png"/>
+                    <pic:cNvPicPr/>
+                  </pic:nvPicPr>
+                  <pic:blipFill>
+                    <a:blip r:embed="rId17"/>
+                    <a:stretch>
+                      <a:fillRect/>
+                    </a:stretch>
+                  </pic:blipFill>
+                  <pic:spPr>
+                    <a:xfrm>
+                      <a:off x="0" y="0"/>
+                      <a:ext cx="5303520" cy="1046681"/>
+                    </a:xfrm>
+                    <a:prstGeom prst="rect"/>
+                  </pic:spPr>
+                </pic:pic>
+              </a:graphicData>
+            </a:graphic>
+          </wp:inline>
+        </w:drawing>
       </w:r>
     </w:p>
     <w:p>
@@ -10759,7 +10885,7 @@
         <w:drawing>
           <wp:inline xmlns:a="http://schemas.openxmlformats.org/drawingml/2006/main" xmlns:pic="http://schemas.openxmlformats.org/drawingml/2006/picture">
             <wp:extent cx="5303520" cy="4330397"/>
-            <wp:docPr id="3" name="Picture 3"/>
+            <wp:docPr id="8" name="Picture 8"/>
             <wp:cNvGraphicFramePr>
               <a:graphicFrameLocks noChangeAspect="1"/>
             </wp:cNvGraphicFramePr>
@@ -10771,7 +10897,7 @@
                     <pic:cNvPicPr/>
                   </pic:nvPicPr>
                   <pic:blipFill>
-                    <a:blip r:embed="rId13"/>
+                    <a:blip r:embed="rId18"/>
                     <a:stretch>
                       <a:fillRect/>
                     </a:stretch>
@@ -10847,149 +10973,16 @@
     </w:p>
     <w:p>
       <w:pPr>
-        <w:spacing w:before="240" w:after="240" w:line="276" w:lineRule="auto"/>
-        <w:jc w:val="center"/>
-      </w:pPr>
-      <w:r>
-        <w:rPr>
-          <w:rFonts w:ascii="Times New Roman" w:hAnsi="Times New Roman"/>
-          <w:b/>
-          <w:color w:val="000000"/>
-          <w:sz w:val="23"/>
-        </w:rPr>
-        <w:t>[Fig. 3.2: Data Flow Diagram (DFD) -- Level 0 Context Diagram]</w:t>
-        <w:br/>
-      </w:r>
-      <w:r>
-        <w:rPr>
-          <w:rFonts w:ascii="Courier New" w:hAnsi="Courier New"/>
-          <w:b/>
-          <w:color w:val="000000"/>
-          <w:sz w:val="22"/>
-        </w:rPr>
-        <w:t>+-------------+                                           +--------------+</w:t>
-        <w:br/>
-        <w:t>|             | ---- (1) Flipkart Product URL / Text ---&gt; |              |</w:t>
-        <w:br/>
-        <w:t>|   Shopper   |                                           |  0.0 TRUST-  |</w:t>
-        <w:br/>
-        <w:t>|   / User    | &lt;--- (4) Trust Score, Flags &amp; Charts --- |    GUARD     |</w:t>
-        <w:br/>
-        <w:t>|             |                                           |    SYSTEM    |</w:t>
-        <w:br/>
-        <w:t>+-------------+                                           +-------+------+</w:t>
-        <w:br/>
-        <w:t xml:space="preserve">                                                                  |  ^</w:t>
-        <w:br/>
-        <w:t xml:space="preserve">                                       (2) Scrape Request / Auth  |  | (3) Raw Reviews</w:t>
-        <w:br/>
-        <w:t xml:space="preserve">                                                                  v  |</w:t>
-        <w:br/>
-        <w:t xml:space="preserve">                                                          +-------+------+</w:t>
-        <w:br/>
-        <w:t xml:space="preserve">                                                          |   Flipkart   |</w:t>
-        <w:br/>
-        <w:t xml:space="preserve">                                                          |  (Parse.bot) |</w:t>
-        <w:br/>
-        <w:t xml:space="preserve">                                                          +--------------+</w:t>
-      </w:r>
-    </w:p>
-    <w:p>
-      <w:pPr>
         <w:spacing w:before="0" w:after="200" w:line="360" w:lineRule="auto"/>
         <w:jc w:val="both"/>
       </w:pPr>
       <w:r>
         <w:rPr>
           <w:rFonts w:ascii="Times New Roman" w:hAnsi="Times New Roman"/>
-          <w:b/>
           <w:color w:val="000000"/>
           <w:sz w:val="24"/>
         </w:rPr>
-        <w:t xml:space="preserve">3.2.2 DFD Level 1 Detailed Process Breakdown: </w:t>
-      </w:r>
-      <w:r>
-        <w:rPr>
-          <w:rFonts w:ascii="Times New Roman" w:hAnsi="Times New Roman"/>
-          <w:color w:val="000000"/>
-          <w:sz w:val="24"/>
-        </w:rPr>
-        <w:t>Fig. 3.3: DFD Level 1 Detailed Process Breakdown</w:t>
-      </w:r>
-    </w:p>
-    <w:p>
-      <w:pPr>
-        <w:spacing w:before="240" w:after="240" w:line="276" w:lineRule="auto"/>
-        <w:jc w:val="center"/>
-      </w:pPr>
-      <w:r>
-        <w:rPr>
-          <w:rFonts w:ascii="Times New Roman" w:hAnsi="Times New Roman"/>
-          <w:b/>
-          <w:color w:val="000000"/>
-          <w:sz w:val="23"/>
-        </w:rPr>
-        <w:t>[Fig. 3.3: Data Flow Diagram (DFD) -- Level 1 Detailed Pipeline]</w:t>
-        <w:br/>
-      </w:r>
-      <w:r>
-        <w:rPr>
-          <w:rFonts w:ascii="Courier New" w:hAnsi="Courier New"/>
-          <w:b/>
-          <w:color w:val="000000"/>
-          <w:sz w:val="22"/>
-        </w:rPr>
-        <w:t>[ User Input ]</w:t>
-        <w:br/>
-        <w:t xml:space="preserve">      |</w:t>
-        <w:br/>
-        <w:t xml:space="preserve">      v</w:t>
-        <w:br/>
-        <w:t>+-------------------------------------------------------------------------+</w:t>
-        <w:br/>
-        <w:t>| 1.0 Data Acquisition &amp; URL Cache (Check Cache -&gt; Parse.bot API Fetch)   |</w:t>
-        <w:br/>
-        <w:t>+------------------------------------+------------------------------------</w:t>
-        <w:br/>
-        <w:t xml:space="preserve">                                     | Raw Review Records</w:t>
-        <w:br/>
-        <w:t xml:space="preserve">                                     v</w:t>
-        <w:br/>
-        <w:t>+-------------------------------------------------------------------------+</w:t>
-        <w:br/>
-        <w:t>| 2.0 Text Preprocessing &amp; Cleaning (Lowercasing, Regex Noise Stripping)  |</w:t>
-        <w:br/>
-        <w:t>+------------------------------------+------------------------------------</w:t>
-        <w:br/>
-        <w:t xml:space="preserve">                                     | Clean Text Stream</w:t>
-        <w:br/>
-        <w:t xml:space="preserve">                                     v</w:t>
-        <w:br/>
-        <w:t>+-------------------------------------------------------------------------+</w:t>
-        <w:br/>
-        <w:t>| 3.0 Hybrid NLP Feature Extraction (TF-IDF Word + Char + Metadata Stack) |</w:t>
-        <w:br/>
-        <w:t>+------------------------------------+------------------------------------</w:t>
-        <w:br/>
-        <w:t xml:space="preserve">                                     | Sparse Feature Tensor X</w:t>
-        <w:br/>
-        <w:t xml:space="preserve">                                     v</w:t>
-        <w:br/>
-        <w:t>+-------------------------------------------------------------------------+</w:t>
-        <w:br/>
-        <w:t>| 4.0 Classifier Inference &amp; Suspicion Flagging (BiLSTM / Linear SVM)     |</w:t>
-        <w:br/>
-        <w:t>+------------------------------------+------------------------------------</w:t>
-        <w:br/>
-        <w:t xml:space="preserve">                                     | Predictions + Confidence Scores</w:t>
-        <w:br/>
-        <w:t xml:space="preserve">                                     v</w:t>
-        <w:br/>
-        <w:t>+-------------------------------------------------------------------------+</w:t>
-        <w:br/>
-        <w:t>| 5.0 Aggregation &amp; Dashboard Output (Trust Index % + Chart.js Rendering) |</w:t>
-        <w:br/>
-        <w:t>+-------------------------------------------------------------------------+</w:t>
+        <w:t>The Level 0 context diagram represents the entire system as a single process interacting with external entities (User/Shopper and Flipkart Platform).</w:t>
       </w:r>
     </w:p>
     <w:p>
@@ -11031,7 +11024,7 @@
         <w:drawing>
           <wp:inline xmlns:a="http://schemas.openxmlformats.org/drawingml/2006/main" xmlns:pic="http://schemas.openxmlformats.org/drawingml/2006/picture">
             <wp:extent cx="5303520" cy="4499956"/>
-            <wp:docPr id="4" name="Picture 4"/>
+            <wp:docPr id="9" name="Picture 9"/>
             <wp:cNvGraphicFramePr>
               <a:graphicFrameLocks noChangeAspect="1"/>
             </wp:cNvGraphicFramePr>
@@ -11043,7 +11036,7 @@
                     <pic:cNvPicPr/>
                   </pic:nvPicPr>
                   <pic:blipFill>
-                    <a:blip r:embed="rId14"/>
+                    <a:blip r:embed="rId19"/>
                     <a:stretch>
                       <a:fillRect/>
                     </a:stretch>
@@ -14452,36 +14445,56 @@
     </w:p>
     <w:p>
       <w:pPr>
-        <w:spacing w:before="240" w:after="240" w:line="276" w:lineRule="auto"/>
-        <w:jc w:val="center"/>
+        <w:spacing w:before="0" w:after="200" w:line="360" w:lineRule="auto"/>
+        <w:jc w:val="both"/>
       </w:pPr>
       <w:r>
         <w:rPr>
           <w:rFonts w:ascii="Times New Roman" w:hAnsi="Times New Roman"/>
-          <w:b/>
           <w:color w:val="000000"/>
-          <w:sz w:val="23"/>
+          <w:sz w:val="24"/>
         </w:rPr>
-        <w:t>[Formula 6: Classification Performance Evaluation Metrics]</w:t>
-        <w:br/>
+        <w:t>Model classification performance is evaluated using standard binary confusion matrix metrics:</w:t>
       </w:r>
+    </w:p>
+    <w:p>
+      <w:pPr>
+        <w:spacing w:before="200" w:after="200"/>
+        <w:jc w:val="center"/>
+      </w:pPr>
       <w:r>
-        <w:rPr>
-          <w:rFonts w:ascii="Courier New" w:hAnsi="Courier New"/>
-          <w:b/>
-          <w:color w:val="000000"/>
-          <w:sz w:val="22"/>
-        </w:rPr>
-        <w:t>Accuracy  = ( TP + TN ) / ( TP + TN + FP + FN )</w:t>
-        <w:br/>
-        <w:br/>
-        <w:t>Precision = TP / ( TP + FP )</w:t>
-        <w:br/>
-        <w:br/>
-        <w:t>Recall    = TP / ( TP + FN )</w:t>
-        <w:br/>
-        <w:br/>
-        <w:t>F1-Score  = 2 * [ ( Precision * Recall ) / ( Precision + Recall ) ]</w:t>
+        <w:drawing>
+          <wp:inline xmlns:a="http://schemas.openxmlformats.org/drawingml/2006/main" xmlns:pic="http://schemas.openxmlformats.org/drawingml/2006/picture">
+            <wp:extent cx="5303520" cy="1391245"/>
+            <wp:docPr id="10" name="Picture 10"/>
+            <wp:cNvGraphicFramePr>
+              <a:graphicFrameLocks noChangeAspect="1"/>
+            </wp:cNvGraphicFramePr>
+            <a:graphic>
+              <a:graphicData uri="http://schemas.openxmlformats.org/drawingml/2006/picture">
+                <pic:pic>
+                  <pic:nvPicPr>
+                    <pic:cNvPr id="0" name="formula_6_metrics.png"/>
+                    <pic:cNvPicPr/>
+                  </pic:nvPicPr>
+                  <pic:blipFill>
+                    <a:blip r:embed="rId20"/>
+                    <a:stretch>
+                      <a:fillRect/>
+                    </a:stretch>
+                  </pic:blipFill>
+                  <pic:spPr>
+                    <a:xfrm>
+                      <a:off x="0" y="0"/>
+                      <a:ext cx="5303520" cy="1391245"/>
+                    </a:xfrm>
+                    <a:prstGeom prst="rect"/>
+                  </pic:spPr>
+                </pic:pic>
+              </a:graphicData>
+            </a:graphic>
+          </wp:inline>
+        </w:drawing>
       </w:r>
     </w:p>
     <w:p>
@@ -14523,7 +14536,7 @@
         <w:drawing>
           <wp:inline xmlns:a="http://schemas.openxmlformats.org/drawingml/2006/main" xmlns:pic="http://schemas.openxmlformats.org/drawingml/2006/picture">
             <wp:extent cx="5303520" cy="3314700"/>
-            <wp:docPr id="5" name="Picture 5"/>
+            <wp:docPr id="11" name="Picture 11"/>
             <wp:cNvGraphicFramePr>
               <a:graphicFrameLocks noChangeAspect="1"/>
             </wp:cNvGraphicFramePr>
@@ -14535,7 +14548,7 @@
                     <pic:cNvPicPr/>
                   </pic:nvPicPr>
                   <pic:blipFill>
-                    <a:blip r:embed="rId15"/>
+                    <a:blip r:embed="rId21"/>
                     <a:stretch>
                       <a:fillRect/>
                     </a:stretch>
@@ -14579,7 +14592,7 @@
         <w:drawing>
           <wp:inline xmlns:a="http://schemas.openxmlformats.org/drawingml/2006/main" xmlns:pic="http://schemas.openxmlformats.org/drawingml/2006/picture">
             <wp:extent cx="5303520" cy="3314700"/>
-            <wp:docPr id="6" name="Picture 6"/>
+            <wp:docPr id="12" name="Picture 12"/>
             <wp:cNvGraphicFramePr>
               <a:graphicFrameLocks noChangeAspect="1"/>
             </wp:cNvGraphicFramePr>
@@ -14591,7 +14604,7 @@
                     <pic:cNvPicPr/>
                   </pic:nvPicPr>
                   <pic:blipFill>
-                    <a:blip r:embed="rId16"/>
+                    <a:blip r:embed="rId22"/>
                     <a:stretch>
                       <a:fillRect/>
                     </a:stretch>
@@ -14635,7 +14648,7 @@
         <w:drawing>
           <wp:inline xmlns:a="http://schemas.openxmlformats.org/drawingml/2006/main" xmlns:pic="http://schemas.openxmlformats.org/drawingml/2006/picture">
             <wp:extent cx="5303520" cy="3314700"/>
-            <wp:docPr id="7" name="Picture 7"/>
+            <wp:docPr id="13" name="Picture 13"/>
             <wp:cNvGraphicFramePr>
               <a:graphicFrameLocks noChangeAspect="1"/>
             </wp:cNvGraphicFramePr>
@@ -14647,7 +14660,7 @@
                     <pic:cNvPicPr/>
                   </pic:nvPicPr>
                   <pic:blipFill>
-                    <a:blip r:embed="rId17"/>
+                    <a:blip r:embed="rId23"/>
                     <a:stretch>
                       <a:fillRect/>
                     </a:stretch>
@@ -14691,7 +14704,7 @@
         <w:drawing>
           <wp:inline xmlns:a="http://schemas.openxmlformats.org/drawingml/2006/main" xmlns:pic="http://schemas.openxmlformats.org/drawingml/2006/picture">
             <wp:extent cx="5303520" cy="3314700"/>
-            <wp:docPr id="8" name="Picture 8"/>
+            <wp:docPr id="14" name="Picture 14"/>
             <wp:cNvGraphicFramePr>
               <a:graphicFrameLocks noChangeAspect="1"/>
             </wp:cNvGraphicFramePr>
@@ -14703,7 +14716,7 @@
                     <pic:cNvPicPr/>
                   </pic:nvPicPr>
                   <pic:blipFill>
-                    <a:blip r:embed="rId18"/>
+                    <a:blip r:embed="rId24"/>
                     <a:stretch>
                       <a:fillRect/>
                     </a:stretch>

</xml_diff>

<commit_message>
Convert entire project report, flowcharts, formulas, and tables to formal black and white theme
</commit_message>
<xml_diff>
--- a/MARWADI_UNIVERSITY_PROJECT_REPORT.docx
+++ b/MARWADI_UNIVERSITY_PROJECT_REPORT.docx
@@ -11,6 +11,7 @@
         <w:rPr>
           <w:rFonts w:ascii="Times New Roman" w:hAnsi="Times New Roman"/>
           <w:b/>
+          <w:color w:val="000000"/>
           <w:sz w:val="36"/>
         </w:rPr>
         <w:t>TRUSTGUARD: AI-POWERED FLIPKART FAKE</w:t>
@@ -27,6 +28,7 @@
         <w:rPr>
           <w:rFonts w:ascii="Times New Roman" w:hAnsi="Times New Roman"/>
           <w:b/>
+          <w:color w:val="000000"/>
           <w:sz w:val="28"/>
         </w:rPr>
         <w:t>A PROJECT REPORT</w:t>
@@ -41,6 +43,7 @@
         <w:rPr>
           <w:rFonts w:ascii="Times New Roman" w:hAnsi="Times New Roman"/>
           <w:b/>
+          <w:color w:val="000000"/>
           <w:sz w:val="32"/>
         </w:rPr>
         <w:t>Major Project – I (01CE0716)</w:t>
@@ -55,6 +58,7 @@
         <w:rPr>
           <w:rFonts w:ascii="Times New Roman" w:hAnsi="Times New Roman"/>
           <w:i/>
+          <w:color w:val="000000"/>
           <w:sz w:val="28"/>
         </w:rPr>
         <w:t>Submitted by</w:t>
@@ -69,6 +73,7 @@
         <w:rPr>
           <w:rFonts w:ascii="Times New Roman" w:hAnsi="Times New Roman"/>
           <w:b/>
+          <w:color w:val="000000"/>
           <w:sz w:val="32"/>
         </w:rPr>
         <w:t>Jaykishan Kalariya (92301703102)</w:t>
@@ -79,6 +84,7 @@
         <w:rPr>
           <w:rFonts w:ascii="Times New Roman" w:hAnsi="Times New Roman"/>
           <w:b/>
+          <w:color w:val="000000"/>
           <w:sz w:val="32"/>
         </w:rPr>
         <w:t>Maan Kalariya (92301703111)</w:t>
@@ -93,6 +99,7 @@
         <w:rPr>
           <w:rFonts w:ascii="Times New Roman" w:hAnsi="Times New Roman"/>
           <w:b/>
+          <w:color w:val="000000"/>
           <w:sz w:val="32"/>
         </w:rPr>
         <w:t>BACHELOR OF TECHNOLOGY</w:t>
@@ -102,6 +109,7 @@
         <w:rPr>
           <w:rFonts w:ascii="Times New Roman" w:hAnsi="Times New Roman"/>
           <w:i/>
+          <w:color w:val="000000"/>
           <w:sz w:val="28"/>
         </w:rPr>
         <w:t>in</w:t>
@@ -111,6 +119,7 @@
         <w:rPr>
           <w:rFonts w:ascii="Times New Roman" w:hAnsi="Times New Roman"/>
           <w:b/>
+          <w:color w:val="000000"/>
           <w:sz w:val="32"/>
         </w:rPr>
         <w:t>Computer Engineering</w:t>
@@ -125,6 +134,7 @@
         <w:rPr>
           <w:rFonts w:ascii="Times New Roman" w:hAnsi="Times New Roman"/>
           <w:b/>
+          <w:color w:val="000000"/>
           <w:sz w:val="32"/>
         </w:rPr>
         <w:t>Faculty of Engineering &amp; Technology</w:t>
@@ -136,6 +146,7 @@
       <w:r>
         <w:rPr>
           <w:rFonts w:ascii="Times New Roman" w:hAnsi="Times New Roman"/>
+          <w:color w:val="000000"/>
           <w:sz w:val="28"/>
         </w:rPr>
         <w:t>August, 2026</w:t>
@@ -161,6 +172,7 @@
         <w:rPr>
           <w:rFonts w:ascii="Times New Roman" w:hAnsi="Times New Roman"/>
           <w:b/>
+          <w:color w:val="000000"/>
           <w:sz w:val="28"/>
         </w:rPr>
         <w:t>Major Project – I (01CE0716)</w:t>
@@ -185,6 +197,7 @@
         <w:rPr>
           <w:rFonts w:ascii="Times New Roman" w:hAnsi="Times New Roman"/>
           <w:b/>
+          <w:color w:val="000000"/>
           <w:sz w:val="36"/>
         </w:rPr>
         <w:t>CERTIFICATE</w:t>
@@ -227,6 +240,7 @@
             <w:r>
               <w:rPr>
                 <w:rFonts w:ascii="Times New Roman" w:hAnsi="Times New Roman"/>
+                <w:color w:val="000000"/>
                 <w:sz w:val="22"/>
               </w:rPr>
               <w:br/>
@@ -246,6 +260,7 @@
             <w:r>
               <w:rPr>
                 <w:rFonts w:ascii="Times New Roman" w:hAnsi="Times New Roman"/>
+                <w:color w:val="000000"/>
                 <w:sz w:val="22"/>
               </w:rPr>
               <w:br/>
@@ -267,6 +282,7 @@
             <w:r>
               <w:rPr>
                 <w:rFonts w:ascii="Times New Roman" w:hAnsi="Times New Roman"/>
+                <w:color w:val="000000"/>
                 <w:sz w:val="22"/>
               </w:rPr>
               <w:t>Prof. Charmi Vora</w:t>
@@ -284,6 +300,7 @@
             <w:r>
               <w:rPr>
                 <w:rFonts w:ascii="Times New Roman" w:hAnsi="Times New Roman"/>
+                <w:color w:val="000000"/>
                 <w:sz w:val="22"/>
               </w:rPr>
               <w:t>Prof. (Dr.) Krunal Vaghela</w:t>
@@ -303,6 +320,7 @@
             <w:r>
               <w:rPr>
                 <w:rFonts w:ascii="Times New Roman" w:hAnsi="Times New Roman"/>
+                <w:color w:val="000000"/>
                 <w:sz w:val="22"/>
               </w:rPr>
               <w:t>Assistant Professor</w:t>
@@ -322,6 +340,7 @@
             <w:r>
               <w:rPr>
                 <w:rFonts w:ascii="Times New Roman" w:hAnsi="Times New Roman"/>
+                <w:color w:val="000000"/>
                 <w:sz w:val="22"/>
               </w:rPr>
               <w:t>Associate Dean &amp; Head</w:t>
@@ -346,6 +365,7 @@
         <w:rPr>
           <w:rFonts w:ascii="Times New Roman" w:hAnsi="Times New Roman"/>
           <w:b/>
+          <w:color w:val="000000"/>
           <w:sz w:val="28"/>
         </w:rPr>
         <w:t>Major Project – I (01CE0716)</w:t>
@@ -370,6 +390,7 @@
         <w:rPr>
           <w:rFonts w:ascii="Times New Roman" w:hAnsi="Times New Roman"/>
           <w:b/>
+          <w:color w:val="000000"/>
           <w:sz w:val="36"/>
         </w:rPr>
         <w:t>DECLARATION</w:t>
@@ -408,6 +429,7 @@
             <w:r>
               <w:rPr>
                 <w:rFonts w:ascii="Times New Roman" w:hAnsi="Times New Roman"/>
+                <w:color w:val="000000"/>
                 <w:sz w:val="22"/>
               </w:rPr>
               <w:t>Name of the Student</w:t>
@@ -422,6 +444,7 @@
             <w:r>
               <w:rPr>
                 <w:rFonts w:ascii="Times New Roman" w:hAnsi="Times New Roman"/>
+                <w:color w:val="000000"/>
                 <w:sz w:val="22"/>
               </w:rPr>
               <w:t>Sign of Student</w:t>
@@ -438,6 +461,7 @@
             <w:r>
               <w:rPr>
                 <w:rFonts w:ascii="Times New Roman" w:hAnsi="Times New Roman"/>
+                <w:color w:val="000000"/>
                 <w:sz w:val="22"/>
               </w:rPr>
               <w:t>1. Jaykishan Kalariya (92301703102)</w:t>
@@ -452,6 +476,7 @@
             <w:r>
               <w:rPr>
                 <w:rFonts w:ascii="Times New Roman" w:hAnsi="Times New Roman"/>
+                <w:color w:val="000000"/>
                 <w:sz w:val="22"/>
               </w:rPr>
               <w:t>______________________</w:t>
@@ -468,6 +493,7 @@
             <w:r>
               <w:rPr>
                 <w:rFonts w:ascii="Times New Roman" w:hAnsi="Times New Roman"/>
+                <w:color w:val="000000"/>
                 <w:sz w:val="22"/>
               </w:rPr>
               <w:t>2. Maan Kalariya (92301703111)</w:t>
@@ -482,6 +508,7 @@
             <w:r>
               <w:rPr>
                 <w:rFonts w:ascii="Times New Roman" w:hAnsi="Times New Roman"/>
+                <w:color w:val="000000"/>
                 <w:sz w:val="22"/>
               </w:rPr>
               <w:t>______________________</w:t>
@@ -709,7 +736,7 @@
         <w:tc>
           <w:tcPr>
             <w:tcW w:type="dxa" w:w="1728"/>
-            <w:shd w:fill="E8EEF5"/>
+            <w:shd w:fill="E5E7EB"/>
             <w:tcMar>
               <w:top w:w="140" w:type="dxa"/>
               <w:bottom w:w="140" w:type="dxa"/>
@@ -736,7 +763,7 @@
         <w:tc>
           <w:tcPr>
             <w:tcW w:type="dxa" w:w="6480"/>
-            <w:shd w:fill="E8EEF5"/>
+            <w:shd w:fill="E5E7EB"/>
             <w:tcMar>
               <w:top w:w="140" w:type="dxa"/>
               <w:bottom w:w="140" w:type="dxa"/>
@@ -763,7 +790,7 @@
         <w:tc>
           <w:tcPr>
             <w:tcW w:type="dxa" w:w="1152"/>
-            <w:shd w:fill="E8EEF5"/>
+            <w:shd w:fill="E5E7EB"/>
             <w:tcMar>
               <w:top w:w="140" w:type="dxa"/>
               <w:bottom w:w="140" w:type="dxa"/>
@@ -872,7 +899,7 @@
         <w:tc>
           <w:tcPr>
             <w:tcW w:type="dxa" w:w="1728"/>
-            <w:shd w:fill="FBFBFC"/>
+            <w:shd w:fill="F9FAFB"/>
             <w:tcMar>
               <w:top w:w="120" w:type="dxa"/>
               <w:bottom w:w="120" w:type="dxa"/>
@@ -898,7 +925,7 @@
         <w:tc>
           <w:tcPr>
             <w:tcW w:type="dxa" w:w="6480"/>
-            <w:shd w:fill="FBFBFC"/>
+            <w:shd w:fill="F9FAFB"/>
             <w:tcMar>
               <w:top w:w="120" w:type="dxa"/>
               <w:bottom w:w="120" w:type="dxa"/>
@@ -924,7 +951,7 @@
         <w:tc>
           <w:tcPr>
             <w:tcW w:type="dxa" w:w="1152"/>
-            <w:shd w:fill="FBFBFC"/>
+            <w:shd w:fill="F9FAFB"/>
             <w:tcMar>
               <w:top w:w="120" w:type="dxa"/>
               <w:bottom w:w="120" w:type="dxa"/>
@@ -1032,7 +1059,7 @@
         <w:tc>
           <w:tcPr>
             <w:tcW w:type="dxa" w:w="1728"/>
-            <w:shd w:fill="FBFBFC"/>
+            <w:shd w:fill="F9FAFB"/>
             <w:tcMar>
               <w:top w:w="120" w:type="dxa"/>
               <w:bottom w:w="120" w:type="dxa"/>
@@ -1058,7 +1085,7 @@
         <w:tc>
           <w:tcPr>
             <w:tcW w:type="dxa" w:w="6480"/>
-            <w:shd w:fill="FBFBFC"/>
+            <w:shd w:fill="F9FAFB"/>
             <w:tcMar>
               <w:top w:w="120" w:type="dxa"/>
               <w:bottom w:w="120" w:type="dxa"/>
@@ -1084,7 +1111,7 @@
         <w:tc>
           <w:tcPr>
             <w:tcW w:type="dxa" w:w="1152"/>
-            <w:shd w:fill="FBFBFC"/>
+            <w:shd w:fill="F9FAFB"/>
             <w:tcMar>
               <w:top w:w="120" w:type="dxa"/>
               <w:bottom w:w="120" w:type="dxa"/>
@@ -1192,7 +1219,7 @@
         <w:tc>
           <w:tcPr>
             <w:tcW w:type="dxa" w:w="1728"/>
-            <w:shd w:fill="FBFBFC"/>
+            <w:shd w:fill="F9FAFB"/>
             <w:tcMar>
               <w:top w:w="120" w:type="dxa"/>
               <w:bottom w:w="120" w:type="dxa"/>
@@ -1218,7 +1245,7 @@
         <w:tc>
           <w:tcPr>
             <w:tcW w:type="dxa" w:w="6480"/>
-            <w:shd w:fill="FBFBFC"/>
+            <w:shd w:fill="F9FAFB"/>
             <w:tcMar>
               <w:top w:w="120" w:type="dxa"/>
               <w:bottom w:w="120" w:type="dxa"/>
@@ -1244,7 +1271,7 @@
         <w:tc>
           <w:tcPr>
             <w:tcW w:type="dxa" w:w="1152"/>
-            <w:shd w:fill="FBFBFC"/>
+            <w:shd w:fill="F9FAFB"/>
             <w:tcMar>
               <w:top w:w="120" w:type="dxa"/>
               <w:bottom w:w="120" w:type="dxa"/>
@@ -1352,7 +1379,7 @@
         <w:tc>
           <w:tcPr>
             <w:tcW w:type="dxa" w:w="1728"/>
-            <w:shd w:fill="FBFBFC"/>
+            <w:shd w:fill="F9FAFB"/>
             <w:tcMar>
               <w:top w:w="120" w:type="dxa"/>
               <w:bottom w:w="120" w:type="dxa"/>
@@ -1378,7 +1405,7 @@
         <w:tc>
           <w:tcPr>
             <w:tcW w:type="dxa" w:w="6480"/>
-            <w:shd w:fill="FBFBFC"/>
+            <w:shd w:fill="F9FAFB"/>
             <w:tcMar>
               <w:top w:w="120" w:type="dxa"/>
               <w:bottom w:w="120" w:type="dxa"/>
@@ -1404,7 +1431,7 @@
         <w:tc>
           <w:tcPr>
             <w:tcW w:type="dxa" w:w="1152"/>
-            <w:shd w:fill="FBFBFC"/>
+            <w:shd w:fill="F9FAFB"/>
             <w:tcMar>
               <w:top w:w="120" w:type="dxa"/>
               <w:bottom w:w="120" w:type="dxa"/>
@@ -1512,7 +1539,7 @@
         <w:tc>
           <w:tcPr>
             <w:tcW w:type="dxa" w:w="1728"/>
-            <w:shd w:fill="FBFBFC"/>
+            <w:shd w:fill="F9FAFB"/>
             <w:tcMar>
               <w:top w:w="120" w:type="dxa"/>
               <w:bottom w:w="120" w:type="dxa"/>
@@ -1538,7 +1565,7 @@
         <w:tc>
           <w:tcPr>
             <w:tcW w:type="dxa" w:w="6480"/>
-            <w:shd w:fill="FBFBFC"/>
+            <w:shd w:fill="F9FAFB"/>
             <w:tcMar>
               <w:top w:w="120" w:type="dxa"/>
               <w:bottom w:w="120" w:type="dxa"/>
@@ -1564,7 +1591,7 @@
         <w:tc>
           <w:tcPr>
             <w:tcW w:type="dxa" w:w="1152"/>
-            <w:shd w:fill="FBFBFC"/>
+            <w:shd w:fill="F9FAFB"/>
             <w:tcMar>
               <w:top w:w="120" w:type="dxa"/>
               <w:bottom w:w="120" w:type="dxa"/>
@@ -1711,7 +1738,7 @@
         <w:tc>
           <w:tcPr>
             <w:tcW w:type="dxa" w:w="1728"/>
-            <w:shd w:fill="E8EEF5"/>
+            <w:shd w:fill="E5E7EB"/>
             <w:tcMar>
               <w:top w:w="140" w:type="dxa"/>
               <w:bottom w:w="140" w:type="dxa"/>
@@ -1738,7 +1765,7 @@
         <w:tc>
           <w:tcPr>
             <w:tcW w:type="dxa" w:w="6480"/>
-            <w:shd w:fill="E8EEF5"/>
+            <w:shd w:fill="E5E7EB"/>
             <w:tcMar>
               <w:top w:w="140" w:type="dxa"/>
               <w:bottom w:w="140" w:type="dxa"/>
@@ -1765,7 +1792,7 @@
         <w:tc>
           <w:tcPr>
             <w:tcW w:type="dxa" w:w="1152"/>
-            <w:shd w:fill="E8EEF5"/>
+            <w:shd w:fill="E5E7EB"/>
             <w:tcMar>
               <w:top w:w="140" w:type="dxa"/>
               <w:bottom w:w="140" w:type="dxa"/>
@@ -1874,7 +1901,7 @@
         <w:tc>
           <w:tcPr>
             <w:tcW w:type="dxa" w:w="1728"/>
-            <w:shd w:fill="FBFBFC"/>
+            <w:shd w:fill="F9FAFB"/>
             <w:tcMar>
               <w:top w:w="120" w:type="dxa"/>
               <w:bottom w:w="120" w:type="dxa"/>
@@ -1900,7 +1927,7 @@
         <w:tc>
           <w:tcPr>
             <w:tcW w:type="dxa" w:w="6480"/>
-            <w:shd w:fill="FBFBFC"/>
+            <w:shd w:fill="F9FAFB"/>
             <w:tcMar>
               <w:top w:w="120" w:type="dxa"/>
               <w:bottom w:w="120" w:type="dxa"/>
@@ -1926,7 +1953,7 @@
         <w:tc>
           <w:tcPr>
             <w:tcW w:type="dxa" w:w="1152"/>
-            <w:shd w:fill="FBFBFC"/>
+            <w:shd w:fill="F9FAFB"/>
             <w:tcMar>
               <w:top w:w="120" w:type="dxa"/>
               <w:bottom w:w="120" w:type="dxa"/>
@@ -2034,7 +2061,7 @@
         <w:tc>
           <w:tcPr>
             <w:tcW w:type="dxa" w:w="1728"/>
-            <w:shd w:fill="FBFBFC"/>
+            <w:shd w:fill="F9FAFB"/>
             <w:tcMar>
               <w:top w:w="120" w:type="dxa"/>
               <w:bottom w:w="120" w:type="dxa"/>
@@ -2060,7 +2087,7 @@
         <w:tc>
           <w:tcPr>
             <w:tcW w:type="dxa" w:w="6480"/>
-            <w:shd w:fill="FBFBFC"/>
+            <w:shd w:fill="F9FAFB"/>
             <w:tcMar>
               <w:top w:w="120" w:type="dxa"/>
               <w:bottom w:w="120" w:type="dxa"/>
@@ -2086,7 +2113,7 @@
         <w:tc>
           <w:tcPr>
             <w:tcW w:type="dxa" w:w="1152"/>
-            <w:shd w:fill="FBFBFC"/>
+            <w:shd w:fill="F9FAFB"/>
             <w:tcMar>
               <w:top w:w="120" w:type="dxa"/>
               <w:bottom w:w="120" w:type="dxa"/>
@@ -2194,7 +2221,7 @@
         <w:tc>
           <w:tcPr>
             <w:tcW w:type="dxa" w:w="1728"/>
-            <w:shd w:fill="FBFBFC"/>
+            <w:shd w:fill="F9FAFB"/>
             <w:tcMar>
               <w:top w:w="120" w:type="dxa"/>
               <w:bottom w:w="120" w:type="dxa"/>
@@ -2220,7 +2247,7 @@
         <w:tc>
           <w:tcPr>
             <w:tcW w:type="dxa" w:w="6480"/>
-            <w:shd w:fill="FBFBFC"/>
+            <w:shd w:fill="F9FAFB"/>
             <w:tcMar>
               <w:top w:w="120" w:type="dxa"/>
               <w:bottom w:w="120" w:type="dxa"/>
@@ -2246,7 +2273,7 @@
         <w:tc>
           <w:tcPr>
             <w:tcW w:type="dxa" w:w="1152"/>
-            <w:shd w:fill="FBFBFC"/>
+            <w:shd w:fill="F9FAFB"/>
             <w:tcMar>
               <w:top w:w="120" w:type="dxa"/>
               <w:bottom w:w="120" w:type="dxa"/>
@@ -2354,7 +2381,7 @@
         <w:tc>
           <w:tcPr>
             <w:tcW w:type="dxa" w:w="1728"/>
-            <w:shd w:fill="FBFBFC"/>
+            <w:shd w:fill="F9FAFB"/>
             <w:tcMar>
               <w:top w:w="120" w:type="dxa"/>
               <w:bottom w:w="120" w:type="dxa"/>
@@ -2380,7 +2407,7 @@
         <w:tc>
           <w:tcPr>
             <w:tcW w:type="dxa" w:w="6480"/>
-            <w:shd w:fill="FBFBFC"/>
+            <w:shd w:fill="F9FAFB"/>
             <w:tcMar>
               <w:top w:w="120" w:type="dxa"/>
               <w:bottom w:w="120" w:type="dxa"/>
@@ -2406,7 +2433,7 @@
         <w:tc>
           <w:tcPr>
             <w:tcW w:type="dxa" w:w="1152"/>
-            <w:shd w:fill="FBFBFC"/>
+            <w:shd w:fill="F9FAFB"/>
             <w:tcMar>
               <w:top w:w="120" w:type="dxa"/>
               <w:bottom w:w="120" w:type="dxa"/>
@@ -2514,7 +2541,7 @@
         <w:tc>
           <w:tcPr>
             <w:tcW w:type="dxa" w:w="1728"/>
-            <w:shd w:fill="FBFBFC"/>
+            <w:shd w:fill="F9FAFB"/>
             <w:tcMar>
               <w:top w:w="120" w:type="dxa"/>
               <w:bottom w:w="120" w:type="dxa"/>
@@ -2540,7 +2567,7 @@
         <w:tc>
           <w:tcPr>
             <w:tcW w:type="dxa" w:w="6480"/>
-            <w:shd w:fill="FBFBFC"/>
+            <w:shd w:fill="F9FAFB"/>
             <w:tcMar>
               <w:top w:w="120" w:type="dxa"/>
               <w:bottom w:w="120" w:type="dxa"/>
@@ -2566,7 +2593,7 @@
         <w:tc>
           <w:tcPr>
             <w:tcW w:type="dxa" w:w="1152"/>
-            <w:shd w:fill="FBFBFC"/>
+            <w:shd w:fill="F9FAFB"/>
             <w:tcMar>
               <w:top w:w="120" w:type="dxa"/>
               <w:bottom w:w="120" w:type="dxa"/>
@@ -2674,7 +2701,7 @@
         <w:tc>
           <w:tcPr>
             <w:tcW w:type="dxa" w:w="1728"/>
-            <w:shd w:fill="FBFBFC"/>
+            <w:shd w:fill="F9FAFB"/>
             <w:tcMar>
               <w:top w:w="120" w:type="dxa"/>
               <w:bottom w:w="120" w:type="dxa"/>
@@ -2700,7 +2727,7 @@
         <w:tc>
           <w:tcPr>
             <w:tcW w:type="dxa" w:w="6480"/>
-            <w:shd w:fill="FBFBFC"/>
+            <w:shd w:fill="F9FAFB"/>
             <w:tcMar>
               <w:top w:w="120" w:type="dxa"/>
               <w:bottom w:w="120" w:type="dxa"/>
@@ -2726,7 +2753,7 @@
         <w:tc>
           <w:tcPr>
             <w:tcW w:type="dxa" w:w="1152"/>
-            <w:shd w:fill="FBFBFC"/>
+            <w:shd w:fill="F9FAFB"/>
             <w:tcMar>
               <w:top w:w="120" w:type="dxa"/>
               <w:bottom w:w="120" w:type="dxa"/>
@@ -2792,7 +2819,7 @@
         <w:tc>
           <w:tcPr>
             <w:tcW w:type="dxa" w:w="2880"/>
-            <w:shd w:fill="E8EEF5"/>
+            <w:shd w:fill="E5E7EB"/>
             <w:tcMar>
               <w:top w:w="140" w:type="dxa"/>
               <w:bottom w:w="140" w:type="dxa"/>
@@ -2819,7 +2846,7 @@
         <w:tc>
           <w:tcPr>
             <w:tcW w:type="dxa" w:w="6480"/>
-            <w:shd w:fill="E8EEF5"/>
+            <w:shd w:fill="E5E7EB"/>
             <w:tcMar>
               <w:top w:w="140" w:type="dxa"/>
               <w:bottom w:w="140" w:type="dxa"/>
@@ -2902,7 +2929,7 @@
         <w:tc>
           <w:tcPr>
             <w:tcW w:type="dxa" w:w="2880"/>
-            <w:shd w:fill="FBFBFC"/>
+            <w:shd w:fill="F9FAFB"/>
             <w:tcMar>
               <w:top w:w="120" w:type="dxa"/>
               <w:bottom w:w="120" w:type="dxa"/>
@@ -2928,7 +2955,7 @@
         <w:tc>
           <w:tcPr>
             <w:tcW w:type="dxa" w:w="6480"/>
-            <w:shd w:fill="FBFBFC"/>
+            <w:shd w:fill="F9FAFB"/>
             <w:tcMar>
               <w:top w:w="120" w:type="dxa"/>
               <w:bottom w:w="120" w:type="dxa"/>
@@ -3010,7 +3037,7 @@
         <w:tc>
           <w:tcPr>
             <w:tcW w:type="dxa" w:w="2880"/>
-            <w:shd w:fill="FBFBFC"/>
+            <w:shd w:fill="F9FAFB"/>
             <w:tcMar>
               <w:top w:w="120" w:type="dxa"/>
               <w:bottom w:w="120" w:type="dxa"/>
@@ -3036,7 +3063,7 @@
         <w:tc>
           <w:tcPr>
             <w:tcW w:type="dxa" w:w="6480"/>
-            <w:shd w:fill="FBFBFC"/>
+            <w:shd w:fill="F9FAFB"/>
             <w:tcMar>
               <w:top w:w="120" w:type="dxa"/>
               <w:bottom w:w="120" w:type="dxa"/>
@@ -3118,7 +3145,7 @@
         <w:tc>
           <w:tcPr>
             <w:tcW w:type="dxa" w:w="2880"/>
-            <w:shd w:fill="FBFBFC"/>
+            <w:shd w:fill="F9FAFB"/>
             <w:tcMar>
               <w:top w:w="120" w:type="dxa"/>
               <w:bottom w:w="120" w:type="dxa"/>
@@ -3144,7 +3171,7 @@
         <w:tc>
           <w:tcPr>
             <w:tcW w:type="dxa" w:w="6480"/>
-            <w:shd w:fill="FBFBFC"/>
+            <w:shd w:fill="F9FAFB"/>
             <w:tcMar>
               <w:top w:w="120" w:type="dxa"/>
               <w:bottom w:w="120" w:type="dxa"/>
@@ -3226,7 +3253,7 @@
         <w:tc>
           <w:tcPr>
             <w:tcW w:type="dxa" w:w="2880"/>
-            <w:shd w:fill="FBFBFC"/>
+            <w:shd w:fill="F9FAFB"/>
             <w:tcMar>
               <w:top w:w="120" w:type="dxa"/>
               <w:bottom w:w="120" w:type="dxa"/>
@@ -3252,7 +3279,7 @@
         <w:tc>
           <w:tcPr>
             <w:tcW w:type="dxa" w:w="6480"/>
-            <w:shd w:fill="FBFBFC"/>
+            <w:shd w:fill="F9FAFB"/>
             <w:tcMar>
               <w:top w:w="120" w:type="dxa"/>
               <w:bottom w:w="120" w:type="dxa"/>
@@ -3334,7 +3361,7 @@
         <w:tc>
           <w:tcPr>
             <w:tcW w:type="dxa" w:w="2880"/>
-            <w:shd w:fill="FBFBFC"/>
+            <w:shd w:fill="F9FAFB"/>
             <w:tcMar>
               <w:top w:w="120" w:type="dxa"/>
               <w:bottom w:w="120" w:type="dxa"/>
@@ -3360,7 +3387,7 @@
         <w:tc>
           <w:tcPr>
             <w:tcW w:type="dxa" w:w="6480"/>
-            <w:shd w:fill="FBFBFC"/>
+            <w:shd w:fill="F9FAFB"/>
             <w:tcMar>
               <w:top w:w="120" w:type="dxa"/>
               <w:bottom w:w="120" w:type="dxa"/>
@@ -3442,7 +3469,7 @@
         <w:tc>
           <w:tcPr>
             <w:tcW w:type="dxa" w:w="2880"/>
-            <w:shd w:fill="FBFBFC"/>
+            <w:shd w:fill="F9FAFB"/>
             <w:tcMar>
               <w:top w:w="120" w:type="dxa"/>
               <w:bottom w:w="120" w:type="dxa"/>
@@ -3468,7 +3495,7 @@
         <w:tc>
           <w:tcPr>
             <w:tcW w:type="dxa" w:w="6480"/>
-            <w:shd w:fill="FBFBFC"/>
+            <w:shd w:fill="F9FAFB"/>
             <w:tcMar>
               <w:top w:w="120" w:type="dxa"/>
               <w:bottom w:w="120" w:type="dxa"/>
@@ -3550,7 +3577,7 @@
         <w:tc>
           <w:tcPr>
             <w:tcW w:type="dxa" w:w="2880"/>
-            <w:shd w:fill="FBFBFC"/>
+            <w:shd w:fill="F9FAFB"/>
             <w:tcMar>
               <w:top w:w="120" w:type="dxa"/>
               <w:bottom w:w="120" w:type="dxa"/>
@@ -3576,7 +3603,7 @@
         <w:tc>
           <w:tcPr>
             <w:tcW w:type="dxa" w:w="6480"/>
-            <w:shd w:fill="FBFBFC"/>
+            <w:shd w:fill="F9FAFB"/>
             <w:tcMar>
               <w:top w:w="120" w:type="dxa"/>
               <w:bottom w:w="120" w:type="dxa"/>
@@ -3658,7 +3685,7 @@
         <w:tc>
           <w:tcPr>
             <w:tcW w:type="dxa" w:w="2880"/>
-            <w:shd w:fill="FBFBFC"/>
+            <w:shd w:fill="F9FAFB"/>
             <w:tcMar>
               <w:top w:w="120" w:type="dxa"/>
               <w:bottom w:w="120" w:type="dxa"/>
@@ -3684,7 +3711,7 @@
         <w:tc>
           <w:tcPr>
             <w:tcW w:type="dxa" w:w="6480"/>
-            <w:shd w:fill="FBFBFC"/>
+            <w:shd w:fill="F9FAFB"/>
             <w:tcMar>
               <w:top w:w="120" w:type="dxa"/>
               <w:bottom w:w="120" w:type="dxa"/>
@@ -3766,7 +3793,7 @@
         <w:tc>
           <w:tcPr>
             <w:tcW w:type="dxa" w:w="2880"/>
-            <w:shd w:fill="FBFBFC"/>
+            <w:shd w:fill="F9FAFB"/>
             <w:tcMar>
               <w:top w:w="120" w:type="dxa"/>
               <w:bottom w:w="120" w:type="dxa"/>
@@ -3792,7 +3819,7 @@
         <w:tc>
           <w:tcPr>
             <w:tcW w:type="dxa" w:w="6480"/>
-            <w:shd w:fill="FBFBFC"/>
+            <w:shd w:fill="F9FAFB"/>
             <w:tcMar>
               <w:top w:w="120" w:type="dxa"/>
               <w:bottom w:w="120" w:type="dxa"/>
@@ -3874,7 +3901,7 @@
         <w:tc>
           <w:tcPr>
             <w:tcW w:type="dxa" w:w="2880"/>
-            <w:shd w:fill="FBFBFC"/>
+            <w:shd w:fill="F9FAFB"/>
             <w:tcMar>
               <w:top w:w="120" w:type="dxa"/>
               <w:bottom w:w="120" w:type="dxa"/>
@@ -3900,7 +3927,7 @@
         <w:tc>
           <w:tcPr>
             <w:tcW w:type="dxa" w:w="6480"/>
-            <w:shd w:fill="FBFBFC"/>
+            <w:shd w:fill="F9FAFB"/>
             <w:tcMar>
               <w:top w:w="120" w:type="dxa"/>
               <w:bottom w:w="120" w:type="dxa"/>
@@ -3982,7 +4009,7 @@
         <w:tc>
           <w:tcPr>
             <w:tcW w:type="dxa" w:w="2880"/>
-            <w:shd w:fill="FBFBFC"/>
+            <w:shd w:fill="F9FAFB"/>
             <w:tcMar>
               <w:top w:w="120" w:type="dxa"/>
               <w:bottom w:w="120" w:type="dxa"/>
@@ -4008,7 +4035,7 @@
         <w:tc>
           <w:tcPr>
             <w:tcW w:type="dxa" w:w="6480"/>
-            <w:shd w:fill="FBFBFC"/>
+            <w:shd w:fill="F9FAFB"/>
             <w:tcMar>
               <w:top w:w="120" w:type="dxa"/>
               <w:bottom w:w="120" w:type="dxa"/>
@@ -4090,7 +4117,7 @@
         <w:tc>
           <w:tcPr>
             <w:tcW w:type="dxa" w:w="2880"/>
-            <w:shd w:fill="FBFBFC"/>
+            <w:shd w:fill="F9FAFB"/>
             <w:tcMar>
               <w:top w:w="120" w:type="dxa"/>
               <w:bottom w:w="120" w:type="dxa"/>
@@ -4116,7 +4143,7 @@
         <w:tc>
           <w:tcPr>
             <w:tcW w:type="dxa" w:w="6480"/>
-            <w:shd w:fill="FBFBFC"/>
+            <w:shd w:fill="F9FAFB"/>
             <w:tcMar>
               <w:top w:w="120" w:type="dxa"/>
               <w:bottom w:w="120" w:type="dxa"/>
@@ -4198,7 +4225,7 @@
         <w:tc>
           <w:tcPr>
             <w:tcW w:type="dxa" w:w="2880"/>
-            <w:shd w:fill="FBFBFC"/>
+            <w:shd w:fill="F9FAFB"/>
             <w:tcMar>
               <w:top w:w="120" w:type="dxa"/>
               <w:bottom w:w="120" w:type="dxa"/>
@@ -4224,7 +4251,7 @@
         <w:tc>
           <w:tcPr>
             <w:tcW w:type="dxa" w:w="6480"/>
-            <w:shd w:fill="FBFBFC"/>
+            <w:shd w:fill="F9FAFB"/>
             <w:tcMar>
               <w:top w:w="120" w:type="dxa"/>
               <w:bottom w:w="120" w:type="dxa"/>
@@ -4306,7 +4333,7 @@
         <w:tc>
           <w:tcPr>
             <w:tcW w:type="dxa" w:w="2880"/>
-            <w:shd w:fill="FBFBFC"/>
+            <w:shd w:fill="F9FAFB"/>
             <w:tcMar>
               <w:top w:w="120" w:type="dxa"/>
               <w:bottom w:w="120" w:type="dxa"/>
@@ -4332,7 +4359,7 @@
         <w:tc>
           <w:tcPr>
             <w:tcW w:type="dxa" w:w="6480"/>
-            <w:shd w:fill="FBFBFC"/>
+            <w:shd w:fill="F9FAFB"/>
             <w:tcMar>
               <w:top w:w="120" w:type="dxa"/>
               <w:bottom w:w="120" w:type="dxa"/>
@@ -4996,7 +5023,7 @@
         <w:tc>
           <w:tcPr>
             <w:tcW w:type="dxa" w:w="1152"/>
-            <w:shd w:fill="E8EEF5"/>
+            <w:shd w:fill="E5E7EB"/>
             <w:tcMar>
               <w:top w:w="140" w:type="dxa"/>
               <w:bottom w:w="140" w:type="dxa"/>
@@ -5023,7 +5050,7 @@
         <w:tc>
           <w:tcPr>
             <w:tcW w:type="dxa" w:w="2160"/>
-            <w:shd w:fill="E8EEF5"/>
+            <w:shd w:fill="E5E7EB"/>
             <w:tcMar>
               <w:top w:w="140" w:type="dxa"/>
               <w:bottom w:w="140" w:type="dxa"/>
@@ -5050,7 +5077,7 @@
         <w:tc>
           <w:tcPr>
             <w:tcW w:type="dxa" w:w="2592"/>
-            <w:shd w:fill="E8EEF5"/>
+            <w:shd w:fill="E5E7EB"/>
             <w:tcMar>
               <w:top w:w="140" w:type="dxa"/>
               <w:bottom w:w="140" w:type="dxa"/>
@@ -5077,7 +5104,7 @@
         <w:tc>
           <w:tcPr>
             <w:tcW w:type="dxa" w:w="1872"/>
-            <w:shd w:fill="E8EEF5"/>
+            <w:shd w:fill="E5E7EB"/>
             <w:tcMar>
               <w:top w:w="140" w:type="dxa"/>
               <w:bottom w:w="140" w:type="dxa"/>
@@ -5104,7 +5131,7 @@
         <w:tc>
           <w:tcPr>
             <w:tcW w:type="dxa" w:w="1584"/>
-            <w:shd w:fill="E8EEF5"/>
+            <w:shd w:fill="E5E7EB"/>
             <w:tcMar>
               <w:top w:w="140" w:type="dxa"/>
               <w:bottom w:w="140" w:type="dxa"/>
@@ -5131,7 +5158,7 @@
         <w:tc>
           <w:tcPr>
             <w:tcW w:type="dxa" w:w="3600"/>
-            <w:shd w:fill="E8EEF5"/>
+            <w:shd w:fill="E5E7EB"/>
             <w:tcMar>
               <w:top w:w="140" w:type="dxa"/>
               <w:bottom w:w="140" w:type="dxa"/>
@@ -5318,7 +5345,7 @@
         <w:tc>
           <w:tcPr>
             <w:tcW w:type="dxa" w:w="1152"/>
-            <w:shd w:fill="FBFBFC"/>
+            <w:shd w:fill="F9FAFB"/>
             <w:tcMar>
               <w:top w:w="120" w:type="dxa"/>
               <w:bottom w:w="120" w:type="dxa"/>
@@ -5344,7 +5371,7 @@
         <w:tc>
           <w:tcPr>
             <w:tcW w:type="dxa" w:w="2160"/>
-            <w:shd w:fill="FBFBFC"/>
+            <w:shd w:fill="F9FAFB"/>
             <w:tcMar>
               <w:top w:w="120" w:type="dxa"/>
               <w:bottom w:w="120" w:type="dxa"/>
@@ -5370,7 +5397,7 @@
         <w:tc>
           <w:tcPr>
             <w:tcW w:type="dxa" w:w="2592"/>
-            <w:shd w:fill="FBFBFC"/>
+            <w:shd w:fill="F9FAFB"/>
             <w:tcMar>
               <w:top w:w="120" w:type="dxa"/>
               <w:bottom w:w="120" w:type="dxa"/>
@@ -5396,7 +5423,7 @@
         <w:tc>
           <w:tcPr>
             <w:tcW w:type="dxa" w:w="1872"/>
-            <w:shd w:fill="FBFBFC"/>
+            <w:shd w:fill="F9FAFB"/>
             <w:tcMar>
               <w:top w:w="120" w:type="dxa"/>
               <w:bottom w:w="120" w:type="dxa"/>
@@ -5422,7 +5449,7 @@
         <w:tc>
           <w:tcPr>
             <w:tcW w:type="dxa" w:w="1584"/>
-            <w:shd w:fill="FBFBFC"/>
+            <w:shd w:fill="F9FAFB"/>
             <w:tcMar>
               <w:top w:w="120" w:type="dxa"/>
               <w:bottom w:w="120" w:type="dxa"/>
@@ -5448,7 +5475,7 @@
         <w:tc>
           <w:tcPr>
             <w:tcW w:type="dxa" w:w="3600"/>
-            <w:shd w:fill="FBFBFC"/>
+            <w:shd w:fill="F9FAFB"/>
             <w:tcMar>
               <w:top w:w="120" w:type="dxa"/>
               <w:bottom w:w="120" w:type="dxa"/>
@@ -5634,7 +5661,7 @@
         <w:tc>
           <w:tcPr>
             <w:tcW w:type="dxa" w:w="1152"/>
-            <w:shd w:fill="FBFBFC"/>
+            <w:shd w:fill="F9FAFB"/>
             <w:tcMar>
               <w:top w:w="120" w:type="dxa"/>
               <w:bottom w:w="120" w:type="dxa"/>
@@ -5660,7 +5687,7 @@
         <w:tc>
           <w:tcPr>
             <w:tcW w:type="dxa" w:w="2160"/>
-            <w:shd w:fill="FBFBFC"/>
+            <w:shd w:fill="F9FAFB"/>
             <w:tcMar>
               <w:top w:w="120" w:type="dxa"/>
               <w:bottom w:w="120" w:type="dxa"/>
@@ -5686,7 +5713,7 @@
         <w:tc>
           <w:tcPr>
             <w:tcW w:type="dxa" w:w="2592"/>
-            <w:shd w:fill="FBFBFC"/>
+            <w:shd w:fill="F9FAFB"/>
             <w:tcMar>
               <w:top w:w="120" w:type="dxa"/>
               <w:bottom w:w="120" w:type="dxa"/>
@@ -5712,7 +5739,7 @@
         <w:tc>
           <w:tcPr>
             <w:tcW w:type="dxa" w:w="1872"/>
-            <w:shd w:fill="FBFBFC"/>
+            <w:shd w:fill="F9FAFB"/>
             <w:tcMar>
               <w:top w:w="120" w:type="dxa"/>
               <w:bottom w:w="120" w:type="dxa"/>
@@ -5738,7 +5765,7 @@
         <w:tc>
           <w:tcPr>
             <w:tcW w:type="dxa" w:w="1584"/>
-            <w:shd w:fill="FBFBFC"/>
+            <w:shd w:fill="F9FAFB"/>
             <w:tcMar>
               <w:top w:w="120" w:type="dxa"/>
               <w:bottom w:w="120" w:type="dxa"/>
@@ -5764,7 +5791,7 @@
         <w:tc>
           <w:tcPr>
             <w:tcW w:type="dxa" w:w="3600"/>
-            <w:shd w:fill="FBFBFC"/>
+            <w:shd w:fill="F9FAFB"/>
             <w:tcMar>
               <w:top w:w="120" w:type="dxa"/>
               <w:bottom w:w="120" w:type="dxa"/>
@@ -5950,7 +5977,7 @@
         <w:tc>
           <w:tcPr>
             <w:tcW w:type="dxa" w:w="1152"/>
-            <w:shd w:fill="FBFBFC"/>
+            <w:shd w:fill="F9FAFB"/>
             <w:tcMar>
               <w:top w:w="120" w:type="dxa"/>
               <w:bottom w:w="120" w:type="dxa"/>
@@ -5976,7 +6003,7 @@
         <w:tc>
           <w:tcPr>
             <w:tcW w:type="dxa" w:w="2160"/>
-            <w:shd w:fill="FBFBFC"/>
+            <w:shd w:fill="F9FAFB"/>
             <w:tcMar>
               <w:top w:w="120" w:type="dxa"/>
               <w:bottom w:w="120" w:type="dxa"/>
@@ -6002,7 +6029,7 @@
         <w:tc>
           <w:tcPr>
             <w:tcW w:type="dxa" w:w="2592"/>
-            <w:shd w:fill="FBFBFC"/>
+            <w:shd w:fill="F9FAFB"/>
             <w:tcMar>
               <w:top w:w="120" w:type="dxa"/>
               <w:bottom w:w="120" w:type="dxa"/>
@@ -6028,7 +6055,7 @@
         <w:tc>
           <w:tcPr>
             <w:tcW w:type="dxa" w:w="1872"/>
-            <w:shd w:fill="FBFBFC"/>
+            <w:shd w:fill="F9FAFB"/>
             <w:tcMar>
               <w:top w:w="120" w:type="dxa"/>
               <w:bottom w:w="120" w:type="dxa"/>
@@ -6054,7 +6081,7 @@
         <w:tc>
           <w:tcPr>
             <w:tcW w:type="dxa" w:w="1584"/>
-            <w:shd w:fill="FBFBFC"/>
+            <w:shd w:fill="F9FAFB"/>
             <w:tcMar>
               <w:top w:w="120" w:type="dxa"/>
               <w:bottom w:w="120" w:type="dxa"/>
@@ -6080,7 +6107,7 @@
         <w:tc>
           <w:tcPr>
             <w:tcW w:type="dxa" w:w="3600"/>
-            <w:shd w:fill="FBFBFC"/>
+            <w:shd w:fill="F9FAFB"/>
             <w:tcMar>
               <w:top w:w="120" w:type="dxa"/>
               <w:bottom w:w="120" w:type="dxa"/>
@@ -6206,7 +6233,7 @@
           <w:rFonts w:ascii="Times New Roman" w:hAnsi="Times New Roman"/>
           <w:b/>
           <w:i/>
-          <w:color w:val="323232"/>
+          <w:color w:val="000000"/>
           <w:sz w:val="22"/>
         </w:rPr>
         <w:t>Fig. 1.1: Agile Development Approach Flowchart (7-Phase Lifecycle)</w:t>
@@ -6259,7 +6286,7 @@
         <w:tc>
           <w:tcPr>
             <w:tcW w:type="dxa" w:w="1152"/>
-            <w:shd w:fill="E8EEF5"/>
+            <w:shd w:fill="E5E7EB"/>
             <w:tcMar>
               <w:top w:w="140" w:type="dxa"/>
               <w:bottom w:w="140" w:type="dxa"/>
@@ -6286,7 +6313,7 @@
         <w:tc>
           <w:tcPr>
             <w:tcW w:type="dxa" w:w="5040"/>
-            <w:shd w:fill="E8EEF5"/>
+            <w:shd w:fill="E5E7EB"/>
             <w:tcMar>
               <w:top w:w="140" w:type="dxa"/>
               <w:bottom w:w="140" w:type="dxa"/>
@@ -6313,7 +6340,7 @@
         <w:tc>
           <w:tcPr>
             <w:tcW w:type="dxa" w:w="2016"/>
-            <w:shd w:fill="E8EEF5"/>
+            <w:shd w:fill="E5E7EB"/>
             <w:tcMar>
               <w:top w:w="140" w:type="dxa"/>
               <w:bottom w:w="140" w:type="dxa"/>
@@ -6340,7 +6367,7 @@
         <w:tc>
           <w:tcPr>
             <w:tcW w:type="dxa" w:w="1872"/>
-            <w:shd w:fill="E8EEF5"/>
+            <w:shd w:fill="E5E7EB"/>
             <w:tcMar>
               <w:top w:w="140" w:type="dxa"/>
               <w:bottom w:w="140" w:type="dxa"/>
@@ -6475,7 +6502,7 @@
         <w:tc>
           <w:tcPr>
             <w:tcW w:type="dxa" w:w="1152"/>
-            <w:shd w:fill="FBFBFC"/>
+            <w:shd w:fill="F9FAFB"/>
             <w:tcMar>
               <w:top w:w="120" w:type="dxa"/>
               <w:bottom w:w="120" w:type="dxa"/>
@@ -6501,7 +6528,7 @@
         <w:tc>
           <w:tcPr>
             <w:tcW w:type="dxa" w:w="5040"/>
-            <w:shd w:fill="FBFBFC"/>
+            <w:shd w:fill="F9FAFB"/>
             <w:tcMar>
               <w:top w:w="120" w:type="dxa"/>
               <w:bottom w:w="120" w:type="dxa"/>
@@ -6527,7 +6554,7 @@
         <w:tc>
           <w:tcPr>
             <w:tcW w:type="dxa" w:w="2016"/>
-            <w:shd w:fill="FBFBFC"/>
+            <w:shd w:fill="F9FAFB"/>
             <w:tcMar>
               <w:top w:w="120" w:type="dxa"/>
               <w:bottom w:w="120" w:type="dxa"/>
@@ -6553,7 +6580,7 @@
         <w:tc>
           <w:tcPr>
             <w:tcW w:type="dxa" w:w="1872"/>
-            <w:shd w:fill="FBFBFC"/>
+            <w:shd w:fill="F9FAFB"/>
             <w:tcMar>
               <w:top w:w="120" w:type="dxa"/>
               <w:bottom w:w="120" w:type="dxa"/>
@@ -6687,7 +6714,7 @@
         <w:tc>
           <w:tcPr>
             <w:tcW w:type="dxa" w:w="1152"/>
-            <w:shd w:fill="FBFBFC"/>
+            <w:shd w:fill="F9FAFB"/>
             <w:tcMar>
               <w:top w:w="120" w:type="dxa"/>
               <w:bottom w:w="120" w:type="dxa"/>
@@ -6713,7 +6740,7 @@
         <w:tc>
           <w:tcPr>
             <w:tcW w:type="dxa" w:w="5040"/>
-            <w:shd w:fill="FBFBFC"/>
+            <w:shd w:fill="F9FAFB"/>
             <w:tcMar>
               <w:top w:w="120" w:type="dxa"/>
               <w:bottom w:w="120" w:type="dxa"/>
@@ -6739,7 +6766,7 @@
         <w:tc>
           <w:tcPr>
             <w:tcW w:type="dxa" w:w="2016"/>
-            <w:shd w:fill="FBFBFC"/>
+            <w:shd w:fill="F9FAFB"/>
             <w:tcMar>
               <w:top w:w="120" w:type="dxa"/>
               <w:bottom w:w="120" w:type="dxa"/>
@@ -6765,7 +6792,7 @@
         <w:tc>
           <w:tcPr>
             <w:tcW w:type="dxa" w:w="1872"/>
-            <w:shd w:fill="FBFBFC"/>
+            <w:shd w:fill="F9FAFB"/>
             <w:tcMar>
               <w:top w:w="120" w:type="dxa"/>
               <w:bottom w:w="120" w:type="dxa"/>
@@ -6899,7 +6926,7 @@
         <w:tc>
           <w:tcPr>
             <w:tcW w:type="dxa" w:w="1152"/>
-            <w:shd w:fill="FBFBFC"/>
+            <w:shd w:fill="F9FAFB"/>
             <w:tcMar>
               <w:top w:w="120" w:type="dxa"/>
               <w:bottom w:w="120" w:type="dxa"/>
@@ -6925,7 +6952,7 @@
         <w:tc>
           <w:tcPr>
             <w:tcW w:type="dxa" w:w="5040"/>
-            <w:shd w:fill="FBFBFC"/>
+            <w:shd w:fill="F9FAFB"/>
             <w:tcMar>
               <w:top w:w="120" w:type="dxa"/>
               <w:bottom w:w="120" w:type="dxa"/>
@@ -6951,7 +6978,7 @@
         <w:tc>
           <w:tcPr>
             <w:tcW w:type="dxa" w:w="2016"/>
-            <w:shd w:fill="FBFBFC"/>
+            <w:shd w:fill="F9FAFB"/>
             <w:tcMar>
               <w:top w:w="120" w:type="dxa"/>
               <w:bottom w:w="120" w:type="dxa"/>
@@ -6977,7 +7004,7 @@
         <w:tc>
           <w:tcPr>
             <w:tcW w:type="dxa" w:w="1872"/>
-            <w:shd w:fill="FBFBFC"/>
+            <w:shd w:fill="F9FAFB"/>
             <w:tcMar>
               <w:top w:w="120" w:type="dxa"/>
               <w:bottom w:w="120" w:type="dxa"/>
@@ -7274,7 +7301,7 @@
           <w:rFonts w:ascii="Times New Roman" w:hAnsi="Times New Roman"/>
           <w:b/>
           <w:i/>
-          <w:color w:val="323232"/>
+          <w:color w:val="000000"/>
           <w:sz w:val="22"/>
         </w:rPr>
         <w:t>Fig. 2.1: Activity Diagram of the Data Pipeline Process (10-Stage Flow)</w:t>
@@ -7349,7 +7376,7 @@
         <w:tc>
           <w:tcPr>
             <w:tcW w:type="dxa" w:w="2016"/>
-            <w:shd w:fill="E8EEF5"/>
+            <w:shd w:fill="E5E7EB"/>
             <w:tcMar>
               <w:top w:w="140" w:type="dxa"/>
               <w:bottom w:w="140" w:type="dxa"/>
@@ -7376,7 +7403,7 @@
         <w:tc>
           <w:tcPr>
             <w:tcW w:type="dxa" w:w="6192"/>
-            <w:shd w:fill="E8EEF5"/>
+            <w:shd w:fill="E5E7EB"/>
             <w:tcMar>
               <w:top w:w="140" w:type="dxa"/>
               <w:bottom w:w="140" w:type="dxa"/>
@@ -7403,7 +7430,7 @@
         <w:tc>
           <w:tcPr>
             <w:tcW w:type="dxa" w:w="1872"/>
-            <w:shd w:fill="E8EEF5"/>
+            <w:shd w:fill="E5E7EB"/>
             <w:tcMar>
               <w:top w:w="140" w:type="dxa"/>
               <w:bottom w:w="140" w:type="dxa"/>
@@ -7512,7 +7539,7 @@
         <w:tc>
           <w:tcPr>
             <w:tcW w:type="dxa" w:w="2016"/>
-            <w:shd w:fill="FBFBFC"/>
+            <w:shd w:fill="F9FAFB"/>
             <w:tcMar>
               <w:top w:w="120" w:type="dxa"/>
               <w:bottom w:w="120" w:type="dxa"/>
@@ -7538,7 +7565,7 @@
         <w:tc>
           <w:tcPr>
             <w:tcW w:type="dxa" w:w="6192"/>
-            <w:shd w:fill="FBFBFC"/>
+            <w:shd w:fill="F9FAFB"/>
             <w:tcMar>
               <w:top w:w="120" w:type="dxa"/>
               <w:bottom w:w="120" w:type="dxa"/>
@@ -7564,7 +7591,7 @@
         <w:tc>
           <w:tcPr>
             <w:tcW w:type="dxa" w:w="1872"/>
-            <w:shd w:fill="FBFBFC"/>
+            <w:shd w:fill="F9FAFB"/>
             <w:tcMar>
               <w:top w:w="120" w:type="dxa"/>
               <w:bottom w:w="120" w:type="dxa"/>
@@ -7672,7 +7699,7 @@
         <w:tc>
           <w:tcPr>
             <w:tcW w:type="dxa" w:w="2016"/>
-            <w:shd w:fill="FBFBFC"/>
+            <w:shd w:fill="F9FAFB"/>
             <w:tcMar>
               <w:top w:w="120" w:type="dxa"/>
               <w:bottom w:w="120" w:type="dxa"/>
@@ -7698,7 +7725,7 @@
         <w:tc>
           <w:tcPr>
             <w:tcW w:type="dxa" w:w="6192"/>
-            <w:shd w:fill="FBFBFC"/>
+            <w:shd w:fill="F9FAFB"/>
             <w:tcMar>
               <w:top w:w="120" w:type="dxa"/>
               <w:bottom w:w="120" w:type="dxa"/>
@@ -7724,7 +7751,7 @@
         <w:tc>
           <w:tcPr>
             <w:tcW w:type="dxa" w:w="1872"/>
-            <w:shd w:fill="FBFBFC"/>
+            <w:shd w:fill="F9FAFB"/>
             <w:tcMar>
               <w:top w:w="120" w:type="dxa"/>
               <w:bottom w:w="120" w:type="dxa"/>
@@ -7832,7 +7859,7 @@
         <w:tc>
           <w:tcPr>
             <w:tcW w:type="dxa" w:w="2016"/>
-            <w:shd w:fill="FBFBFC"/>
+            <w:shd w:fill="F9FAFB"/>
             <w:tcMar>
               <w:top w:w="120" w:type="dxa"/>
               <w:bottom w:w="120" w:type="dxa"/>
@@ -7858,7 +7885,7 @@
         <w:tc>
           <w:tcPr>
             <w:tcW w:type="dxa" w:w="6192"/>
-            <w:shd w:fill="FBFBFC"/>
+            <w:shd w:fill="F9FAFB"/>
             <w:tcMar>
               <w:top w:w="120" w:type="dxa"/>
               <w:bottom w:w="120" w:type="dxa"/>
@@ -7884,7 +7911,7 @@
         <w:tc>
           <w:tcPr>
             <w:tcW w:type="dxa" w:w="1872"/>
-            <w:shd w:fill="FBFBFC"/>
+            <w:shd w:fill="F9FAFB"/>
             <w:tcMar>
               <w:top w:w="120" w:type="dxa"/>
               <w:bottom w:w="120" w:type="dxa"/>
@@ -7992,7 +8019,7 @@
         <w:tc>
           <w:tcPr>
             <w:tcW w:type="dxa" w:w="2016"/>
-            <w:shd w:fill="FBFBFC"/>
+            <w:shd w:fill="F9FAFB"/>
             <w:tcMar>
               <w:top w:w="120" w:type="dxa"/>
               <w:bottom w:w="120" w:type="dxa"/>
@@ -8018,7 +8045,7 @@
         <w:tc>
           <w:tcPr>
             <w:tcW w:type="dxa" w:w="6192"/>
-            <w:shd w:fill="FBFBFC"/>
+            <w:shd w:fill="F9FAFB"/>
             <w:tcMar>
               <w:top w:w="120" w:type="dxa"/>
               <w:bottom w:w="120" w:type="dxa"/>
@@ -8044,7 +8071,7 @@
         <w:tc>
           <w:tcPr>
             <w:tcW w:type="dxa" w:w="1872"/>
-            <w:shd w:fill="FBFBFC"/>
+            <w:shd w:fill="F9FAFB"/>
             <w:tcMar>
               <w:top w:w="120" w:type="dxa"/>
               <w:bottom w:w="120" w:type="dxa"/>
@@ -8152,7 +8179,7 @@
         <w:tc>
           <w:tcPr>
             <w:tcW w:type="dxa" w:w="2016"/>
-            <w:shd w:fill="FBFBFC"/>
+            <w:shd w:fill="F9FAFB"/>
             <w:tcMar>
               <w:top w:w="120" w:type="dxa"/>
               <w:bottom w:w="120" w:type="dxa"/>
@@ -8178,7 +8205,7 @@
         <w:tc>
           <w:tcPr>
             <w:tcW w:type="dxa" w:w="6192"/>
-            <w:shd w:fill="FBFBFC"/>
+            <w:shd w:fill="F9FAFB"/>
             <w:tcMar>
               <w:top w:w="120" w:type="dxa"/>
               <w:bottom w:w="120" w:type="dxa"/>
@@ -8204,7 +8231,7 @@
         <w:tc>
           <w:tcPr>
             <w:tcW w:type="dxa" w:w="1872"/>
-            <w:shd w:fill="FBFBFC"/>
+            <w:shd w:fill="F9FAFB"/>
             <w:tcMar>
               <w:top w:w="120" w:type="dxa"/>
               <w:bottom w:w="120" w:type="dxa"/>
@@ -8287,7 +8314,7 @@
         <w:tc>
           <w:tcPr>
             <w:tcW w:type="dxa" w:w="2016"/>
-            <w:shd w:fill="E8EEF5"/>
+            <w:shd w:fill="E5E7EB"/>
             <w:tcMar>
               <w:top w:w="140" w:type="dxa"/>
               <w:bottom w:w="140" w:type="dxa"/>
@@ -8314,7 +8341,7 @@
         <w:tc>
           <w:tcPr>
             <w:tcW w:type="dxa" w:w="2016"/>
-            <w:shd w:fill="E8EEF5"/>
+            <w:shd w:fill="E5E7EB"/>
             <w:tcMar>
               <w:top w:w="140" w:type="dxa"/>
               <w:bottom w:w="140" w:type="dxa"/>
@@ -8341,7 +8368,7 @@
         <w:tc>
           <w:tcPr>
             <w:tcW w:type="dxa" w:w="6048"/>
-            <w:shd w:fill="E8EEF5"/>
+            <w:shd w:fill="E5E7EB"/>
             <w:tcMar>
               <w:top w:w="140" w:type="dxa"/>
               <w:bottom w:w="140" w:type="dxa"/>
@@ -8450,7 +8477,7 @@
         <w:tc>
           <w:tcPr>
             <w:tcW w:type="dxa" w:w="2016"/>
-            <w:shd w:fill="FBFBFC"/>
+            <w:shd w:fill="F9FAFB"/>
             <w:tcMar>
               <w:top w:w="120" w:type="dxa"/>
               <w:bottom w:w="120" w:type="dxa"/>
@@ -8476,7 +8503,7 @@
         <w:tc>
           <w:tcPr>
             <w:tcW w:type="dxa" w:w="2016"/>
-            <w:shd w:fill="FBFBFC"/>
+            <w:shd w:fill="F9FAFB"/>
             <w:tcMar>
               <w:top w:w="120" w:type="dxa"/>
               <w:bottom w:w="120" w:type="dxa"/>
@@ -8502,7 +8529,7 @@
         <w:tc>
           <w:tcPr>
             <w:tcW w:type="dxa" w:w="6048"/>
-            <w:shd w:fill="FBFBFC"/>
+            <w:shd w:fill="F9FAFB"/>
             <w:tcMar>
               <w:top w:w="120" w:type="dxa"/>
               <w:bottom w:w="120" w:type="dxa"/>
@@ -8610,7 +8637,7 @@
         <w:tc>
           <w:tcPr>
             <w:tcW w:type="dxa" w:w="2016"/>
-            <w:shd w:fill="FBFBFC"/>
+            <w:shd w:fill="F9FAFB"/>
             <w:tcMar>
               <w:top w:w="120" w:type="dxa"/>
               <w:bottom w:w="120" w:type="dxa"/>
@@ -8636,7 +8663,7 @@
         <w:tc>
           <w:tcPr>
             <w:tcW w:type="dxa" w:w="2016"/>
-            <w:shd w:fill="FBFBFC"/>
+            <w:shd w:fill="F9FAFB"/>
             <w:tcMar>
               <w:top w:w="120" w:type="dxa"/>
               <w:bottom w:w="120" w:type="dxa"/>
@@ -8662,7 +8689,7 @@
         <w:tc>
           <w:tcPr>
             <w:tcW w:type="dxa" w:w="6048"/>
-            <w:shd w:fill="FBFBFC"/>
+            <w:shd w:fill="F9FAFB"/>
             <w:tcMar>
               <w:top w:w="120" w:type="dxa"/>
               <w:bottom w:w="120" w:type="dxa"/>
@@ -8770,7 +8797,7 @@
         <w:tc>
           <w:tcPr>
             <w:tcW w:type="dxa" w:w="2016"/>
-            <w:shd w:fill="FBFBFC"/>
+            <w:shd w:fill="F9FAFB"/>
             <w:tcMar>
               <w:top w:w="120" w:type="dxa"/>
               <w:bottom w:w="120" w:type="dxa"/>
@@ -8796,7 +8823,7 @@
         <w:tc>
           <w:tcPr>
             <w:tcW w:type="dxa" w:w="2016"/>
-            <w:shd w:fill="FBFBFC"/>
+            <w:shd w:fill="F9FAFB"/>
             <w:tcMar>
               <w:top w:w="120" w:type="dxa"/>
               <w:bottom w:w="120" w:type="dxa"/>
@@ -8822,7 +8849,7 @@
         <w:tc>
           <w:tcPr>
             <w:tcW w:type="dxa" w:w="6048"/>
-            <w:shd w:fill="FBFBFC"/>
+            <w:shd w:fill="F9FAFB"/>
             <w:tcMar>
               <w:top w:w="120" w:type="dxa"/>
               <w:bottom w:w="120" w:type="dxa"/>
@@ -8898,7 +8925,7 @@
         <w:tc>
           <w:tcPr>
             <w:tcW w:type="dxa" w:w="2160"/>
-            <w:shd w:fill="E8EEF5"/>
+            <w:shd w:fill="E5E7EB"/>
             <w:tcMar>
               <w:top w:w="140" w:type="dxa"/>
               <w:bottom w:w="140" w:type="dxa"/>
@@ -8925,7 +8952,7 @@
         <w:tc>
           <w:tcPr>
             <w:tcW w:type="dxa" w:w="2592"/>
-            <w:shd w:fill="E8EEF5"/>
+            <w:shd w:fill="E5E7EB"/>
             <w:tcMar>
               <w:top w:w="140" w:type="dxa"/>
               <w:bottom w:w="140" w:type="dxa"/>
@@ -8952,7 +8979,7 @@
         <w:tc>
           <w:tcPr>
             <w:tcW w:type="dxa" w:w="5328"/>
-            <w:shd w:fill="E8EEF5"/>
+            <w:shd w:fill="E5E7EB"/>
             <w:tcMar>
               <w:top w:w="140" w:type="dxa"/>
               <w:bottom w:w="140" w:type="dxa"/>
@@ -9061,7 +9088,7 @@
         <w:tc>
           <w:tcPr>
             <w:tcW w:type="dxa" w:w="2160"/>
-            <w:shd w:fill="FBFBFC"/>
+            <w:shd w:fill="F9FAFB"/>
             <w:tcMar>
               <w:top w:w="120" w:type="dxa"/>
               <w:bottom w:w="120" w:type="dxa"/>
@@ -9087,7 +9114,7 @@
         <w:tc>
           <w:tcPr>
             <w:tcW w:type="dxa" w:w="2592"/>
-            <w:shd w:fill="FBFBFC"/>
+            <w:shd w:fill="F9FAFB"/>
             <w:tcMar>
               <w:top w:w="120" w:type="dxa"/>
               <w:bottom w:w="120" w:type="dxa"/>
@@ -9113,7 +9140,7 @@
         <w:tc>
           <w:tcPr>
             <w:tcW w:type="dxa" w:w="5328"/>
-            <w:shd w:fill="FBFBFC"/>
+            <w:shd w:fill="F9FAFB"/>
             <w:tcMar>
               <w:top w:w="120" w:type="dxa"/>
               <w:bottom w:w="120" w:type="dxa"/>
@@ -9221,7 +9248,7 @@
         <w:tc>
           <w:tcPr>
             <w:tcW w:type="dxa" w:w="2160"/>
-            <w:shd w:fill="FBFBFC"/>
+            <w:shd w:fill="F9FAFB"/>
             <w:tcMar>
               <w:top w:w="120" w:type="dxa"/>
               <w:bottom w:w="120" w:type="dxa"/>
@@ -9247,7 +9274,7 @@
         <w:tc>
           <w:tcPr>
             <w:tcW w:type="dxa" w:w="2592"/>
-            <w:shd w:fill="FBFBFC"/>
+            <w:shd w:fill="F9FAFB"/>
             <w:tcMar>
               <w:top w:w="120" w:type="dxa"/>
               <w:bottom w:w="120" w:type="dxa"/>
@@ -9273,7 +9300,7 @@
         <w:tc>
           <w:tcPr>
             <w:tcW w:type="dxa" w:w="5328"/>
-            <w:shd w:fill="FBFBFC"/>
+            <w:shd w:fill="F9FAFB"/>
             <w:tcMar>
               <w:top w:w="120" w:type="dxa"/>
               <w:bottom w:w="120" w:type="dxa"/>
@@ -9381,7 +9408,7 @@
         <w:tc>
           <w:tcPr>
             <w:tcW w:type="dxa" w:w="2160"/>
-            <w:shd w:fill="FBFBFC"/>
+            <w:shd w:fill="F9FAFB"/>
             <w:tcMar>
               <w:top w:w="120" w:type="dxa"/>
               <w:bottom w:w="120" w:type="dxa"/>
@@ -9407,7 +9434,7 @@
         <w:tc>
           <w:tcPr>
             <w:tcW w:type="dxa" w:w="2592"/>
-            <w:shd w:fill="FBFBFC"/>
+            <w:shd w:fill="F9FAFB"/>
             <w:tcMar>
               <w:top w:w="120" w:type="dxa"/>
               <w:bottom w:w="120" w:type="dxa"/>
@@ -9433,7 +9460,7 @@
         <w:tc>
           <w:tcPr>
             <w:tcW w:type="dxa" w:w="5328"/>
-            <w:shd w:fill="FBFBFC"/>
+            <w:shd w:fill="F9FAFB"/>
             <w:tcMar>
               <w:top w:w="120" w:type="dxa"/>
               <w:bottom w:w="120" w:type="dxa"/>
@@ -9541,7 +9568,7 @@
         <w:tc>
           <w:tcPr>
             <w:tcW w:type="dxa" w:w="2160"/>
-            <w:shd w:fill="FBFBFC"/>
+            <w:shd w:fill="F9FAFB"/>
             <w:tcMar>
               <w:top w:w="120" w:type="dxa"/>
               <w:bottom w:w="120" w:type="dxa"/>
@@ -9567,7 +9594,7 @@
         <w:tc>
           <w:tcPr>
             <w:tcW w:type="dxa" w:w="2592"/>
-            <w:shd w:fill="FBFBFC"/>
+            <w:shd w:fill="F9FAFB"/>
             <w:tcMar>
               <w:top w:w="120" w:type="dxa"/>
               <w:bottom w:w="120" w:type="dxa"/>
@@ -9593,7 +9620,7 @@
         <w:tc>
           <w:tcPr>
             <w:tcW w:type="dxa" w:w="5328"/>
-            <w:shd w:fill="FBFBFC"/>
+            <w:shd w:fill="F9FAFB"/>
             <w:tcMar>
               <w:top w:w="120" w:type="dxa"/>
               <w:bottom w:w="120" w:type="dxa"/>
@@ -9701,7 +9728,7 @@
         <w:tc>
           <w:tcPr>
             <w:tcW w:type="dxa" w:w="2160"/>
-            <w:shd w:fill="FBFBFC"/>
+            <w:shd w:fill="F9FAFB"/>
             <w:tcMar>
               <w:top w:w="120" w:type="dxa"/>
               <w:bottom w:w="120" w:type="dxa"/>
@@ -9727,7 +9754,7 @@
         <w:tc>
           <w:tcPr>
             <w:tcW w:type="dxa" w:w="2592"/>
-            <w:shd w:fill="FBFBFC"/>
+            <w:shd w:fill="F9FAFB"/>
             <w:tcMar>
               <w:top w:w="120" w:type="dxa"/>
               <w:bottom w:w="120" w:type="dxa"/>
@@ -9753,7 +9780,7 @@
         <w:tc>
           <w:tcPr>
             <w:tcW w:type="dxa" w:w="5328"/>
-            <w:shd w:fill="FBFBFC"/>
+            <w:shd w:fill="F9FAFB"/>
             <w:tcMar>
               <w:top w:w="120" w:type="dxa"/>
               <w:bottom w:w="120" w:type="dxa"/>
@@ -9829,7 +9856,7 @@
         <w:tc>
           <w:tcPr>
             <w:tcW w:type="dxa" w:w="2592"/>
-            <w:shd w:fill="E8EEF5"/>
+            <w:shd w:fill="E5E7EB"/>
             <w:tcMar>
               <w:top w:w="140" w:type="dxa"/>
               <w:bottom w:w="140" w:type="dxa"/>
@@ -9856,7 +9883,7 @@
         <w:tc>
           <w:tcPr>
             <w:tcW w:type="dxa" w:w="3744"/>
-            <w:shd w:fill="E8EEF5"/>
+            <w:shd w:fill="E5E7EB"/>
             <w:tcMar>
               <w:top w:w="140" w:type="dxa"/>
               <w:bottom w:w="140" w:type="dxa"/>
@@ -9883,7 +9910,7 @@
         <w:tc>
           <w:tcPr>
             <w:tcW w:type="dxa" w:w="3744"/>
-            <w:shd w:fill="E8EEF5"/>
+            <w:shd w:fill="E5E7EB"/>
             <w:tcMar>
               <w:top w:w="140" w:type="dxa"/>
               <w:bottom w:w="140" w:type="dxa"/>
@@ -9992,7 +10019,7 @@
         <w:tc>
           <w:tcPr>
             <w:tcW w:type="dxa" w:w="2592"/>
-            <w:shd w:fill="FBFBFC"/>
+            <w:shd w:fill="F9FAFB"/>
             <w:tcMar>
               <w:top w:w="120" w:type="dxa"/>
               <w:bottom w:w="120" w:type="dxa"/>
@@ -10018,7 +10045,7 @@
         <w:tc>
           <w:tcPr>
             <w:tcW w:type="dxa" w:w="3744"/>
-            <w:shd w:fill="FBFBFC"/>
+            <w:shd w:fill="F9FAFB"/>
             <w:tcMar>
               <w:top w:w="120" w:type="dxa"/>
               <w:bottom w:w="120" w:type="dxa"/>
@@ -10044,7 +10071,7 @@
         <w:tc>
           <w:tcPr>
             <w:tcW w:type="dxa" w:w="3744"/>
-            <w:shd w:fill="FBFBFC"/>
+            <w:shd w:fill="F9FAFB"/>
             <w:tcMar>
               <w:top w:w="120" w:type="dxa"/>
               <w:bottom w:w="120" w:type="dxa"/>
@@ -10152,7 +10179,7 @@
         <w:tc>
           <w:tcPr>
             <w:tcW w:type="dxa" w:w="2592"/>
-            <w:shd w:fill="FBFBFC"/>
+            <w:shd w:fill="F9FAFB"/>
             <w:tcMar>
               <w:top w:w="120" w:type="dxa"/>
               <w:bottom w:w="120" w:type="dxa"/>
@@ -10178,7 +10205,7 @@
         <w:tc>
           <w:tcPr>
             <w:tcW w:type="dxa" w:w="3744"/>
-            <w:shd w:fill="FBFBFC"/>
+            <w:shd w:fill="F9FAFB"/>
             <w:tcMar>
               <w:top w:w="120" w:type="dxa"/>
               <w:bottom w:w="120" w:type="dxa"/>
@@ -10204,7 +10231,7 @@
         <w:tc>
           <w:tcPr>
             <w:tcW w:type="dxa" w:w="3744"/>
-            <w:shd w:fill="FBFBFC"/>
+            <w:shd w:fill="F9FAFB"/>
             <w:tcMar>
               <w:top w:w="120" w:type="dxa"/>
               <w:bottom w:w="120" w:type="dxa"/>
@@ -10312,7 +10339,7 @@
         <w:tc>
           <w:tcPr>
             <w:tcW w:type="dxa" w:w="2592"/>
-            <w:shd w:fill="FBFBFC"/>
+            <w:shd w:fill="F9FAFB"/>
             <w:tcMar>
               <w:top w:w="120" w:type="dxa"/>
               <w:bottom w:w="120" w:type="dxa"/>
@@ -10338,7 +10365,7 @@
         <w:tc>
           <w:tcPr>
             <w:tcW w:type="dxa" w:w="3744"/>
-            <w:shd w:fill="FBFBFC"/>
+            <w:shd w:fill="F9FAFB"/>
             <w:tcMar>
               <w:top w:w="120" w:type="dxa"/>
               <w:bottom w:w="120" w:type="dxa"/>
@@ -10364,7 +10391,7 @@
         <w:tc>
           <w:tcPr>
             <w:tcW w:type="dxa" w:w="3744"/>
-            <w:shd w:fill="FBFBFC"/>
+            <w:shd w:fill="F9FAFB"/>
             <w:tcMar>
               <w:top w:w="120" w:type="dxa"/>
               <w:bottom w:w="120" w:type="dxa"/>
@@ -10926,7 +10953,7 @@
           <w:rFonts w:ascii="Times New Roman" w:hAnsi="Times New Roman"/>
           <w:b/>
           <w:i/>
-          <w:color w:val="323232"/>
+          <w:color w:val="000000"/>
           <w:sz w:val="22"/>
         </w:rPr>
         <w:t>Fig. 3.1: System Architecture Diagram (3-Tier MVC Pattern)</w:t>
@@ -11065,7 +11092,7 @@
           <w:rFonts w:ascii="Times New Roman" w:hAnsi="Times New Roman"/>
           <w:b/>
           <w:i/>
-          <w:color w:val="323232"/>
+          <w:color w:val="000000"/>
           <w:sz w:val="22"/>
         </w:rPr>
         <w:t>Fig. 3.4: PyTorch BiLSTM Deep Learning Neural Network Architecture</w:t>
@@ -11118,7 +11145,7 @@
         <w:tc>
           <w:tcPr>
             <w:tcW w:type="dxa" w:w="1584"/>
-            <w:shd w:fill="E8EEF5"/>
+            <w:shd w:fill="E5E7EB"/>
             <w:tcMar>
               <w:top w:w="140" w:type="dxa"/>
               <w:bottom w:w="140" w:type="dxa"/>
@@ -11145,7 +11172,7 @@
         <w:tc>
           <w:tcPr>
             <w:tcW w:type="dxa" w:w="2592"/>
-            <w:shd w:fill="E8EEF5"/>
+            <w:shd w:fill="E5E7EB"/>
             <w:tcMar>
               <w:top w:w="140" w:type="dxa"/>
               <w:bottom w:w="140" w:type="dxa"/>
@@ -11172,7 +11199,7 @@
         <w:tc>
           <w:tcPr>
             <w:tcW w:type="dxa" w:w="2592"/>
-            <w:shd w:fill="E8EEF5"/>
+            <w:shd w:fill="E5E7EB"/>
             <w:tcMar>
               <w:top w:w="140" w:type="dxa"/>
               <w:bottom w:w="140" w:type="dxa"/>
@@ -11199,7 +11226,7 @@
         <w:tc>
           <w:tcPr>
             <w:tcW w:type="dxa" w:w="3312"/>
-            <w:shd w:fill="E8EEF5"/>
+            <w:shd w:fill="E5E7EB"/>
             <w:tcMar>
               <w:top w:w="140" w:type="dxa"/>
               <w:bottom w:w="140" w:type="dxa"/>
@@ -11334,7 +11361,7 @@
         <w:tc>
           <w:tcPr>
             <w:tcW w:type="dxa" w:w="1584"/>
-            <w:shd w:fill="FBFBFC"/>
+            <w:shd w:fill="F9FAFB"/>
             <w:tcMar>
               <w:top w:w="120" w:type="dxa"/>
               <w:bottom w:w="120" w:type="dxa"/>
@@ -11360,7 +11387,7 @@
         <w:tc>
           <w:tcPr>
             <w:tcW w:type="dxa" w:w="2592"/>
-            <w:shd w:fill="FBFBFC"/>
+            <w:shd w:fill="F9FAFB"/>
             <w:tcMar>
               <w:top w:w="120" w:type="dxa"/>
               <w:bottom w:w="120" w:type="dxa"/>
@@ -11386,7 +11413,7 @@
         <w:tc>
           <w:tcPr>
             <w:tcW w:type="dxa" w:w="2592"/>
-            <w:shd w:fill="FBFBFC"/>
+            <w:shd w:fill="F9FAFB"/>
             <w:tcMar>
               <w:top w:w="120" w:type="dxa"/>
               <w:bottom w:w="120" w:type="dxa"/>
@@ -11412,7 +11439,7 @@
         <w:tc>
           <w:tcPr>
             <w:tcW w:type="dxa" w:w="3312"/>
-            <w:shd w:fill="FBFBFC"/>
+            <w:shd w:fill="F9FAFB"/>
             <w:tcMar>
               <w:top w:w="120" w:type="dxa"/>
               <w:bottom w:w="120" w:type="dxa"/>
@@ -11546,7 +11573,7 @@
         <w:tc>
           <w:tcPr>
             <w:tcW w:type="dxa" w:w="1584"/>
-            <w:shd w:fill="FBFBFC"/>
+            <w:shd w:fill="F9FAFB"/>
             <w:tcMar>
               <w:top w:w="120" w:type="dxa"/>
               <w:bottom w:w="120" w:type="dxa"/>
@@ -11572,7 +11599,7 @@
         <w:tc>
           <w:tcPr>
             <w:tcW w:type="dxa" w:w="2592"/>
-            <w:shd w:fill="FBFBFC"/>
+            <w:shd w:fill="F9FAFB"/>
             <w:tcMar>
               <w:top w:w="120" w:type="dxa"/>
               <w:bottom w:w="120" w:type="dxa"/>
@@ -11598,7 +11625,7 @@
         <w:tc>
           <w:tcPr>
             <w:tcW w:type="dxa" w:w="2592"/>
-            <w:shd w:fill="FBFBFC"/>
+            <w:shd w:fill="F9FAFB"/>
             <w:tcMar>
               <w:top w:w="120" w:type="dxa"/>
               <w:bottom w:w="120" w:type="dxa"/>
@@ -11624,7 +11651,7 @@
         <w:tc>
           <w:tcPr>
             <w:tcW w:type="dxa" w:w="3312"/>
-            <w:shd w:fill="FBFBFC"/>
+            <w:shd w:fill="F9FAFB"/>
             <w:tcMar>
               <w:top w:w="120" w:type="dxa"/>
               <w:bottom w:w="120" w:type="dxa"/>
@@ -11758,7 +11785,7 @@
         <w:tc>
           <w:tcPr>
             <w:tcW w:type="dxa" w:w="1584"/>
-            <w:shd w:fill="FBFBFC"/>
+            <w:shd w:fill="F9FAFB"/>
             <w:tcMar>
               <w:top w:w="120" w:type="dxa"/>
               <w:bottom w:w="120" w:type="dxa"/>
@@ -11784,7 +11811,7 @@
         <w:tc>
           <w:tcPr>
             <w:tcW w:type="dxa" w:w="2592"/>
-            <w:shd w:fill="FBFBFC"/>
+            <w:shd w:fill="F9FAFB"/>
             <w:tcMar>
               <w:top w:w="120" w:type="dxa"/>
               <w:bottom w:w="120" w:type="dxa"/>
@@ -11810,7 +11837,7 @@
         <w:tc>
           <w:tcPr>
             <w:tcW w:type="dxa" w:w="2592"/>
-            <w:shd w:fill="FBFBFC"/>
+            <w:shd w:fill="F9FAFB"/>
             <w:tcMar>
               <w:top w:w="120" w:type="dxa"/>
               <w:bottom w:w="120" w:type="dxa"/>
@@ -11836,7 +11863,7 @@
         <w:tc>
           <w:tcPr>
             <w:tcW w:type="dxa" w:w="3312"/>
-            <w:shd w:fill="FBFBFC"/>
+            <w:shd w:fill="F9FAFB"/>
             <w:tcMar>
               <w:top w:w="120" w:type="dxa"/>
               <w:bottom w:w="120" w:type="dxa"/>
@@ -11913,7 +11940,7 @@
         <w:tc>
           <w:tcPr>
             <w:tcW w:type="dxa" w:w="2160"/>
-            <w:shd w:fill="E8EEF5"/>
+            <w:shd w:fill="E5E7EB"/>
             <w:tcMar>
               <w:top w:w="140" w:type="dxa"/>
               <w:bottom w:w="140" w:type="dxa"/>
@@ -11940,7 +11967,7 @@
         <w:tc>
           <w:tcPr>
             <w:tcW w:type="dxa" w:w="1584"/>
-            <w:shd w:fill="E8EEF5"/>
+            <w:shd w:fill="E5E7EB"/>
             <w:tcMar>
               <w:top w:w="140" w:type="dxa"/>
               <w:bottom w:w="140" w:type="dxa"/>
@@ -11967,7 +11994,7 @@
         <w:tc>
           <w:tcPr>
             <w:tcW w:type="dxa" w:w="2880"/>
-            <w:shd w:fill="E8EEF5"/>
+            <w:shd w:fill="E5E7EB"/>
             <w:tcMar>
               <w:top w:w="140" w:type="dxa"/>
               <w:bottom w:w="140" w:type="dxa"/>
@@ -11994,7 +12021,7 @@
         <w:tc>
           <w:tcPr>
             <w:tcW w:type="dxa" w:w="3456"/>
-            <w:shd w:fill="E8EEF5"/>
+            <w:shd w:fill="E5E7EB"/>
             <w:tcMar>
               <w:top w:w="140" w:type="dxa"/>
               <w:bottom w:w="140" w:type="dxa"/>
@@ -12129,7 +12156,7 @@
         <w:tc>
           <w:tcPr>
             <w:tcW w:type="dxa" w:w="2160"/>
-            <w:shd w:fill="FBFBFC"/>
+            <w:shd w:fill="F9FAFB"/>
             <w:tcMar>
               <w:top w:w="120" w:type="dxa"/>
               <w:bottom w:w="120" w:type="dxa"/>
@@ -12155,7 +12182,7 @@
         <w:tc>
           <w:tcPr>
             <w:tcW w:type="dxa" w:w="1584"/>
-            <w:shd w:fill="FBFBFC"/>
+            <w:shd w:fill="F9FAFB"/>
             <w:tcMar>
               <w:top w:w="120" w:type="dxa"/>
               <w:bottom w:w="120" w:type="dxa"/>
@@ -12181,7 +12208,7 @@
         <w:tc>
           <w:tcPr>
             <w:tcW w:type="dxa" w:w="2880"/>
-            <w:shd w:fill="FBFBFC"/>
+            <w:shd w:fill="F9FAFB"/>
             <w:tcMar>
               <w:top w:w="120" w:type="dxa"/>
               <w:bottom w:w="120" w:type="dxa"/>
@@ -12207,7 +12234,7 @@
         <w:tc>
           <w:tcPr>
             <w:tcW w:type="dxa" w:w="3456"/>
-            <w:shd w:fill="FBFBFC"/>
+            <w:shd w:fill="F9FAFB"/>
             <w:tcMar>
               <w:top w:w="120" w:type="dxa"/>
               <w:bottom w:w="120" w:type="dxa"/>
@@ -12341,7 +12368,7 @@
         <w:tc>
           <w:tcPr>
             <w:tcW w:type="dxa" w:w="2160"/>
-            <w:shd w:fill="FBFBFC"/>
+            <w:shd w:fill="F9FAFB"/>
             <w:tcMar>
               <w:top w:w="120" w:type="dxa"/>
               <w:bottom w:w="120" w:type="dxa"/>
@@ -12367,7 +12394,7 @@
         <w:tc>
           <w:tcPr>
             <w:tcW w:type="dxa" w:w="1584"/>
-            <w:shd w:fill="FBFBFC"/>
+            <w:shd w:fill="F9FAFB"/>
             <w:tcMar>
               <w:top w:w="120" w:type="dxa"/>
               <w:bottom w:w="120" w:type="dxa"/>
@@ -12393,7 +12420,7 @@
         <w:tc>
           <w:tcPr>
             <w:tcW w:type="dxa" w:w="2880"/>
-            <w:shd w:fill="FBFBFC"/>
+            <w:shd w:fill="F9FAFB"/>
             <w:tcMar>
               <w:top w:w="120" w:type="dxa"/>
               <w:bottom w:w="120" w:type="dxa"/>
@@ -12419,7 +12446,7 @@
         <w:tc>
           <w:tcPr>
             <w:tcW w:type="dxa" w:w="3456"/>
-            <w:shd w:fill="FBFBFC"/>
+            <w:shd w:fill="F9FAFB"/>
             <w:tcMar>
               <w:top w:w="120" w:type="dxa"/>
               <w:bottom w:w="120" w:type="dxa"/>
@@ -12553,7 +12580,7 @@
         <w:tc>
           <w:tcPr>
             <w:tcW w:type="dxa" w:w="2160"/>
-            <w:shd w:fill="FBFBFC"/>
+            <w:shd w:fill="F9FAFB"/>
             <w:tcMar>
               <w:top w:w="120" w:type="dxa"/>
               <w:bottom w:w="120" w:type="dxa"/>
@@ -12579,7 +12606,7 @@
         <w:tc>
           <w:tcPr>
             <w:tcW w:type="dxa" w:w="1584"/>
-            <w:shd w:fill="FBFBFC"/>
+            <w:shd w:fill="F9FAFB"/>
             <w:tcMar>
               <w:top w:w="120" w:type="dxa"/>
               <w:bottom w:w="120" w:type="dxa"/>
@@ -12605,7 +12632,7 @@
         <w:tc>
           <w:tcPr>
             <w:tcW w:type="dxa" w:w="2880"/>
-            <w:shd w:fill="FBFBFC"/>
+            <w:shd w:fill="F9FAFB"/>
             <w:tcMar>
               <w:top w:w="120" w:type="dxa"/>
               <w:bottom w:w="120" w:type="dxa"/>
@@ -12631,7 +12658,7 @@
         <w:tc>
           <w:tcPr>
             <w:tcW w:type="dxa" w:w="3456"/>
-            <w:shd w:fill="FBFBFC"/>
+            <w:shd w:fill="F9FAFB"/>
             <w:tcMar>
               <w:top w:w="120" w:type="dxa"/>
               <w:bottom w:w="120" w:type="dxa"/>
@@ -12851,7 +12878,7 @@
         <w:tc>
           <w:tcPr>
             <w:tcW w:type="dxa" w:w="2304"/>
-            <w:shd w:fill="E8EEF5"/>
+            <w:shd w:fill="E5E7EB"/>
             <w:tcMar>
               <w:top w:w="140" w:type="dxa"/>
               <w:bottom w:w="140" w:type="dxa"/>
@@ -12878,7 +12905,7 @@
         <w:tc>
           <w:tcPr>
             <w:tcW w:type="dxa" w:w="2592"/>
-            <w:shd w:fill="E8EEF5"/>
+            <w:shd w:fill="E5E7EB"/>
             <w:tcMar>
               <w:top w:w="140" w:type="dxa"/>
               <w:bottom w:w="140" w:type="dxa"/>
@@ -12905,7 +12932,7 @@
         <w:tc>
           <w:tcPr>
             <w:tcW w:type="dxa" w:w="1584"/>
-            <w:shd w:fill="E8EEF5"/>
+            <w:shd w:fill="E5E7EB"/>
             <w:tcMar>
               <w:top w:w="140" w:type="dxa"/>
               <w:bottom w:w="140" w:type="dxa"/>
@@ -12932,7 +12959,7 @@
         <w:tc>
           <w:tcPr>
             <w:tcW w:type="dxa" w:w="3600"/>
-            <w:shd w:fill="E8EEF5"/>
+            <w:shd w:fill="E5E7EB"/>
             <w:tcMar>
               <w:top w:w="140" w:type="dxa"/>
               <w:bottom w:w="140" w:type="dxa"/>
@@ -13067,7 +13094,7 @@
         <w:tc>
           <w:tcPr>
             <w:tcW w:type="dxa" w:w="2304"/>
-            <w:shd w:fill="FBFBFC"/>
+            <w:shd w:fill="F9FAFB"/>
             <w:tcMar>
               <w:top w:w="120" w:type="dxa"/>
               <w:bottom w:w="120" w:type="dxa"/>
@@ -13093,7 +13120,7 @@
         <w:tc>
           <w:tcPr>
             <w:tcW w:type="dxa" w:w="2592"/>
-            <w:shd w:fill="FBFBFC"/>
+            <w:shd w:fill="F9FAFB"/>
             <w:tcMar>
               <w:top w:w="120" w:type="dxa"/>
               <w:bottom w:w="120" w:type="dxa"/>
@@ -13119,7 +13146,7 @@
         <w:tc>
           <w:tcPr>
             <w:tcW w:type="dxa" w:w="1584"/>
-            <w:shd w:fill="FBFBFC"/>
+            <w:shd w:fill="F9FAFB"/>
             <w:tcMar>
               <w:top w:w="120" w:type="dxa"/>
               <w:bottom w:w="120" w:type="dxa"/>
@@ -13145,7 +13172,7 @@
         <w:tc>
           <w:tcPr>
             <w:tcW w:type="dxa" w:w="3600"/>
-            <w:shd w:fill="FBFBFC"/>
+            <w:shd w:fill="F9FAFB"/>
             <w:tcMar>
               <w:top w:w="120" w:type="dxa"/>
               <w:bottom w:w="120" w:type="dxa"/>
@@ -13279,7 +13306,7 @@
         <w:tc>
           <w:tcPr>
             <w:tcW w:type="dxa" w:w="2304"/>
-            <w:shd w:fill="FBFBFC"/>
+            <w:shd w:fill="F9FAFB"/>
             <w:tcMar>
               <w:top w:w="120" w:type="dxa"/>
               <w:bottom w:w="120" w:type="dxa"/>
@@ -13305,7 +13332,7 @@
         <w:tc>
           <w:tcPr>
             <w:tcW w:type="dxa" w:w="2592"/>
-            <w:shd w:fill="FBFBFC"/>
+            <w:shd w:fill="F9FAFB"/>
             <w:tcMar>
               <w:top w:w="120" w:type="dxa"/>
               <w:bottom w:w="120" w:type="dxa"/>
@@ -13331,7 +13358,7 @@
         <w:tc>
           <w:tcPr>
             <w:tcW w:type="dxa" w:w="1584"/>
-            <w:shd w:fill="FBFBFC"/>
+            <w:shd w:fill="F9FAFB"/>
             <w:tcMar>
               <w:top w:w="120" w:type="dxa"/>
               <w:bottom w:w="120" w:type="dxa"/>
@@ -13357,7 +13384,7 @@
         <w:tc>
           <w:tcPr>
             <w:tcW w:type="dxa" w:w="3600"/>
-            <w:shd w:fill="FBFBFC"/>
+            <w:shd w:fill="F9FAFB"/>
             <w:tcMar>
               <w:top w:w="120" w:type="dxa"/>
               <w:bottom w:w="120" w:type="dxa"/>
@@ -13491,7 +13518,7 @@
         <w:tc>
           <w:tcPr>
             <w:tcW w:type="dxa" w:w="2304"/>
-            <w:shd w:fill="FBFBFC"/>
+            <w:shd w:fill="F9FAFB"/>
             <w:tcMar>
               <w:top w:w="120" w:type="dxa"/>
               <w:bottom w:w="120" w:type="dxa"/>
@@ -13517,7 +13544,7 @@
         <w:tc>
           <w:tcPr>
             <w:tcW w:type="dxa" w:w="2592"/>
-            <w:shd w:fill="FBFBFC"/>
+            <w:shd w:fill="F9FAFB"/>
             <w:tcMar>
               <w:top w:w="120" w:type="dxa"/>
               <w:bottom w:w="120" w:type="dxa"/>
@@ -13543,7 +13570,7 @@
         <w:tc>
           <w:tcPr>
             <w:tcW w:type="dxa" w:w="1584"/>
-            <w:shd w:fill="FBFBFC"/>
+            <w:shd w:fill="F9FAFB"/>
             <w:tcMar>
               <w:top w:w="120" w:type="dxa"/>
               <w:bottom w:w="120" w:type="dxa"/>
@@ -13569,7 +13596,7 @@
         <w:tc>
           <w:tcPr>
             <w:tcW w:type="dxa" w:w="3600"/>
-            <w:shd w:fill="FBFBFC"/>
+            <w:shd w:fill="F9FAFB"/>
             <w:tcMar>
               <w:top w:w="120" w:type="dxa"/>
               <w:bottom w:w="120" w:type="dxa"/>
@@ -13753,7 +13780,7 @@
         <w:tc>
           <w:tcPr>
             <w:tcW w:type="dxa" w:w="3024"/>
-            <w:shd w:fill="E8EEF5"/>
+            <w:shd w:fill="E5E7EB"/>
             <w:tcMar>
               <w:top w:w="140" w:type="dxa"/>
               <w:bottom w:w="140" w:type="dxa"/>
@@ -13780,7 +13807,7 @@
         <w:tc>
           <w:tcPr>
             <w:tcW w:type="dxa" w:w="1872"/>
-            <w:shd w:fill="E8EEF5"/>
+            <w:shd w:fill="E5E7EB"/>
             <w:tcMar>
               <w:top w:w="140" w:type="dxa"/>
               <w:bottom w:w="140" w:type="dxa"/>
@@ -13807,7 +13834,7 @@
         <w:tc>
           <w:tcPr>
             <w:tcW w:type="dxa" w:w="1584"/>
-            <w:shd w:fill="E8EEF5"/>
+            <w:shd w:fill="E5E7EB"/>
             <w:tcMar>
               <w:top w:w="140" w:type="dxa"/>
               <w:bottom w:w="140" w:type="dxa"/>
@@ -13834,7 +13861,7 @@
         <w:tc>
           <w:tcPr>
             <w:tcW w:type="dxa" w:w="1584"/>
-            <w:shd w:fill="E8EEF5"/>
+            <w:shd w:fill="E5E7EB"/>
             <w:tcMar>
               <w:top w:w="140" w:type="dxa"/>
               <w:bottom w:w="140" w:type="dxa"/>
@@ -13861,7 +13888,7 @@
         <w:tc>
           <w:tcPr>
             <w:tcW w:type="dxa" w:w="2016"/>
-            <w:shd w:fill="E8EEF5"/>
+            <w:shd w:fill="E5E7EB"/>
             <w:tcMar>
               <w:top w:w="140" w:type="dxa"/>
               <w:bottom w:w="140" w:type="dxa"/>
@@ -14022,7 +14049,7 @@
         <w:tc>
           <w:tcPr>
             <w:tcW w:type="dxa" w:w="3024"/>
-            <w:shd w:fill="FBFBFC"/>
+            <w:shd w:fill="F9FAFB"/>
             <w:tcMar>
               <w:top w:w="120" w:type="dxa"/>
               <w:bottom w:w="120" w:type="dxa"/>
@@ -14048,7 +14075,7 @@
         <w:tc>
           <w:tcPr>
             <w:tcW w:type="dxa" w:w="1872"/>
-            <w:shd w:fill="FBFBFC"/>
+            <w:shd w:fill="F9FAFB"/>
             <w:tcMar>
               <w:top w:w="120" w:type="dxa"/>
               <w:bottom w:w="120" w:type="dxa"/>
@@ -14074,7 +14101,7 @@
         <w:tc>
           <w:tcPr>
             <w:tcW w:type="dxa" w:w="1584"/>
-            <w:shd w:fill="FBFBFC"/>
+            <w:shd w:fill="F9FAFB"/>
             <w:tcMar>
               <w:top w:w="120" w:type="dxa"/>
               <w:bottom w:w="120" w:type="dxa"/>
@@ -14100,7 +14127,7 @@
         <w:tc>
           <w:tcPr>
             <w:tcW w:type="dxa" w:w="1584"/>
-            <w:shd w:fill="FBFBFC"/>
+            <w:shd w:fill="F9FAFB"/>
             <w:tcMar>
               <w:top w:w="120" w:type="dxa"/>
               <w:bottom w:w="120" w:type="dxa"/>
@@ -14126,7 +14153,7 @@
         <w:tc>
           <w:tcPr>
             <w:tcW w:type="dxa" w:w="2016"/>
-            <w:shd w:fill="FBFBFC"/>
+            <w:shd w:fill="F9FAFB"/>
             <w:tcMar>
               <w:top w:w="120" w:type="dxa"/>
               <w:bottom w:w="120" w:type="dxa"/>
@@ -14286,7 +14313,7 @@
         <w:tc>
           <w:tcPr>
             <w:tcW w:type="dxa" w:w="3024"/>
-            <w:shd w:fill="FBFBFC"/>
+            <w:shd w:fill="F9FAFB"/>
             <w:tcMar>
               <w:top w:w="120" w:type="dxa"/>
               <w:bottom w:w="120" w:type="dxa"/>
@@ -14312,7 +14339,7 @@
         <w:tc>
           <w:tcPr>
             <w:tcW w:type="dxa" w:w="1872"/>
-            <w:shd w:fill="FBFBFC"/>
+            <w:shd w:fill="F9FAFB"/>
             <w:tcMar>
               <w:top w:w="120" w:type="dxa"/>
               <w:bottom w:w="120" w:type="dxa"/>
@@ -14338,7 +14365,7 @@
         <w:tc>
           <w:tcPr>
             <w:tcW w:type="dxa" w:w="1584"/>
-            <w:shd w:fill="FBFBFC"/>
+            <w:shd w:fill="F9FAFB"/>
             <w:tcMar>
               <w:top w:w="120" w:type="dxa"/>
               <w:bottom w:w="120" w:type="dxa"/>
@@ -14364,7 +14391,7 @@
         <w:tc>
           <w:tcPr>
             <w:tcW w:type="dxa" w:w="1584"/>
-            <w:shd w:fill="FBFBFC"/>
+            <w:shd w:fill="F9FAFB"/>
             <w:tcMar>
               <w:top w:w="120" w:type="dxa"/>
               <w:bottom w:w="120" w:type="dxa"/>
@@ -14390,7 +14417,7 @@
         <w:tc>
           <w:tcPr>
             <w:tcW w:type="dxa" w:w="2016"/>
-            <w:shd w:fill="FBFBFC"/>
+            <w:shd w:fill="F9FAFB"/>
             <w:tcMar>
               <w:top w:w="120" w:type="dxa"/>
               <w:bottom w:w="120" w:type="dxa"/>
@@ -14577,7 +14604,7 @@
           <w:rFonts w:ascii="Times New Roman" w:hAnsi="Times New Roman"/>
           <w:b/>
           <w:i/>
-          <w:color w:val="323232"/>
+          <w:color w:val="000000"/>
           <w:sz w:val="22"/>
         </w:rPr>
         <w:t>Fig. 4.1: Dashboard -- Review Input Screen (Landing Page)</w:t>
@@ -14633,7 +14660,7 @@
           <w:rFonts w:ascii="Times New Roman" w:hAnsi="Times New Roman"/>
           <w:b/>
           <w:i/>
-          <w:color w:val="323232"/>
+          <w:color w:val="000000"/>
           <w:sz w:val="22"/>
         </w:rPr>
         <w:t>Fig. 4.2: Single Review Test -- Fake Review Correctly Flagged with 3 Suspicion Flags</w:t>
@@ -14689,7 +14716,7 @@
           <w:rFonts w:ascii="Times New Roman" w:hAnsi="Times New Roman"/>
           <w:b/>
           <w:i/>
-          <w:color w:val="323232"/>
+          <w:color w:val="000000"/>
           <w:sz w:val="22"/>
         </w:rPr>
         <w:t>Fig. 4.3: Bulk Analysis -- Trust Index Dashboard for Samsung AC Reviews (100% Real)</w:t>
@@ -14745,7 +14772,7 @@
           <w:rFonts w:ascii="Times New Roman" w:hAnsi="Times New Roman"/>
           <w:b/>
           <w:i/>
-          <w:color w:val="323232"/>
+          <w:color w:val="000000"/>
           <w:sz w:val="22"/>
         </w:rPr>
         <w:t>Fig. 4.4: Model Performance Benchmark Modal with Live Accuracy &amp; F1 Metrics</w:t>
@@ -14800,7 +14827,7 @@
         <w:tc>
           <w:tcPr>
             <w:tcW w:type="dxa" w:w="1152"/>
-            <w:shd w:fill="E8EEF5"/>
+            <w:shd w:fill="E5E7EB"/>
             <w:tcMar>
               <w:top w:w="140" w:type="dxa"/>
               <w:bottom w:w="140" w:type="dxa"/>
@@ -14827,7 +14854,7 @@
         <w:tc>
           <w:tcPr>
             <w:tcW w:type="dxa" w:w="1440"/>
-            <w:shd w:fill="E8EEF5"/>
+            <w:shd w:fill="E5E7EB"/>
             <w:tcMar>
               <w:top w:w="140" w:type="dxa"/>
               <w:bottom w:w="140" w:type="dxa"/>
@@ -14854,7 +14881,7 @@
         <w:tc>
           <w:tcPr>
             <w:tcW w:type="dxa" w:w="2448"/>
-            <w:shd w:fill="E8EEF5"/>
+            <w:shd w:fill="E5E7EB"/>
             <w:tcMar>
               <w:top w:w="140" w:type="dxa"/>
               <w:bottom w:w="140" w:type="dxa"/>
@@ -14881,7 +14908,7 @@
         <w:tc>
           <w:tcPr>
             <w:tcW w:type="dxa" w:w="2160"/>
-            <w:shd w:fill="E8EEF5"/>
+            <w:shd w:fill="E5E7EB"/>
             <w:tcMar>
               <w:top w:w="140" w:type="dxa"/>
               <w:bottom w:w="140" w:type="dxa"/>
@@ -14908,7 +14935,7 @@
         <w:tc>
           <w:tcPr>
             <w:tcW w:type="dxa" w:w="1872"/>
-            <w:shd w:fill="E8EEF5"/>
+            <w:shd w:fill="E5E7EB"/>
             <w:tcMar>
               <w:top w:w="140" w:type="dxa"/>
               <w:bottom w:w="140" w:type="dxa"/>
@@ -14935,7 +14962,7 @@
         <w:tc>
           <w:tcPr>
             <w:tcW w:type="dxa" w:w="1008"/>
-            <w:shd w:fill="E8EEF5"/>
+            <w:shd w:fill="E5E7EB"/>
             <w:tcMar>
               <w:top w:w="140" w:type="dxa"/>
               <w:bottom w:w="140" w:type="dxa"/>
@@ -15122,7 +15149,7 @@
         <w:tc>
           <w:tcPr>
             <w:tcW w:type="dxa" w:w="1152"/>
-            <w:shd w:fill="FBFBFC"/>
+            <w:shd w:fill="F9FAFB"/>
             <w:tcMar>
               <w:top w:w="120" w:type="dxa"/>
               <w:bottom w:w="120" w:type="dxa"/>
@@ -15148,7 +15175,7 @@
         <w:tc>
           <w:tcPr>
             <w:tcW w:type="dxa" w:w="1440"/>
-            <w:shd w:fill="FBFBFC"/>
+            <w:shd w:fill="F9FAFB"/>
             <w:tcMar>
               <w:top w:w="120" w:type="dxa"/>
               <w:bottom w:w="120" w:type="dxa"/>
@@ -15174,7 +15201,7 @@
         <w:tc>
           <w:tcPr>
             <w:tcW w:type="dxa" w:w="2448"/>
-            <w:shd w:fill="FBFBFC"/>
+            <w:shd w:fill="F9FAFB"/>
             <w:tcMar>
               <w:top w:w="120" w:type="dxa"/>
               <w:bottom w:w="120" w:type="dxa"/>
@@ -15200,7 +15227,7 @@
         <w:tc>
           <w:tcPr>
             <w:tcW w:type="dxa" w:w="2160"/>
-            <w:shd w:fill="FBFBFC"/>
+            <w:shd w:fill="F9FAFB"/>
             <w:tcMar>
               <w:top w:w="120" w:type="dxa"/>
               <w:bottom w:w="120" w:type="dxa"/>
@@ -15226,7 +15253,7 @@
         <w:tc>
           <w:tcPr>
             <w:tcW w:type="dxa" w:w="1872"/>
-            <w:shd w:fill="FBFBFC"/>
+            <w:shd w:fill="F9FAFB"/>
             <w:tcMar>
               <w:top w:w="120" w:type="dxa"/>
               <w:bottom w:w="120" w:type="dxa"/>
@@ -15252,7 +15279,7 @@
         <w:tc>
           <w:tcPr>
             <w:tcW w:type="dxa" w:w="1008"/>
-            <w:shd w:fill="FBFBFC"/>
+            <w:shd w:fill="F9FAFB"/>
             <w:tcMar>
               <w:top w:w="120" w:type="dxa"/>
               <w:bottom w:w="120" w:type="dxa"/>
@@ -15438,7 +15465,7 @@
         <w:tc>
           <w:tcPr>
             <w:tcW w:type="dxa" w:w="1152"/>
-            <w:shd w:fill="FBFBFC"/>
+            <w:shd w:fill="F9FAFB"/>
             <w:tcMar>
               <w:top w:w="120" w:type="dxa"/>
               <w:bottom w:w="120" w:type="dxa"/>
@@ -15464,7 +15491,7 @@
         <w:tc>
           <w:tcPr>
             <w:tcW w:type="dxa" w:w="1440"/>
-            <w:shd w:fill="FBFBFC"/>
+            <w:shd w:fill="F9FAFB"/>
             <w:tcMar>
               <w:top w:w="120" w:type="dxa"/>
               <w:bottom w:w="120" w:type="dxa"/>
@@ -15490,7 +15517,7 @@
         <w:tc>
           <w:tcPr>
             <w:tcW w:type="dxa" w:w="2448"/>
-            <w:shd w:fill="FBFBFC"/>
+            <w:shd w:fill="F9FAFB"/>
             <w:tcMar>
               <w:top w:w="120" w:type="dxa"/>
               <w:bottom w:w="120" w:type="dxa"/>
@@ -15516,7 +15543,7 @@
         <w:tc>
           <w:tcPr>
             <w:tcW w:type="dxa" w:w="2160"/>
-            <w:shd w:fill="FBFBFC"/>
+            <w:shd w:fill="F9FAFB"/>
             <w:tcMar>
               <w:top w:w="120" w:type="dxa"/>
               <w:bottom w:w="120" w:type="dxa"/>
@@ -15542,7 +15569,7 @@
         <w:tc>
           <w:tcPr>
             <w:tcW w:type="dxa" w:w="1872"/>
-            <w:shd w:fill="FBFBFC"/>
+            <w:shd w:fill="F9FAFB"/>
             <w:tcMar>
               <w:top w:w="120" w:type="dxa"/>
               <w:bottom w:w="120" w:type="dxa"/>
@@ -15568,7 +15595,7 @@
         <w:tc>
           <w:tcPr>
             <w:tcW w:type="dxa" w:w="1008"/>
-            <w:shd w:fill="FBFBFC"/>
+            <w:shd w:fill="F9FAFB"/>
             <w:tcMar>
               <w:top w:w="120" w:type="dxa"/>
               <w:bottom w:w="120" w:type="dxa"/>
@@ -15754,7 +15781,7 @@
         <w:tc>
           <w:tcPr>
             <w:tcW w:type="dxa" w:w="1152"/>
-            <w:shd w:fill="FBFBFC"/>
+            <w:shd w:fill="F9FAFB"/>
             <w:tcMar>
               <w:top w:w="120" w:type="dxa"/>
               <w:bottom w:w="120" w:type="dxa"/>
@@ -15780,7 +15807,7 @@
         <w:tc>
           <w:tcPr>
             <w:tcW w:type="dxa" w:w="1440"/>
-            <w:shd w:fill="FBFBFC"/>
+            <w:shd w:fill="F9FAFB"/>
             <w:tcMar>
               <w:top w:w="120" w:type="dxa"/>
               <w:bottom w:w="120" w:type="dxa"/>
@@ -15806,7 +15833,7 @@
         <w:tc>
           <w:tcPr>
             <w:tcW w:type="dxa" w:w="2448"/>
-            <w:shd w:fill="FBFBFC"/>
+            <w:shd w:fill="F9FAFB"/>
             <w:tcMar>
               <w:top w:w="120" w:type="dxa"/>
               <w:bottom w:w="120" w:type="dxa"/>
@@ -15832,7 +15859,7 @@
         <w:tc>
           <w:tcPr>
             <w:tcW w:type="dxa" w:w="2160"/>
-            <w:shd w:fill="FBFBFC"/>
+            <w:shd w:fill="F9FAFB"/>
             <w:tcMar>
               <w:top w:w="120" w:type="dxa"/>
               <w:bottom w:w="120" w:type="dxa"/>
@@ -15858,7 +15885,7 @@
         <w:tc>
           <w:tcPr>
             <w:tcW w:type="dxa" w:w="1872"/>
-            <w:shd w:fill="FBFBFC"/>
+            <w:shd w:fill="F9FAFB"/>
             <w:tcMar>
               <w:top w:w="120" w:type="dxa"/>
               <w:bottom w:w="120" w:type="dxa"/>
@@ -15884,7 +15911,7 @@
         <w:tc>
           <w:tcPr>
             <w:tcW w:type="dxa" w:w="1008"/>
-            <w:shd w:fill="FBFBFC"/>
+            <w:shd w:fill="F9FAFB"/>
             <w:tcMar>
               <w:top w:w="120" w:type="dxa"/>
               <w:bottom w:w="120" w:type="dxa"/>
@@ -16070,7 +16097,7 @@
         <w:tc>
           <w:tcPr>
             <w:tcW w:type="dxa" w:w="1152"/>
-            <w:shd w:fill="FBFBFC"/>
+            <w:shd w:fill="F9FAFB"/>
             <w:tcMar>
               <w:top w:w="120" w:type="dxa"/>
               <w:bottom w:w="120" w:type="dxa"/>
@@ -16096,7 +16123,7 @@
         <w:tc>
           <w:tcPr>
             <w:tcW w:type="dxa" w:w="1440"/>
-            <w:shd w:fill="FBFBFC"/>
+            <w:shd w:fill="F9FAFB"/>
             <w:tcMar>
               <w:top w:w="120" w:type="dxa"/>
               <w:bottom w:w="120" w:type="dxa"/>
@@ -16122,7 +16149,7 @@
         <w:tc>
           <w:tcPr>
             <w:tcW w:type="dxa" w:w="2448"/>
-            <w:shd w:fill="FBFBFC"/>
+            <w:shd w:fill="F9FAFB"/>
             <w:tcMar>
               <w:top w:w="120" w:type="dxa"/>
               <w:bottom w:w="120" w:type="dxa"/>
@@ -16148,7 +16175,7 @@
         <w:tc>
           <w:tcPr>
             <w:tcW w:type="dxa" w:w="2160"/>
-            <w:shd w:fill="FBFBFC"/>
+            <w:shd w:fill="F9FAFB"/>
             <w:tcMar>
               <w:top w:w="120" w:type="dxa"/>
               <w:bottom w:w="120" w:type="dxa"/>
@@ -16174,7 +16201,7 @@
         <w:tc>
           <w:tcPr>
             <w:tcW w:type="dxa" w:w="1872"/>
-            <w:shd w:fill="FBFBFC"/>
+            <w:shd w:fill="F9FAFB"/>
             <w:tcMar>
               <w:top w:w="120" w:type="dxa"/>
               <w:bottom w:w="120" w:type="dxa"/>
@@ -16200,7 +16227,7 @@
         <w:tc>
           <w:tcPr>
             <w:tcW w:type="dxa" w:w="1008"/>
-            <w:shd w:fill="FBFBFC"/>
+            <w:shd w:fill="F9FAFB"/>
             <w:tcMar>
               <w:top w:w="120" w:type="dxa"/>
               <w:bottom w:w="120" w:type="dxa"/>
@@ -16386,7 +16413,7 @@
         <w:tc>
           <w:tcPr>
             <w:tcW w:type="dxa" w:w="1152"/>
-            <w:shd w:fill="FBFBFC"/>
+            <w:shd w:fill="F9FAFB"/>
             <w:tcMar>
               <w:top w:w="120" w:type="dxa"/>
               <w:bottom w:w="120" w:type="dxa"/>
@@ -16412,7 +16439,7 @@
         <w:tc>
           <w:tcPr>
             <w:tcW w:type="dxa" w:w="1440"/>
-            <w:shd w:fill="FBFBFC"/>
+            <w:shd w:fill="F9FAFB"/>
             <w:tcMar>
               <w:top w:w="120" w:type="dxa"/>
               <w:bottom w:w="120" w:type="dxa"/>
@@ -16438,7 +16465,7 @@
         <w:tc>
           <w:tcPr>
             <w:tcW w:type="dxa" w:w="2448"/>
-            <w:shd w:fill="FBFBFC"/>
+            <w:shd w:fill="F9FAFB"/>
             <w:tcMar>
               <w:top w:w="120" w:type="dxa"/>
               <w:bottom w:w="120" w:type="dxa"/>
@@ -16464,7 +16491,7 @@
         <w:tc>
           <w:tcPr>
             <w:tcW w:type="dxa" w:w="2160"/>
-            <w:shd w:fill="FBFBFC"/>
+            <w:shd w:fill="F9FAFB"/>
             <w:tcMar>
               <w:top w:w="120" w:type="dxa"/>
               <w:bottom w:w="120" w:type="dxa"/>
@@ -16490,7 +16517,7 @@
         <w:tc>
           <w:tcPr>
             <w:tcW w:type="dxa" w:w="1872"/>
-            <w:shd w:fill="FBFBFC"/>
+            <w:shd w:fill="F9FAFB"/>
             <w:tcMar>
               <w:top w:w="120" w:type="dxa"/>
               <w:bottom w:w="120" w:type="dxa"/>
@@ -16516,7 +16543,7 @@
         <w:tc>
           <w:tcPr>
             <w:tcW w:type="dxa" w:w="1008"/>
-            <w:shd w:fill="FBFBFC"/>
+            <w:shd w:fill="F9FAFB"/>
             <w:tcMar>
               <w:top w:w="120" w:type="dxa"/>
               <w:bottom w:w="120" w:type="dxa"/>
@@ -16702,7 +16729,7 @@
         <w:tc>
           <w:tcPr>
             <w:tcW w:type="dxa" w:w="1152"/>
-            <w:shd w:fill="FBFBFC"/>
+            <w:shd w:fill="F9FAFB"/>
             <w:tcMar>
               <w:top w:w="120" w:type="dxa"/>
               <w:bottom w:w="120" w:type="dxa"/>
@@ -16728,7 +16755,7 @@
         <w:tc>
           <w:tcPr>
             <w:tcW w:type="dxa" w:w="1440"/>
-            <w:shd w:fill="FBFBFC"/>
+            <w:shd w:fill="F9FAFB"/>
             <w:tcMar>
               <w:top w:w="120" w:type="dxa"/>
               <w:bottom w:w="120" w:type="dxa"/>
@@ -16754,7 +16781,7 @@
         <w:tc>
           <w:tcPr>
             <w:tcW w:type="dxa" w:w="2448"/>
-            <w:shd w:fill="FBFBFC"/>
+            <w:shd w:fill="F9FAFB"/>
             <w:tcMar>
               <w:top w:w="120" w:type="dxa"/>
               <w:bottom w:w="120" w:type="dxa"/>
@@ -16780,7 +16807,7 @@
         <w:tc>
           <w:tcPr>
             <w:tcW w:type="dxa" w:w="2160"/>
-            <w:shd w:fill="FBFBFC"/>
+            <w:shd w:fill="F9FAFB"/>
             <w:tcMar>
               <w:top w:w="120" w:type="dxa"/>
               <w:bottom w:w="120" w:type="dxa"/>
@@ -16806,7 +16833,7 @@
         <w:tc>
           <w:tcPr>
             <w:tcW w:type="dxa" w:w="1872"/>
-            <w:shd w:fill="FBFBFC"/>
+            <w:shd w:fill="F9FAFB"/>
             <w:tcMar>
               <w:top w:w="120" w:type="dxa"/>
               <w:bottom w:w="120" w:type="dxa"/>
@@ -16832,7 +16859,7 @@
         <w:tc>
           <w:tcPr>
             <w:tcW w:type="dxa" w:w="1008"/>
-            <w:shd w:fill="FBFBFC"/>
+            <w:shd w:fill="F9FAFB"/>
             <w:tcMar>
               <w:top w:w="120" w:type="dxa"/>
               <w:bottom w:w="120" w:type="dxa"/>
@@ -17018,7 +17045,7 @@
         <w:tc>
           <w:tcPr>
             <w:tcW w:type="dxa" w:w="1152"/>
-            <w:shd w:fill="FBFBFC"/>
+            <w:shd w:fill="F9FAFB"/>
             <w:tcMar>
               <w:top w:w="120" w:type="dxa"/>
               <w:bottom w:w="120" w:type="dxa"/>
@@ -17044,7 +17071,7 @@
         <w:tc>
           <w:tcPr>
             <w:tcW w:type="dxa" w:w="1440"/>
-            <w:shd w:fill="FBFBFC"/>
+            <w:shd w:fill="F9FAFB"/>
             <w:tcMar>
               <w:top w:w="120" w:type="dxa"/>
               <w:bottom w:w="120" w:type="dxa"/>
@@ -17070,7 +17097,7 @@
         <w:tc>
           <w:tcPr>
             <w:tcW w:type="dxa" w:w="2448"/>
-            <w:shd w:fill="FBFBFC"/>
+            <w:shd w:fill="F9FAFB"/>
             <w:tcMar>
               <w:top w:w="120" w:type="dxa"/>
               <w:bottom w:w="120" w:type="dxa"/>
@@ -17096,7 +17123,7 @@
         <w:tc>
           <w:tcPr>
             <w:tcW w:type="dxa" w:w="2160"/>
-            <w:shd w:fill="FBFBFC"/>
+            <w:shd w:fill="F9FAFB"/>
             <w:tcMar>
               <w:top w:w="120" w:type="dxa"/>
               <w:bottom w:w="120" w:type="dxa"/>
@@ -17122,7 +17149,7 @@
         <w:tc>
           <w:tcPr>
             <w:tcW w:type="dxa" w:w="1872"/>
-            <w:shd w:fill="FBFBFC"/>
+            <w:shd w:fill="F9FAFB"/>
             <w:tcMar>
               <w:top w:w="120" w:type="dxa"/>
               <w:bottom w:w="120" w:type="dxa"/>
@@ -17148,7 +17175,7 @@
         <w:tc>
           <w:tcPr>
             <w:tcW w:type="dxa" w:w="1008"/>
-            <w:shd w:fill="FBFBFC"/>
+            <w:shd w:fill="F9FAFB"/>
             <w:tcMar>
               <w:top w:w="120" w:type="dxa"/>
               <w:bottom w:w="120" w:type="dxa"/>
@@ -17334,7 +17361,7 @@
         <w:tc>
           <w:tcPr>
             <w:tcW w:type="dxa" w:w="1152"/>
-            <w:shd w:fill="FBFBFC"/>
+            <w:shd w:fill="F9FAFB"/>
             <w:tcMar>
               <w:top w:w="120" w:type="dxa"/>
               <w:bottom w:w="120" w:type="dxa"/>
@@ -17360,7 +17387,7 @@
         <w:tc>
           <w:tcPr>
             <w:tcW w:type="dxa" w:w="1440"/>
-            <w:shd w:fill="FBFBFC"/>
+            <w:shd w:fill="F9FAFB"/>
             <w:tcMar>
               <w:top w:w="120" w:type="dxa"/>
               <w:bottom w:w="120" w:type="dxa"/>
@@ -17386,7 +17413,7 @@
         <w:tc>
           <w:tcPr>
             <w:tcW w:type="dxa" w:w="2448"/>
-            <w:shd w:fill="FBFBFC"/>
+            <w:shd w:fill="F9FAFB"/>
             <w:tcMar>
               <w:top w:w="120" w:type="dxa"/>
               <w:bottom w:w="120" w:type="dxa"/>
@@ -17412,7 +17439,7 @@
         <w:tc>
           <w:tcPr>
             <w:tcW w:type="dxa" w:w="2160"/>
-            <w:shd w:fill="FBFBFC"/>
+            <w:shd w:fill="F9FAFB"/>
             <w:tcMar>
               <w:top w:w="120" w:type="dxa"/>
               <w:bottom w:w="120" w:type="dxa"/>
@@ -17438,7 +17465,7 @@
         <w:tc>
           <w:tcPr>
             <w:tcW w:type="dxa" w:w="1872"/>
-            <w:shd w:fill="FBFBFC"/>
+            <w:shd w:fill="F9FAFB"/>
             <w:tcMar>
               <w:top w:w="120" w:type="dxa"/>
               <w:bottom w:w="120" w:type="dxa"/>
@@ -17464,7 +17491,7 @@
         <w:tc>
           <w:tcPr>
             <w:tcW w:type="dxa" w:w="1008"/>
-            <w:shd w:fill="FBFBFC"/>
+            <w:shd w:fill="F9FAFB"/>
             <w:tcMar>
               <w:top w:w="120" w:type="dxa"/>
               <w:bottom w:w="120" w:type="dxa"/>
@@ -17650,7 +17677,7 @@
         <w:tc>
           <w:tcPr>
             <w:tcW w:type="dxa" w:w="1152"/>
-            <w:shd w:fill="FBFBFC"/>
+            <w:shd w:fill="F9FAFB"/>
             <w:tcMar>
               <w:top w:w="120" w:type="dxa"/>
               <w:bottom w:w="120" w:type="dxa"/>
@@ -17676,7 +17703,7 @@
         <w:tc>
           <w:tcPr>
             <w:tcW w:type="dxa" w:w="1440"/>
-            <w:shd w:fill="FBFBFC"/>
+            <w:shd w:fill="F9FAFB"/>
             <w:tcMar>
               <w:top w:w="120" w:type="dxa"/>
               <w:bottom w:w="120" w:type="dxa"/>
@@ -17702,7 +17729,7 @@
         <w:tc>
           <w:tcPr>
             <w:tcW w:type="dxa" w:w="2448"/>
-            <w:shd w:fill="FBFBFC"/>
+            <w:shd w:fill="F9FAFB"/>
             <w:tcMar>
               <w:top w:w="120" w:type="dxa"/>
               <w:bottom w:w="120" w:type="dxa"/>
@@ -17728,7 +17755,7 @@
         <w:tc>
           <w:tcPr>
             <w:tcW w:type="dxa" w:w="2160"/>
-            <w:shd w:fill="FBFBFC"/>
+            <w:shd w:fill="F9FAFB"/>
             <w:tcMar>
               <w:top w:w="120" w:type="dxa"/>
               <w:bottom w:w="120" w:type="dxa"/>
@@ -17754,7 +17781,7 @@
         <w:tc>
           <w:tcPr>
             <w:tcW w:type="dxa" w:w="1872"/>
-            <w:shd w:fill="FBFBFC"/>
+            <w:shd w:fill="F9FAFB"/>
             <w:tcMar>
               <w:top w:w="120" w:type="dxa"/>
               <w:bottom w:w="120" w:type="dxa"/>
@@ -17780,7 +17807,7 @@
         <w:tc>
           <w:tcPr>
             <w:tcW w:type="dxa" w:w="1008"/>
-            <w:shd w:fill="FBFBFC"/>
+            <w:shd w:fill="F9FAFB"/>
             <w:tcMar>
               <w:top w:w="120" w:type="dxa"/>
               <w:bottom w:w="120" w:type="dxa"/>
@@ -18022,7 +18049,7 @@
         <w:tc>
           <w:tcPr>
             <w:tcW w:type="dxa" w:w="2592"/>
-            <w:shd w:fill="E8EEF5"/>
+            <w:shd w:fill="E5E7EB"/>
             <w:tcMar>
               <w:top w:w="140" w:type="dxa"/>
               <w:bottom w:w="140" w:type="dxa"/>
@@ -18049,7 +18076,7 @@
         <w:tc>
           <w:tcPr>
             <w:tcW w:type="dxa" w:w="3600"/>
-            <w:shd w:fill="E8EEF5"/>
+            <w:shd w:fill="E5E7EB"/>
             <w:tcMar>
               <w:top w:w="140" w:type="dxa"/>
               <w:bottom w:w="140" w:type="dxa"/>
@@ -18076,7 +18103,7 @@
         <w:tc>
           <w:tcPr>
             <w:tcW w:type="dxa" w:w="3888"/>
-            <w:shd w:fill="E8EEF5"/>
+            <w:shd w:fill="E5E7EB"/>
             <w:tcMar>
               <w:top w:w="140" w:type="dxa"/>
               <w:bottom w:w="140" w:type="dxa"/>
@@ -18185,7 +18212,7 @@
         <w:tc>
           <w:tcPr>
             <w:tcW w:type="dxa" w:w="2592"/>
-            <w:shd w:fill="FBFBFC"/>
+            <w:shd w:fill="F9FAFB"/>
             <w:tcMar>
               <w:top w:w="120" w:type="dxa"/>
               <w:bottom w:w="120" w:type="dxa"/>
@@ -18211,7 +18238,7 @@
         <w:tc>
           <w:tcPr>
             <w:tcW w:type="dxa" w:w="3600"/>
-            <w:shd w:fill="FBFBFC"/>
+            <w:shd w:fill="F9FAFB"/>
             <w:tcMar>
               <w:top w:w="120" w:type="dxa"/>
               <w:bottom w:w="120" w:type="dxa"/>
@@ -18237,7 +18264,7 @@
         <w:tc>
           <w:tcPr>
             <w:tcW w:type="dxa" w:w="3888"/>
-            <w:shd w:fill="FBFBFC"/>
+            <w:shd w:fill="F9FAFB"/>
             <w:tcMar>
               <w:top w:w="120" w:type="dxa"/>
               <w:bottom w:w="120" w:type="dxa"/>
@@ -18345,7 +18372,7 @@
         <w:tc>
           <w:tcPr>
             <w:tcW w:type="dxa" w:w="2592"/>
-            <w:shd w:fill="FBFBFC"/>
+            <w:shd w:fill="F9FAFB"/>
             <w:tcMar>
               <w:top w:w="120" w:type="dxa"/>
               <w:bottom w:w="120" w:type="dxa"/>
@@ -18371,7 +18398,7 @@
         <w:tc>
           <w:tcPr>
             <w:tcW w:type="dxa" w:w="3600"/>
-            <w:shd w:fill="FBFBFC"/>
+            <w:shd w:fill="F9FAFB"/>
             <w:tcMar>
               <w:top w:w="120" w:type="dxa"/>
               <w:bottom w:w="120" w:type="dxa"/>
@@ -18397,7 +18424,7 @@
         <w:tc>
           <w:tcPr>
             <w:tcW w:type="dxa" w:w="3888"/>
-            <w:shd w:fill="FBFBFC"/>
+            <w:shd w:fill="F9FAFB"/>
             <w:tcMar>
               <w:top w:w="120" w:type="dxa"/>
               <w:bottom w:w="120" w:type="dxa"/>
@@ -19068,7 +19095,7 @@
       <w:rPr>
         <w:rFonts w:ascii="Times New Roman" w:hAnsi="Times New Roman"/>
         <w:i/>
-        <w:color w:val="646464"/>
+        <w:color w:val="3C3C3C"/>
         <w:sz w:val="19"/>
       </w:rPr>
       <w:t>TrustGuard: AI-Powered Flipkart Fake Review Detection System</w:t>

</xml_diff>